<commit_message>
docs: nginx zwei-Block-Architektur dokumentiert
</commit_message>
<xml_diff>
--- a/Lizmap_QGIS_Server_Installation_Guide.docx
+++ b/Lizmap_QGIS_Server_Installation_Guide.docx
@@ -2111,7 +2111,7 @@
           <w:sz w:val="20"/>
           <w:szCs w:val="20"/>
         </w:rPr>
-        <w:t xml:space="preserve">HTTPS / TLS konfigurieren: CERTBOT_EMAIL im Skript-Header setzen — Sektion 12 läuft vollautomatisch am Ende der Installation (certbot + IP-Redirect-Fix). Alternativ manuell: certbot --nginx -d karte1.wandelderzeit.ch</w:t>
+        <w:t xml:space="preserve">HTTPS / TLS konfigurieren: CERTBOT_EMAIL im Skript-Header setzen — Sektion 12 läuft vollautomatisch am Ende der Installation. Nginx verwendet zwei Server-Blöcke: Block 1 (default_server) für IP-Zugriff, Block 2 für die Domain — certbot berührt nur Block 2. Alternativ manuell: certbot --nginx -d karte1.wandelderzeit.ch</w:t>
       </w:r>
     </w:p>
     <w:p>
@@ -5168,7 +5168,7 @@
                 <w:sz w:val="18"/>
                 <w:szCs w:val="18"/>
               </w:rPr>
-              <w:t xml:space="preserve">E-Mail für Let’s Encrypt. Gesetzt = Sektion 12 führt certbot automatisch aus (inkl. IP-Redirect-Fix). Leer = Überspringen, später manuell.</w:t>
+              <w:t xml:space="preserve">E-Mail für Let’s Encrypt. Gesetzt = Sektion 12 führt certbot automatisch aus (modifiziert nur den Domain-Block, IP-Zugriff bleibt unberührt). Leer = Überspringen, später manuell.</w:t>
             </w:r>
           </w:p>
         </w:tc>
@@ -7893,7 +7893,7 @@
           <w:sz w:val="20"/>
           <w:szCs w:val="20"/>
         </w:rPr>
-        <w:t xml:space="preserve">Lizmap 3.9+ erfordert py-qgis-server als HTTP-Wrapper — direktes FastCGI wird nicht mehr unterstützt. Nginx ist mit listen 80 default_server konfiguriert. Certbot (HTTPS): Wenn CERTBOT_EMAIL gesetzt ist, fährt Sektion 12 certbot vollautomatisch aus und korrigiert danach sofort den certbot-typischen return 404-Block im HTTP-Vhost durch eine 301-Weiterleitung auf die HTTPS-Domain, damit der Server auch über die IP-Adresse erreichbar bleibt. Nginx proxiert die QGIS-Endpunkte:</w:t>
+        <w:t xml:space="preserve">Lizmap 3.9+ erfordert py-qgis-server als HTTP-Wrapper — direktes FastCGI wird nicht mehr unterstützt. Nginx verwendet zwei Server-Blöcke: Block 1 (listen 80 default_server, server_name _) bedient IP-Zugriffe direkt und wird von certbot nie verändert. Block 2 (server_name karte1.wandelderzeit.ch) ist der Domain-Block, den certbot für HTTPS konfiguriert. Gemeinsame Location-Blöcke (root, PHP, proxy) stehen in /etc/nginx/lizmap-common.conf und werden von beiden Blöcken per include eingebunden. Nginx proxiert die QGIS-Endpunkte:</w:t>
       </w:r>
     </w:p>
     <w:p>
@@ -9509,7 +9509,7 @@
           <w:sz w:val="20"/>
           <w:szCs w:val="20"/>
         </w:rPr>
-        <w:t xml:space="preserve">Geprüft werden: Systemdienste (nginx, php-fpm, xvfb, supervisor, postgresql, xrdp), Ports, py-qgisserver Supervisor-Status, QGIS-Plugins, Nginx server_name (localhost + karte1.wandelderzeit.ch), Nginx-Konfiguration, server.conf (alle Sektionen: [server], [logging], [projects.cache], [monitor:amqp], [api.endpoints], [api.enabled]), PostgreSQL-Verbindung, Lizmap-Konfiguration, Verzeichnisse und Berechtigungen.</w:t>
+        <w:t xml:space="preserve">Geprüft werden: Systemdienste (nginx, php-fpm, xvfb, supervisor, postgresql, xrdp), Ports, py-qgisserver Supervisor-Status, QGIS-Plugins, Nginx lizmap-common.conf, Nginx Block 1 (default_server/_) für IP-Zugriff, Nginx Block 2 (karte1.wandelderzeit.ch), Nginx-Konfiguration, server.conf (alle Sektionen: [server], [logging], [projects.cache], [monitor:amqp], [api.endpoints], [api.enabled]), PostgreSQL-Verbindung, Lizmap-Konfiguration, Verzeichnisse und Berechtigungen.</w:t>
       </w:r>
     </w:p>
     <w:p>
@@ -10793,7 +10793,7 @@
           <w:sz w:val="20"/>
           <w:szCs w:val="20"/>
         </w:rPr>
-        <w:t xml:space="preserve">HTTPS: wird automatisch konfiguriert wenn CERTBOT_EMAIL im Skript gesetzt war (inkl. IP-Redirect-Fix); sonst manuell: certbot --nginx -d karte1.wandelderzeit.ch, danach sed -i 's|return 404;.*Certbot|return 301 https://karte1.wandelderzeit.ch$request_uri;|' /etc/nginx/sites-available/lizmap &amp;&amp; nginx -t &amp;&amp; systemctl reload nginx</w:t>
+        <w:t xml:space="preserve">HTTPS: wird automatisch konfiguriert wenn CERTBOT_EMAIL im Skript gesetzt war. Certbot modifiziert nur Block 2 (Domain) — Block 1 (IP/default_server) bleibt unberührt, kein zusätzlicher Fix nötig. Manuell: certbot --nginx -d karte1.wandelderzeit.ch</w:t>
       </w:r>
     </w:p>
     <w:p>

</xml_diff>

<commit_message>
docs: self-signed cert und HTTPS via IP dokumentiert
</commit_message>
<xml_diff>
--- a/Lizmap_QGIS_Server_Installation_Guide.docx
+++ b/Lizmap_QGIS_Server_Installation_Guide.docx
@@ -2111,7 +2111,7 @@
           <w:sz w:val="20"/>
           <w:szCs w:val="20"/>
         </w:rPr>
-        <w:t xml:space="preserve">HTTPS / TLS konfigurieren: CERTBOT_EMAIL im Skript-Header setzen — Sektion 12 läuft vollautomatisch am Ende der Installation. Nginx verwendet zwei Server-Blöcke: Block 1 (default_server) für IP-Zugriff, Block 2 für die Domain — certbot berührt nur Block 2. Alternativ manuell: certbot --nginx -d karte1.wandelderzeit.ch</w:t>
+        <w:t xml:space="preserve">HTTPS / TLS konfigurieren: Block 1 (IP) erhält automatisch ein selbstsigniertes Zertifikat — https://&lt;IP&gt;/ funktioniert direkt (Browserwarnung einmalig bestätigen). Für die Domain CERTBOT_EMAIL setzen — Sektion 12 konfiguriert Let’s Encrypt vollautomatisch für Block 2. Manuell: certbot --nginx -d karte1.wandelderzeit.ch</w:t>
       </w:r>
     </w:p>
     <w:p>
@@ -7893,7 +7893,7 @@
           <w:sz w:val="20"/>
           <w:szCs w:val="20"/>
         </w:rPr>
-        <w:t xml:space="preserve">Lizmap 3.9+ erfordert py-qgis-server als HTTP-Wrapper — direktes FastCGI wird nicht mehr unterstützt. Nginx verwendet zwei Server-Blöcke: Block 1 (listen 80 default_server, server_name _) bedient IP-Zugriffe direkt und wird von certbot nie verändert. Block 2 (server_name karte1.wandelderzeit.ch) ist der Domain-Block, den certbot für HTTPS konfiguriert. Gemeinsame Location-Blöcke (root, PHP, proxy) stehen in /etc/nginx/lizmap-common.conf und werden von beiden Blöcken per include eingebunden. Nginx proxiert die QGIS-Endpunkte:</w:t>
+        <w:t xml:space="preserve">Lizmap 3.9+ erfordert py-qgis-server als HTTP-Wrapper — direktes FastCGI wird nicht mehr unterstützt. Nginx verwendet zwei Server-Blöcke: Block 1 (listen 80/443 default_server, server_name _) bedient IP-Zugriffe über HTTP und HTTPS (selbstsigniertes Zertifikat unter /etc/nginx/ssl/lizmap-selfsigned.crt, 10 Jahre gültig, SAN enthält die öffentliche IP). Block 2 (server_name karte1.wandelderzeit.ch) ist der Domain-Block, den certbot für HTTPS mit Let’s Encrypt konfiguriert. Gemeinsame Location-Blöcke stehen in /etc/nginx/lizmap-common.conf. Nginx proxiert die QGIS-Endpunkte:</w:t>
       </w:r>
     </w:p>
     <w:p>
@@ -9509,7 +9509,7 @@
           <w:sz w:val="20"/>
           <w:szCs w:val="20"/>
         </w:rPr>
-        <w:t xml:space="preserve">Geprüft werden: Systemdienste (nginx, php-fpm, xvfb, supervisor, postgresql, xrdp), Ports, py-qgisserver Supervisor-Status, QGIS-Plugins, Nginx lizmap-common.conf, Nginx Block 1 (default_server/_) für IP-Zugriff, Nginx Block 2 (karte1.wandelderzeit.ch), Nginx-Konfiguration, server.conf (alle Sektionen: [server], [logging], [projects.cache], [monitor:amqp], [api.endpoints], [api.enabled]), PostgreSQL-Verbindung, Lizmap-Konfiguration, Verzeichnisse und Berechtigungen.</w:t>
+        <w:t xml:space="preserve">Geprüft werden: Systemdienste (nginx, php-fpm, xvfb, supervisor, postgresql, xrdp), Ports, py-qgisserver Supervisor-Status, QGIS-Plugins, qgis-plugin-manager (Binary, sources.list, Plugin-Versionen), Nginx lizmap-common.conf, Nginx Block 1 (default_server/_) für IP-Zugriff, HTTPS/self-signed Zertifikat (Gültigkeit, SAN), Nginx Block 2 (karte1.wandelderzeit.ch), Nginx-Konfiguration, server.conf (alle Sektionen), PostgreSQL-Verbindung, Lizmap-Konfiguration, Verzeichnisse und Berechtigungen.</w:t>
       </w:r>
     </w:p>
     <w:p>
@@ -10793,7 +10793,7 @@
           <w:sz w:val="20"/>
           <w:szCs w:val="20"/>
         </w:rPr>
-        <w:t xml:space="preserve">HTTPS: wird automatisch konfiguriert wenn CERTBOT_EMAIL im Skript gesetzt war. Certbot modifiziert nur Block 2 (Domain) — Block 1 (IP/default_server) bleibt unberührt, kein zusätzlicher Fix nötig. Manuell: certbot --nginx -d karte1.wandelderzeit.ch</w:t>
+        <w:t xml:space="preserve">HTTPS via IP (https://&lt;IP&gt;/): sofort verfügbar — selbstsigniertes Zertifikat wird beim Install generiert, Browserwarnung einmalig bestätigen. HTTPS via Domain: wird automatisch konfiguriert wenn CERTBOT_EMAIL gesetzt war (Let’s Encrypt, kein Browserhinweis). Manuell: certbot --nginx -d karte1.wandelderzeit.ch</w:t>
       </w:r>
     </w:p>
     <w:p>

</xml_diff>

<commit_message>
docs: Word-Dokument auf aktuellen Stand gebracht
- Trailing-Nummern (1.–6.) aus Liste in Kapitel 6.2 entfernt (Formatierungsfehler)
- qgis-plugin-manager Pfad aktualisiert: Symlink /usr/local/bin statt venv-Pfad
- Passwort-Hinweis ergänzt: Re-Run-Stabilität via export PG_LIZMAP_PASS / XRDP_PASS
- Neue Variablen GITHUB_TOKEN und LIZMAP_SERVER_PLUGIN_VERSION in Tabelle Kap. 3 eingefügt

Co-Authored-By: Claude Sonnet 4.6 <noreply@anthropic.com>
</commit_message>
<xml_diff>
--- a/Lizmap_QGIS_Server_Installation_Guide.docx
+++ b/Lizmap_QGIS_Server_Installation_Guide.docx
@@ -5173,6 +5173,220 @@
           </w:p>
         </w:tc>
       </w:tr>
+      <w:tr>
+        <w:trPr>
+          <w:tblHeader w:val="false"/>
+        </w:trPr>
+        <w:tc>
+          <w:tcPr>
+            <w:tcW w:type="dxa" w:w="2800"/>
+            <w:tcBorders>
+              <w:top w:val="single" w:color="CCCCCC" w:sz="4"/>
+              <w:left w:val="single" w:color="CCCCCC" w:sz="4"/>
+              <w:bottom w:val="single" w:color="CCCCCC" w:sz="4"/>
+              <w:right w:val="single" w:color="CCCCCC" w:sz="4"/>
+            </w:tcBorders>
+            <w:shd w:fill="FFFFFF" w:val="clear"/>
+            <w:tcMar>
+              <w:top w:type="dxa" w:w="80"/>
+              <w:left w:type="dxa" w:w="120"/>
+              <w:bottom w:type="dxa" w:w="80"/>
+              <w:right w:type="dxa" w:w="120"/>
+            </w:tcMar>
+          </w:tcPr>
+          <w:p>
+            <w:pPr>
+              <w:spacing w:after="0"/>
+            </w:pPr>
+            <w:r>
+              <w:rPr>
+                <w:rFonts w:ascii="Courier New" w:cs="Courier New" w:eastAsia="Courier New" w:hAnsi="Courier New"/>
+                <w:b w:val="false"/>
+                <w:bCs w:val="false"/>
+                <w:color w:val="404040"/>
+                <w:sz w:val="18"/>
+                <w:szCs w:val="18"/>
+              </w:rPr>
+              <w:t xml:space="preserve">GITHUB_TOKEN</w:t>
+            </w:r>
+          </w:p>
+        </w:tc>
+        <w:tc>
+          <w:tcPr>
+            <w:tcW w:type="dxa" w:w="2000"/>
+            <w:tcBorders>
+              <w:top w:val="single" w:color="CCCCCC" w:sz="4"/>
+              <w:left w:val="single" w:color="CCCCCC" w:sz="4"/>
+              <w:bottom w:val="single" w:color="CCCCCC" w:sz="4"/>
+              <w:right w:val="single" w:color="CCCCCC" w:sz="4"/>
+            </w:tcBorders>
+            <w:shd w:fill="FFFFFF" w:val="clear"/>
+            <w:tcMar>
+              <w:top w:type="dxa" w:w="80"/>
+              <w:left w:type="dxa" w:w="120"/>
+              <w:bottom w:type="dxa" w:w="80"/>
+              <w:right w:type="dxa" w:w="120"/>
+            </w:tcMar>
+          </w:tcPr>
+          <w:p>
+            <w:pPr>
+              <w:spacing w:after="0"/>
+            </w:pPr>
+            <w:r>
+              <w:rPr>
+                <w:rFonts w:ascii="Arial" w:cs="Arial" w:eastAsia="Arial" w:hAnsi="Arial"/>
+                <w:b w:val="false"/>
+                <w:bCs w:val="false"/>
+                <w:color w:val="404040"/>
+                <w:sz w:val="18"/>
+                <w:szCs w:val="18"/>
+              </w:rPr>
+              <w:t xml:space="preserve">(leer)</w:t>
+            </w:r>
+          </w:p>
+        </w:tc>
+        <w:tc>
+          <w:tcPr>
+            <w:tcW w:type="dxa" w:w="4946"/>
+            <w:tcBorders>
+              <w:top w:val="single" w:color="CCCCCC" w:sz="4"/>
+              <w:left w:val="single" w:color="CCCCCC" w:sz="4"/>
+              <w:bottom w:val="single" w:color="CCCCCC" w:sz="4"/>
+              <w:right w:val="single" w:color="CCCCCC" w:sz="4"/>
+            </w:tcBorders>
+            <w:shd w:fill="FFFFFF" w:val="clear"/>
+            <w:tcMar>
+              <w:top w:type="dxa" w:w="80"/>
+              <w:left w:type="dxa" w:w="120"/>
+              <w:bottom w:type="dxa" w:w="80"/>
+              <w:right w:type="dxa" w:w="120"/>
+            </w:tcMar>
+          </w:tcPr>
+          <w:p>
+            <w:pPr>
+              <w:spacing w:after="0"/>
+            </w:pPr>
+            <w:r>
+              <w:rPr>
+                <w:rFonts w:ascii="Arial" w:cs="Arial" w:eastAsia="Arial" w:hAnsi="Arial"/>
+                <w:b w:val="false"/>
+                <w:bCs w:val="false"/>
+                <w:color w:val="404040"/>
+                <w:sz w:val="18"/>
+                <w:szCs w:val="18"/>
+              </w:rPr>
+              <w:t xml:space="preserve">GitHub Personal Access Token. Erhöht API-Limit beim Plugin-Download von 60 auf 5000 req/h. Optional.</w:t>
+            </w:r>
+          </w:p>
+        </w:tc>
+      </w:tr>
+      <w:tr>
+        <w:trPr>
+          <w:tblHeader w:val="false"/>
+        </w:trPr>
+        <w:tc>
+          <w:tcPr>
+            <w:tcW w:type="dxa" w:w="2800"/>
+            <w:tcBorders>
+              <w:top w:val="single" w:color="CCCCCC" w:sz="4"/>
+              <w:left w:val="single" w:color="CCCCCC" w:sz="4"/>
+              <w:bottom w:val="single" w:color="CCCCCC" w:sz="4"/>
+              <w:right w:val="single" w:color="CCCCCC" w:sz="4"/>
+            </w:tcBorders>
+            <w:shd w:fill="FFFFFF" w:val="clear"/>
+            <w:tcMar>
+              <w:top w:type="dxa" w:w="80"/>
+              <w:left w:type="dxa" w:w="120"/>
+              <w:bottom w:type="dxa" w:w="80"/>
+              <w:right w:type="dxa" w:w="120"/>
+            </w:tcMar>
+          </w:tcPr>
+          <w:p>
+            <w:pPr>
+              <w:spacing w:after="0"/>
+            </w:pPr>
+            <w:r>
+              <w:rPr>
+                <w:rFonts w:ascii="Courier New" w:cs="Courier New" w:eastAsia="Courier New" w:hAnsi="Courier New"/>
+                <w:b w:val="false"/>
+                <w:bCs w:val="false"/>
+                <w:color w:val="404040"/>
+                <w:sz w:val="18"/>
+                <w:szCs w:val="18"/>
+              </w:rPr>
+              <w:t xml:space="preserve">LIZMAP_SERVER_PLUGIN_VERSION</w:t>
+            </w:r>
+          </w:p>
+        </w:tc>
+        <w:tc>
+          <w:tcPr>
+            <w:tcW w:type="dxa" w:w="2000"/>
+            <w:tcBorders>
+              <w:top w:val="single" w:color="CCCCCC" w:sz="4"/>
+              <w:left w:val="single" w:color="CCCCCC" w:sz="4"/>
+              <w:bottom w:val="single" w:color="CCCCCC" w:sz="4"/>
+              <w:right w:val="single" w:color="CCCCCC" w:sz="4"/>
+            </w:tcBorders>
+            <w:shd w:fill="FFFFFF" w:val="clear"/>
+            <w:tcMar>
+              <w:top w:type="dxa" w:w="80"/>
+              <w:left w:type="dxa" w:w="120"/>
+              <w:bottom w:type="dxa" w:w="80"/>
+              <w:right w:type="dxa" w:w="120"/>
+            </w:tcMar>
+          </w:tcPr>
+          <w:p>
+            <w:pPr>
+              <w:spacing w:after="0"/>
+            </w:pPr>
+            <w:r>
+              <w:rPr>
+                <w:rFonts w:ascii="Arial" w:cs="Arial" w:eastAsia="Arial" w:hAnsi="Arial"/>
+                <w:b w:val="false"/>
+                <w:bCs w:val="false"/>
+                <w:color w:val="404040"/>
+                <w:sz w:val="18"/>
+                <w:szCs w:val="18"/>
+              </w:rPr>
+              <w:t xml:space="preserve">2.14.1</w:t>
+            </w:r>
+          </w:p>
+        </w:tc>
+        <w:tc>
+          <w:tcPr>
+            <w:tcW w:type="dxa" w:w="4946"/>
+            <w:tcBorders>
+              <w:top w:val="single" w:color="CCCCCC" w:sz="4"/>
+              <w:left w:val="single" w:color="CCCCCC" w:sz="4"/>
+              <w:bottom w:val="single" w:color="CCCCCC" w:sz="4"/>
+              <w:right w:val="single" w:color="CCCCCC" w:sz="4"/>
+            </w:tcBorders>
+            <w:shd w:fill="FFFFFF" w:val="clear"/>
+            <w:tcMar>
+              <w:top w:type="dxa" w:w="80"/>
+              <w:left w:type="dxa" w:w="120"/>
+              <w:bottom w:type="dxa" w:w="80"/>
+              <w:right w:type="dxa" w:w="120"/>
+            </w:tcMar>
+          </w:tcPr>
+          <w:p>
+            <w:pPr>
+              <w:spacing w:after="0"/>
+            </w:pPr>
+            <w:r>
+              <w:rPr>
+                <w:rFonts w:ascii="Arial" w:cs="Arial" w:eastAsia="Arial" w:hAnsi="Arial"/>
+                <w:b w:val="false"/>
+                <w:bCs w:val="false"/>
+                <w:color w:val="404040"/>
+                <w:sz w:val="18"/>
+                <w:szCs w:val="18"/>
+              </w:rPr>
+              <w:t xml:space="preserve">Überschreibt die Fallback-Version für lizmap_server beim ZIP-Download (nur wenn GitHub API fehlschlägt).</w:t>
+            </w:r>
+          </w:p>
+        </w:tc>
+      </w:tr>
     </w:tbl>
     <w:p>
       <w:pPr>
@@ -5210,7 +5424,7 @@
           <w:sz w:val="20"/>
           <w:szCs w:val="20"/>
         </w:rPr>
-        <w:t xml:space="preserve">Die Passwort-Variablen PG_LIZMAP_PASS und XRDP_PASS werden automatisch mit openssl rand -hex generiert und am Ende der Installation einmalig angezeigt. Diese Werte sofort notieren!</w:t>
+        <w:t xml:space="preserve">Die Passwort-Variablen PG_LIZMAP_PASS und XRDP_PASS werden automatisch mit openssl rand -hex generiert und am Ende der Installation einmalig angezeigt. Diese Werte sofort notieren! Bei erneutem Aufruf des Skripts können Passwörter stabil gehalten werden: export PG_LIZMAP_PASS=„mein-pw“ &amp;&amp; export XRDP_PASS=„mein-pw“ &amp;&amp; sudo -E bash install_lizmap_qgisserver.sh</w:t>
       </w:r>
     </w:p>
     <w:p>
@@ -7364,7 +7578,7 @@
           <w:sz w:val="20"/>
           <w:szCs w:val="20"/>
         </w:rPr>
-        <w:t xml:space="preserve">Plugin-Updates ohne Neuinstallation: QGIS_VER=$(dpkg -l qgis-server | awk '/^ii.*qgis-server /{print $3}' | grep -oP '\d+\.\d+' | head -1) &amp;&amp; echo "https://plugins.qgis.org/plugins/plugins.xml?qgis=${QGIS_VER}" &gt; /srv/qgis/plugins/sources.list &amp;&amp; QGIS_PLUGINPATH=/srv/qgis/plugins /opt/local/py-qgis-server/bin/qgis-plugin-manager update &amp;&amp; /opt/local/py-qgis-server/bin/qgis-plugin-manager upgrade &amp;&amp; supervisorctl restart py-qgisserver</w:t>
+        <w:t xml:space="preserve">Plugin-Updates ohne Neuinstallation: QGIS_VER=$(dpkg -l qgis-server | awk '/^ii.*qgis-server /{print $3}' | grep -oP '\d+\.\d+' | head -1) &amp;&amp; echo "https://plugins.qgis.org/plugins/plugins.xml?qgis=${QGIS_VER}" &gt; /srv/qgis/plugins/sources.list &amp;&amp; QGIS_PLUGINPATH=/srv/qgis/plugins qgis-plugin-manager update &amp;&amp; qgis-plugin-manager upgrade &amp;&amp; supervisorctl restart py-qgisserver</w:t>
       </w:r>
     </w:p>
     <w:p>
@@ -8385,15 +8599,6 @@
         </w:rPr>
         <w:t xml:space="preserve">Lizmap Web-Oberfläche aufrufen: http://&lt;SERVER-IP&gt;/ — Admin-Login: admin / admin</w:t>
       </w:r>
-      <w:r>
-        <w:rPr>
-          <w:rFonts w:ascii="Arial" w:cs="Arial" w:eastAsia="Arial" w:hAnsi="Arial"/>
-          <w:color w:val="404040"/>
-          <w:sz w:val="20"/>
-          <w:szCs w:val="20"/>
-        </w:rPr>
-        <w:t xml:space="preserve">1. </w:t>
-      </w:r>
     </w:p>
     <w:p>
       <w:pPr>
@@ -8415,15 +8620,6 @@
         </w:rPr>
         <w:t xml:space="preserve">Lizmap-Admin-Passwort sofort ändern (Administration → Benutzerverwaltung)</w:t>
       </w:r>
-      <w:r>
-        <w:rPr>
-          <w:rFonts w:ascii="Arial" w:cs="Arial" w:eastAsia="Arial" w:hAnsi="Arial"/>
-          <w:color w:val="404040"/>
-          <w:sz w:val="20"/>
-          <w:szCs w:val="20"/>
-        </w:rPr>
-        <w:t xml:space="preserve">2. </w:t>
-      </w:r>
     </w:p>
     <w:p>
       <w:pPr>
@@ -8445,15 +8641,6 @@
         </w:rPr>
         <w:t xml:space="preserve">Via RDP verbinden (mstsc / Remmina): &lt;SERVER-IP&gt;:3389 mit gisadmin / &lt;generiertes PW&gt;</w:t>
       </w:r>
-      <w:r>
-        <w:rPr>
-          <w:rFonts w:ascii="Arial" w:cs="Arial" w:eastAsia="Arial" w:hAnsi="Arial"/>
-          <w:color w:val="404040"/>
-          <w:sz w:val="20"/>
-          <w:szCs w:val="20"/>
-        </w:rPr>
-        <w:t xml:space="preserve">3. </w:t>
-      </w:r>
     </w:p>
     <w:p>
       <w:pPr>
@@ -8475,15 +8662,6 @@
         </w:rPr>
         <w:t xml:space="preserve">QGIS Desktop in der RDP-Session öffnen und Projekte im Verzeichnis /srv/data/ erstellen</w:t>
       </w:r>
-      <w:r>
-        <w:rPr>
-          <w:rFonts w:ascii="Arial" w:cs="Arial" w:eastAsia="Arial" w:hAnsi="Arial"/>
-          <w:color w:val="404040"/>
-          <w:sz w:val="20"/>
-          <w:szCs w:val="20"/>
-        </w:rPr>
-        <w:t xml:space="preserve">4. </w:t>
-      </w:r>
     </w:p>
     <w:p>
       <w:pPr>
@@ -8505,15 +8683,6 @@
         </w:rPr>
         <w:t xml:space="preserve">Lizmap QGIS-Plugin in QGIS Desktop installieren (Einzel-Projekt-Publishing konfigurieren)</w:t>
       </w:r>
-      <w:r>
-        <w:rPr>
-          <w:rFonts w:ascii="Arial" w:cs="Arial" w:eastAsia="Arial" w:hAnsi="Arial"/>
-          <w:color w:val="404040"/>
-          <w:sz w:val="20"/>
-          <w:szCs w:val="20"/>
-        </w:rPr>
-        <w:t xml:space="preserve">5. </w:t>
-      </w:r>
     </w:p>
     <w:p>
       <w:pPr>
@@ -8534,15 +8703,6 @@
           <w:szCs w:val="20"/>
         </w:rPr>
         <w:t xml:space="preserve">HTTPS: wird automatisch konfiguriert wenn CERTBOT_EMAIL im Skript gesetzt war; sonst manuell: certbot --nginx -d karte1.wandelderzeit.ch</w:t>
-      </w:r>
-      <w:r>
-        <w:rPr>
-          <w:rFonts w:ascii="Arial" w:cs="Arial" w:eastAsia="Arial" w:hAnsi="Arial"/>
-          <w:color w:val="404040"/>
-          <w:sz w:val="20"/>
-          <w:szCs w:val="20"/>
-        </w:rPr>
-        <w:t xml:space="preserve">6. </w:t>
       </w:r>
     </w:p>
     <w:p>

</xml_diff>

<commit_message>
Varianten-Skripte, Worker-Dokumentation und konsolidiertes Basis-Skript
- install_lizmap_qgisserver.sh: v2 konsolidiert, kein -w Flag im Supervisor
- install_lizmap_qgisserver_8cpu.sh: neu, 8 CPU / 4 Worker
- install_lizmap_qgisserver_16cpu.sh: neu, 16 CPU / 8 Worker
- worker_rechner.html: interaktiver Worker-Rechner (CPU/RAM/Nutzer)
- anleitung_worker.md: Dokumentation Worker-Konfiguration
- README.md, CLAUDE.md: aktualisiert (alle drei Skripte, Worker-Konfiguration)
- Lizmap_QGIS_Server_Installation_Guide.docx: aktualisiert

Co-Authored-By: Claude Sonnet 4.6 <noreply@anthropic.com>
</commit_message>
<xml_diff>
--- a/Lizmap_QGIS_Server_Installation_Guide.docx
+++ b/Lizmap_QGIS_Server_Installation_Guide.docx
@@ -99,7 +99,7 @@
           <w:sz w:val="20"/>
           <w:szCs w:val="20"/>
         </w:rPr>
-        <w:t xml:space="preserve">Basierend auf install_lizmap_qgisserver.sh (aktueller Stand)</w:t>
+        <w:t xml:space="preserve">Basierend auf install_lizmap_qgisserver.sh / _8cpu.sh / _16cpu.sh (aktueller Stand)</w:t>
       </w:r>
     </w:p>
     <w:p>
@@ -138,7 +138,7 @@
           <w:sz w:val="20"/>
           <w:szCs w:val="20"/>
         </w:rPr>
-        <w:t xml:space="preserve">Dieses Dokument beschreibt die automatisierte Installation eines vollständigen Open-Source-GIS-Server-Stacks auf Ubuntu 24.04 LTS mittels des Skripts install_lizmap_qgisserver.sh. Das Skript ist idempotent und kann auf einem bestehenden System sicher erneut ausgeführt werden.</w:t>
+        <w:t xml:space="preserve">Dieses Dokument beschreibt die automatisierte Installation eines vollständigen Open-Source-GIS-Server-Stacks auf Ubuntu 24.04 LTS. Zur Verfügung stehen drei Installationsskripte: install_lizmap_qgisserver.sh (Basis, QGIS_WORKER_COUNT manuell anpassen), install_lizmap_qgisserver_8cpu.sh (voreingestellt für 8 CPU-Kerne, 4 Worker) und install_lizmap_qgisserver_16cpu.sh (voreingestellt für 16 CPU-Kerne, 8 Worker). Alle Skripte sind idempotent und können auf einem bestehenden System sicher erneut ausgeführt werden.</w:t>
       </w:r>
     </w:p>
     <w:p>
@@ -3433,7 +3433,7 @@
           <w:sz w:val="20"/>
           <w:szCs w:val="20"/>
         </w:rPr>
-        <w:t xml:space="preserve">Alle anpassbaren Parameter befinden sich am Anfang des Skripts install_lizmap_qgisserver.sh. Die Datei vor der Ausführung bearbeiten:</w:t>
+        <w:t xml:space="preserve">Alle anpassbaren Parameter befinden sich im Skript-Header. Je nach vorhandener Hardware das passende Skript wählen und vor der Ausführung bearbeiten:</w:t>
       </w:r>
     </w:p>
     <w:p>
@@ -3991,7 +3991,7 @@
                 <w:sz w:val="18"/>
                 <w:szCs w:val="18"/>
               </w:rPr>
-              <w:t xml:space="preserve">Anzahl QGIS Server Worker-Instanzen</w:t>
+              <w:t xml:space="preserve">Anzahl QGIS Server Worker-Instanzen — wird in /srv/qgis/server.conf [server] workers=N geschrieben. Einzige massgebliche Konfigurationsstelle (kein -w Flag im Supervisor). Empfehlung: CPU-Kerne ÷ 2. Varianten-Skripte: _8cpu.sh (4 Worker), _16cpu.sh (8 Worker).</w:t>
             </w:r>
           </w:p>
         </w:tc>
@@ -5424,7 +5424,7 @@
           <w:sz w:val="20"/>
           <w:szCs w:val="20"/>
         </w:rPr>
-        <w:t xml:space="preserve">Die Passwort-Variablen PG_LIZMAP_PASS und XRDP_PASS werden automatisch mit openssl rand -hex generiert und am Ende der Installation einmalig angezeigt. Diese Werte sofort notieren! Bei erneutem Aufruf des Skripts können Passwörter stabil gehalten werden: export PG_LIZMAP_PASS=„mein-pw“ &amp;&amp; export XRDP_PASS=„mein-pw“ &amp;&amp; sudo -E bash install_lizmap_qgisserver.sh</w:t>
+        <w:t xml:space="preserve">Die Passwort-Variablen PG_LIZMAP_PASS und XRDP_PASS werden automatisch mit openssl rand -hex generiert und am Ende der Installation einmalig angezeigt. Diese Werte sofort notieren! Bei erneutem Aufruf des Skripts können Passwörter stabil gehalten werden: export PG_LIZMAP_PASS=„mein-pw“ &amp;&amp; export XRDP_PASS=„mein-pw“ &amp;&amp; sudo -E bash install_lizmap_qgisserver_8cpu.sh (bzw. das verwendete Skript)</w:t>
       </w:r>
     </w:p>
     <w:p>
@@ -5488,23 +5488,23 @@
           <w:sz w:val="20"/>
           <w:szCs w:val="20"/>
         </w:rPr>
-        <w:t xml:space="preserve">Das Skript auf den Server übertragen (per SCP, SFTP oder direkt mit wget/curl):</w:t>
-      </w:r>
-    </w:p>
-    <w:p>
-      <w:pPr>
-        <w:shd w:fill="F0F0F0" w:val="clear"/>
-        <w:spacing w:after="20"/>
-        <w:ind w:left="360"/>
-      </w:pPr>
-      <w:r>
-        <w:rPr>
-          <w:rFonts w:ascii="Courier New" w:cs="Courier New" w:eastAsia="Courier New" w:hAnsi="Courier New"/>
-          <w:color w:val="1A1A1A"/>
-          <w:sz w:val="18"/>
-          <w:szCs w:val="18"/>
-        </w:rPr>
-        <w:t xml:space="preserve">scp install_lizmap_qgisserver.sh user@server:/tmp/</w:t>
+        <w:t xml:space="preserve">Die Skripte auf den Server übertragen (per SCP, SFTP oder direkt mit wget/curl). Beispiel mit dem 8-CPU-Varianten-Skript:</w:t>
+      </w:r>
+    </w:p>
+    <w:p>
+      <w:pPr>
+        <w:shd w:fill="F0F0F0" w:val="clear"/>
+        <w:spacing w:after="20"/>
+        <w:ind w:left="360"/>
+      </w:pPr>
+      <w:r>
+        <w:rPr>
+          <w:rFonts w:ascii="Courier New" w:cs="Courier New" w:eastAsia="Courier New" w:hAnsi="Courier New"/>
+          <w:color w:val="1A1A1A"/>
+          <w:sz w:val="18"/>
+          <w:szCs w:val="18"/>
+        </w:rPr>
+        <w:t xml:space="preserve">scp install_lizmap_qgisserver_8cpu.sh user@server:/tmp/</w:t>
       </w:r>
     </w:p>
     <w:p>
@@ -5536,7 +5536,7 @@
           <w:sz w:val="18"/>
           <w:szCs w:val="18"/>
         </w:rPr>
-        <w:t xml:space="preserve">wget -O /tmp/install_lizmap_qgisserver.sh &lt;URL&gt;</w:t>
+        <w:t xml:space="preserve">wget -O /tmp/install_lizmap_qgisserver_8cpu.sh &lt;URL&gt;</w:t>
       </w:r>
     </w:p>
     <w:p>
@@ -5577,7 +5577,7 @@
           <w:sz w:val="18"/>
           <w:szCs w:val="18"/>
         </w:rPr>
-        <w:t xml:space="preserve">nano /tmp/install_lizmap_qgisserver.sh</w:t>
+        <w:t xml:space="preserve">nano /tmp/install_lizmap_qgisserver_8cpu.sh   # für 8 CPU-Kerne (4 Worker)</w:t>
       </w:r>
     </w:p>
     <w:p>
@@ -5591,7 +5591,7 @@
           <w:sz w:val="20"/>
           <w:szCs w:val="20"/>
         </w:rPr>
-        <w:t xml:space="preserve">Mindestens SERVER_NAME auf die öffentliche IP-Adresse oder Domain anpassen. Optional INSTALL_POSTGRESQL und INSTALL_XRDP auf false setzen, falls nicht benötigt.</w:t>
+        <w:t xml:space="preserve">Mindestens SERVER_NAME auf die öffentliche IP-Adresse oder Domain anpassen. QGIS_WORKER_COUNT ist im gewählten Varianten-Skript bereits voreingestellt (4 bzw. 8 Worker) — bei abweichender Hardware im Skript-Header anpassen. Optional INSTALL_POSTGRESQL und INSTALL_XRDP auf false setzen, falls nicht benötigt.</w:t>
       </w:r>
     </w:p>
     <w:p>
@@ -5632,23 +5632,23 @@
           <w:sz w:val="18"/>
           <w:szCs w:val="18"/>
         </w:rPr>
-        <w:t xml:space="preserve">chmod +x /tmp/install_lizmap_qgisserver.sh</w:t>
-      </w:r>
-    </w:p>
-    <w:p>
-      <w:pPr>
-        <w:shd w:fill="F0F0F0" w:val="clear"/>
-        <w:spacing w:after="20"/>
-        <w:ind w:left="360"/>
-      </w:pPr>
-      <w:r>
-        <w:rPr>
-          <w:rFonts w:ascii="Courier New" w:cs="Courier New" w:eastAsia="Courier New" w:hAnsi="Courier New"/>
-          <w:color w:val="1A1A1A"/>
-          <w:sz w:val="18"/>
-          <w:szCs w:val="18"/>
-        </w:rPr>
-        <w:t xml:space="preserve">sudo bash /tmp/install_lizmap_qgisserver.sh</w:t>
+        <w:t xml:space="preserve">chmod +x /tmp/install_lizmap_qgisserver_8cpu.sh</w:t>
+      </w:r>
+    </w:p>
+    <w:p>
+      <w:pPr>
+        <w:shd w:fill="F0F0F0" w:val="clear"/>
+        <w:spacing w:after="20"/>
+        <w:ind w:left="360"/>
+      </w:pPr>
+      <w:r>
+        <w:rPr>
+          <w:rFonts w:ascii="Courier New" w:cs="Courier New" w:eastAsia="Courier New" w:hAnsi="Courier New"/>
+          <w:color w:val="1A1A1A"/>
+          <w:sz w:val="18"/>
+          <w:szCs w:val="18"/>
+        </w:rPr>
+        <w:t xml:space="preserve">sudo bash /tmp/install_lizmap_qgisserver_8cpu.sh</w:t>
       </w:r>
     </w:p>
     <w:p>
@@ -5942,7 +5942,7 @@
           <w:sz w:val="20"/>
           <w:szCs w:val="20"/>
         </w:rPr>
-        <w:t xml:space="preserve">qgis-server — QGIS Server (FastCGI-Modus)</w:t>
+        <w:t xml:space="preserve">qgis-server — QGIS Server (wird von py-qgis-server als HTTP-Wrapper genutzt)</w:t>
       </w:r>
     </w:p>
     <w:p>
@@ -7603,7 +7603,7 @@
           <w:sz w:val="22"/>
           <w:szCs w:val="22"/>
         </w:rPr>
-        <w:t xml:space="preserve">Schritt 6 — Systemd Units für QGIS Server Worker</w:t>
+        <w:t xml:space="preserve">Schritt 6 — Supervisor-Konfiguration für py-qgis-server Worker</w:t>
       </w:r>
     </w:p>
     <w:p>
@@ -7617,7 +7617,7 @@
           <w:sz w:val="20"/>
           <w:szCs w:val="20"/>
         </w:rPr>
-        <w:t xml:space="preserve">Für jeden Worker (1 bis QGIS_WORKER_COUNT) wird ein Systemd-Socket-Unit erstellt:</w:t>
+        <w:t xml:space="preserve">Die Worker-Anzahl wird ausschliesslich über QGIS_WORKER_COUNT im Skript-Header konfiguriert. Das Skript schreibt diesen Wert in /srv/qgis/server.conf unter [server] workers=N. FastCGI-Socket-Units (qgis-server@*.socket) werden nicht mehr verwendet. Die Supervisor-Konfiguration enthält kein -w Flag:</w:t>
       </w:r>
     </w:p>
     <w:p>
@@ -7636,7 +7636,7 @@
           <w:sz w:val="20"/>
           <w:szCs w:val="20"/>
         </w:rPr>
-        <w:t xml:space="preserve">qgis-server@N.socket — Unix-Socket /run/qgis-server-N.sock (SocketUser=www-data)</w:t>
+        <w:t xml:space="preserve">command=/opt/local/py-qgis-server/bin/qgisserver -c /srv/qgis/server.conf (kein -w Flag)</w:t>
       </w:r>
     </w:p>
     <w:p>
@@ -7655,7 +7655,7 @@
           <w:sz w:val="20"/>
           <w:szCs w:val="20"/>
         </w:rPr>
-        <w:t xml:space="preserve">qgis-server@N.service — startet qgis_mapserv.fcgi via Socket-Aktivierung</w:t>
+        <w:t xml:space="preserve">workers=N in server.conf ist die einzige Stelle, an der die Worker-Anzahl festgelegt wird</w:t>
       </w:r>
     </w:p>
     <w:p>
@@ -7677,7 +7677,7 @@
           <w:sz w:val="20"/>
           <w:szCs w:val="20"/>
         </w:rPr>
-        <w:t xml:space="preserve">Jeder Service-Unit benötigt xvfb.service (Requires=), lädt das EnvironmentFile /srv/qgis/config/qgis-service.env und startet bei Absturz automatisch neu (Restart=on-failure, RestartSec=5s).</w:t>
+        <w:t xml:space="preserve">py-qgis-server liest workers=N direkt aus server.conf. Supervisor startet den Prozess ohne -w Flag. Neue Dateien: worker_rechner.html (interaktiver Worker-Rechner im Browser) und anleitung_worker.md (vollständige Worker-Dokumentation mit Faustregel-Tabelle und Diagnose-Befehlen).</w:t>
       </w:r>
     </w:p>
     <w:p>
@@ -7842,7 +7842,7 @@
           <w:sz w:val="18"/>
           <w:szCs w:val="18"/>
         </w:rPr>
-        <w:t xml:space="preserve">service qgis start    # startet Xvfb + Worker-Sockets + py-qgisserver</w:t>
+        <w:t xml:space="preserve">service qgis start    # startet Xvfb + py-qgisserver (via Supervisor)</w:t>
       </w:r>
     </w:p>
     <w:p>
@@ -7912,7 +7912,7 @@
           <w:sz w:val="20"/>
           <w:szCs w:val="20"/>
         </w:rPr>
-        <w:t xml:space="preserve">Die Unit orchestriert: Xvfb → QGIS Worker Sockets → py-qgis-server (via supervisorctl).</w:t>
+        <w:t xml:space="preserve">Die Unit orchestriert: Xvfb → py-qgis-server (via supervisorctl). FastCGI-Socket-Units werden nicht referenziert — Nginx leitet alle Anfragen direkt an py-qgis-server (HTTP auf Port 7200) weiter.</w:t>
       </w:r>
     </w:p>
     <w:p>

</xml_diff>

<commit_message>
Dokumentation aktualisiert: Backup-Kapitel + xRDP-Timing
README.md:
- Neuer Abschnitt "Backup" mit vollständiger Tabelle der gesicherten Inhalte
  (QGIS-Config, Projekte, Lizmap-Config, Nginx incl. lizmap-common.conf + SSL,
   Supervisor, PHP, PostgreSQL-Dump, Systemd Units, xRDP-Config)
- Hinweis: Sektion 10 (xRDP/XFCE4) dauert 5-15 Minuten, Fortschritt sichtbar
- Backup-Tabelleneintrag präzisiert (.tar.gz nach /root/)

Lizmap_QGIS_Server_Installation_Guide.docx:
- Schritt 10 (xRDP): Timing-Hinweis "5-15 Minuten" eingefügt
- Neues Kapitel 8 "Backup" mit backup_lizmap_system.sh, Befehl und
  vollständiger Auflistung aller gesicherten Pfade/Inhalte
- Bestehende Kapitel 8-10 auf 9-11 umbenannt

Co-Authored-By: Claude Sonnet 4.6 <noreply@anthropic.com>
</commit_message>
<xml_diff>
--- a/Lizmap_QGIS_Server_Installation_Guide.docx
+++ b/Lizmap_QGIS_Server_Installation_Guide.docx
@@ -8252,7 +8252,7 @@
           <w:sz w:val="20"/>
           <w:szCs w:val="20"/>
         </w:rPr>
-        <w:t xml:space="preserve">Installiert wird ein vollständiger XFCE4-Desktop mit xRDP für Remote-Desktop-Zugang. Besondere Massnahmen:</w:t>
+        <w:t xml:space="preserve">Installiert wird ein vollständiger XFCE4-Desktop mit xRDP für Remote-Desktop-Zugang. Dieser Schritt lädt viele Pakete — je nach Internetverbindung dauert er 5–15 Minuten. Der Fortschritt ist sichtbar. Besondere Massnahmen:</w:t>
       </w:r>
     </w:p>
     <w:p>
@@ -10218,6 +10218,218 @@
     <w:p>
       <w:pPr>
         <w:pStyle w:val="Heading1"/>
+        <w:spacing w:before="320" w:after="160"/>
+      </w:pPr>
+      <w:r>
+        <w:rPr>
+          <w:rFonts w:ascii="Arial" w:cs="Arial" w:hAnsi="Arial"/>
+        </w:rPr>
+        <w:t xml:space="preserve">8. Backup</w:t>
+      </w:r>
+    </w:p>
+    <w:p>
+      <w:pPr>
+        <w:pStyle w:val="Heading2"/>
+      </w:pPr>
+      <w:r>
+        <w:rPr>
+          <w:rFonts w:ascii="Arial" w:cs="Arial" w:hAnsi="Arial"/>
+        </w:rPr>
+        <w:t xml:space="preserve">8.1 backup_lizmap_system.sh</w:t>
+      </w:r>
+    </w:p>
+    <w:p>
+      <w:pPr>
+        <w:spacing w:after="80"/>
+      </w:pPr>
+      <w:r>
+        <w:rPr>
+          <w:rFonts w:ascii="Arial" w:cs="Arial" w:hAnsi="Arial"/>
+          <w:color w:val="404040"/>
+          <w:sz w:val="20"/>
+          <w:szCs w:val="20"/>
+        </w:rPr>
+        <w:t xml:space="preserve">Erstellt /root/lizmap_backup_DATUM.tar.gz. Aufruf:</w:t>
+      </w:r>
+    </w:p>
+    <w:p>
+      <w:pPr>
+        <w:spacing w:after="80"/>
+      </w:pPr>
+      <w:r>
+        <w:rPr>
+          <w:rFonts w:ascii="Courier New" w:cs="Courier New" w:hAnsi="Courier New"/>
+          <w:color w:val="1F5C99"/>
+          <w:sz w:val="18"/>
+          <w:szCs w:val="18"/>
+        </w:rPr>
+        <w:t xml:space="preserve">sudo bash backup_lizmap_system.sh</w:t>
+      </w:r>
+    </w:p>
+    <w:p>
+      <w:pPr>
+        <w:spacing w:after="40"/>
+      </w:pPr>
+      <w:r>
+        <w:rPr>
+          <w:rFonts w:ascii="Arial" w:cs="Arial" w:hAnsi="Arial"/>
+          <w:color w:val="404040"/>
+          <w:sz w:val="20"/>
+          <w:szCs w:val="20"/>
+        </w:rPr>
+        <w:t xml:space="preserve">Gesichert werden:</w:t>
+      </w:r>
+    </w:p>
+    <w:p>
+      <w:pPr>
+        <w:pStyle w:val="ListParagraph"/>
+        <w:numPr>
+          <w:ilvl w:val="0"/>
+          <w:numId w:val="1"/>
+        </w:numPr>
+        <w:spacing w:after="40"/>
+      </w:pPr>
+      <w:r>
+        <w:rPr>
+          <w:rFonts w:ascii="Arial" w:cs="Arial" w:hAnsi="Arial"/>
+          <w:color w:val="404040"/>
+          <w:sz w:val="20"/>
+          <w:szCs w:val="20"/>
+        </w:rPr>
+        <w:t>/srv/qgis/ — QGIS Server Konfiguration, Plugins, SQLite-DBs (ohne Cache)</w:t>
+      </w:r>
+    </w:p>
+    <w:p>
+      <w:pPr>
+        <w:pStyle w:val="ListParagraph"/>
+        <w:numPr>
+          <w:ilvl w:val="0"/>
+          <w:numId w:val="1"/>
+        </w:numPr>
+        <w:spacing w:after="40"/>
+      </w:pPr>
+      <w:r>
+        <w:rPr>
+          <w:rFonts w:ascii="Arial" w:cs="Arial" w:hAnsi="Arial"/>
+          <w:color w:val="404040"/>
+          <w:sz w:val="20"/>
+          <w:szCs w:val="20"/>
+        </w:rPr>
+        <w:t>/srv/data/ — QGIS Projektdateien (.qgs / .qgz)</w:t>
+      </w:r>
+    </w:p>
+    <w:p>
+      <w:pPr>
+        <w:pStyle w:val="ListParagraph"/>
+        <w:numPr>
+          <w:ilvl w:val="0"/>
+          <w:numId w:val="1"/>
+        </w:numPr>
+        <w:spacing w:after="40"/>
+      </w:pPr>
+      <w:r>
+        <w:rPr>
+          <w:rFonts w:ascii="Arial" w:cs="Arial" w:hAnsi="Arial"/>
+          <w:color w:val="404040"/>
+          <w:sz w:val="20"/>
+          <w:szCs w:val="20"/>
+        </w:rPr>
+        <w:t>/var/www/lizmap/lizmap/var/config/ — Lizmap Konfiguration</w:t>
+      </w:r>
+    </w:p>
+    <w:p>
+      <w:pPr>
+        <w:pStyle w:val="ListParagraph"/>
+        <w:numPr>
+          <w:ilvl w:val="0"/>
+          <w:numId w:val="1"/>
+        </w:numPr>
+        <w:spacing w:after="40"/>
+      </w:pPr>
+      <w:r>
+        <w:rPr>
+          <w:rFonts w:ascii="Arial" w:cs="Arial" w:hAnsi="Arial"/>
+          <w:color w:val="404040"/>
+          <w:sz w:val="20"/>
+          <w:szCs w:val="20"/>
+        </w:rPr>
+        <w:t>/etc/nginx/ — sites-*, nginx.conf, lizmap-common.conf, ssl/ (Zertifikate)</w:t>
+      </w:r>
+    </w:p>
+    <w:p>
+      <w:pPr>
+        <w:pStyle w:val="ListParagraph"/>
+        <w:numPr>
+          <w:ilvl w:val="0"/>
+          <w:numId w:val="1"/>
+        </w:numPr>
+        <w:spacing w:after="40"/>
+      </w:pPr>
+      <w:r>
+        <w:rPr>
+          <w:rFonts w:ascii="Arial" w:cs="Arial" w:hAnsi="Arial"/>
+          <w:color w:val="404040"/>
+          <w:sz w:val="20"/>
+          <w:szCs w:val="20"/>
+        </w:rPr>
+        <w:t>/etc/supervisor/conf.d/ und /etc/php/8.3/fpm/ — Dienst-Konfigurationen</w:t>
+      </w:r>
+    </w:p>
+    <w:p>
+      <w:pPr>
+        <w:pStyle w:val="ListParagraph"/>
+        <w:numPr>
+          <w:ilvl w:val="0"/>
+          <w:numId w:val="1"/>
+        </w:numPr>
+        <w:spacing w:after="40"/>
+      </w:pPr>
+      <w:r>
+        <w:rPr>
+          <w:rFonts w:ascii="Arial" w:cs="Arial" w:hAnsi="Arial"/>
+          <w:color w:val="404040"/>
+          <w:sz w:val="20"/>
+          <w:szCs w:val="20"/>
+        </w:rPr>
+        <w:t>PostgreSQL — pg_dump lizmap + pg_dumpall globals</w:t>
+      </w:r>
+    </w:p>
+    <w:p>
+      <w:pPr>
+        <w:pStyle w:val="ListParagraph"/>
+        <w:numPr>
+          <w:ilvl w:val="0"/>
+          <w:numId w:val="1"/>
+        </w:numPr>
+        <w:spacing w:after="40"/>
+      </w:pPr>
+      <w:r>
+        <w:rPr>
+          <w:rFonts w:ascii="Arial" w:cs="Arial" w:hAnsi="Arial"/>
+          <w:color w:val="404040"/>
+          <w:sz w:val="20"/>
+          <w:szCs w:val="20"/>
+        </w:rPr>
+        <w:t>Systemd Units (xvfb, qgis, qgis-server@*) und xRDP-Konfiguration</w:t>
+      </w:r>
+    </w:p>
+    <w:p>
+      <w:pPr>
+        <w:spacing w:after="80"/>
+      </w:pPr>
+      <w:r>
+        <w:rPr>
+          <w:rFonts w:ascii="Arial" w:cs="Arial" w:hAnsi="Arial"/>
+          <w:color w:val="404040"/>
+          <w:sz w:val="20"/>
+          <w:szCs w:val="20"/>
+        </w:rPr>
+        <w:t xml:space="preserve">Am Ende zeigt das Skript den scp-Befehl mit der aktuellen Server-IP zum Herunterladen auf den lokalen PC.</w:t>
+      </w:r>
+    </w:p>
+    <w:p>
+      <w:pPr>
+        <w:pStyle w:val="Heading1"/>
         <w:pBdr>
           <w:bottom w:val="single" w:color="1F5C99" w:sz="6" w:space="4"/>
         </w:pBdr>
@@ -10232,7 +10444,7 @@
           <w:sz w:val="28"/>
           <w:szCs w:val="28"/>
         </w:rPr>
-        <w:t xml:space="preserve">8. Verzeichnisstruktur</w:t>
+        <w:t xml:space="preserve">9. Verzeichnisstruktur</w:t>
       </w:r>
     </w:p>
     <w:p>
@@ -10249,7 +10461,7 @@
           <w:sz w:val="22"/>
           <w:szCs w:val="22"/>
         </w:rPr>
-        <w:t xml:space="preserve">8.1 QGIS Server (/srv/qgis/)</w:t>
+        <w:t xml:space="preserve">9.1 QGIS Server (/srv/qgis/)</w:t>
       </w:r>
     </w:p>
     <w:p>
@@ -10578,7 +10790,7 @@
           <w:sz w:val="22"/>
           <w:szCs w:val="22"/>
         </w:rPr>
-        <w:t xml:space="preserve">8.2 Lizmap (/var/www/lizmap/)</w:t>
+        <w:t xml:space="preserve">9.2 Lizmap (/var/www/lizmap/)</w:t>
       </w:r>
     </w:p>
     <w:p>
@@ -10779,7 +10991,7 @@
           <w:sz w:val="22"/>
           <w:szCs w:val="22"/>
         </w:rPr>
-        <w:t xml:space="preserve">8.3 QGIS Projekte (/srv/data/)</w:t>
+        <w:t xml:space="preserve">9.3 QGIS Projekte (/srv/data/)</w:t>
       </w:r>
     </w:p>
     <w:p>
@@ -10915,7 +11127,7 @@
           <w:sz w:val="28"/>
           <w:szCs w:val="28"/>
         </w:rPr>
-        <w:t xml:space="preserve">9. Sicherheitshinweise</w:t>
+        <w:t xml:space="preserve">10. Sicherheitshinweise</w:t>
       </w:r>
     </w:p>
     <w:p>
@@ -11076,7 +11288,7 @@
           <w:sz w:val="28"/>
           <w:szCs w:val="28"/>
         </w:rPr>
-        <w:t xml:space="preserve">10. Referenz-Links</w:t>
+        <w:t xml:space="preserve">11. Referenz-Links</w:t>
       </w:r>
     </w:p>
     <w:p>

</xml_diff>

<commit_message>
Troubleshooting-Doku: bourbon.3liz.com Fix, Preload & Hardware
- Alle Installationsskripte: bourbon.3liz.com automatisch via /etc/hosts
  blockieren (Telemetrie-Timeout-Fix, verhindert 6-16s Verzögerungen)
- README.md: neuer Abschnitt "Bekannte Probleme" mit bourbon-Fix,
  Preload-Strategie und Hardware-Empfehlungstabelle
- Word-Dokument: neues Kapitel 10 mit denselben Inhalten (Kap. 10/11
  wurden zu 11/12 umnummeriert)

Co-Authored-By: Claude Sonnet 4.6 <noreply@anthropic.com>
</commit_message>
<xml_diff>
--- a/Lizmap_QGIS_Server_Installation_Guide.docx
+++ b/Lizmap_QGIS_Server_Installation_Guide.docx
@@ -11127,7 +11127,600 @@
           <w:sz w:val="28"/>
           <w:szCs w:val="28"/>
         </w:rPr>
-        <w:t xml:space="preserve">10. Sicherheitshinweise</w:t>
+        <w:t xml:space="preserve">10. Bekannte Probleme und Lösungen</w:t>
+      </w:r>
+    </w:p>
+    <w:p>
+      <w:pPr>
+        <w:pStyle w:val="Heading2"/>
+        <w:spacing w:after="80" w:before="240"/>
+      </w:pPr>
+      <w:r>
+        <w:rPr>
+          <w:rFonts w:ascii="Arial" w:cs="Arial" w:eastAsia="Arial" w:hAnsi="Arial"/>
+          <w:b/>
+          <w:bCs/>
+          <w:color w:val="1F5C99"/>
+          <w:sz w:val="22"/>
+          <w:szCs w:val="22"/>
+        </w:rPr>
+        <w:t xml:space="preserve">10.1 Langsame Anfragen / Timeouts (bourbon.3liz.com)</w:t>
+      </w:r>
+    </w:p>
+    <w:p>
+      <w:pPr>
+        <w:spacing w:after="80"/>
+      </w:pPr>
+      <w:r>
+        <w:rPr>
+          <w:rFonts w:ascii="Arial" w:cs="Arial" w:eastAsia="Arial" w:hAnsi="Arial"/>
+          <w:color w:val="404040"/>
+          <w:sz w:val="20"/>
+          <w:szCs w:val="20"/>
+        </w:rPr>
+        <w:t xml:space="preserve">py-qgis-server sendet bei jeder Karten-Anfrage Telemetrie-Daten an bourbon.3liz.com. Wenn der Server keinen stabilen Internetzugang hat, führt dies zu Timeouts von 6–16 Sekunden pro Anfrage (3× Retry). Karten laden sehr langsam, Nginx-Logs zeigen Zeitlücken zwischen Anfragen.</w:t>
+      </w:r>
+    </w:p>
+    <w:p>
+      <w:pPr>
+        <w:spacing w:after="40"/>
+      </w:pPr>
+      <w:r>
+        <w:rPr>
+          <w:rFonts w:ascii="Arial" w:cs="Arial" w:eastAsia="Arial" w:hAnsi="Arial"/>
+          <w:b/>
+          <w:color w:val="404040"/>
+          <w:sz w:val="20"/>
+          <w:szCs w:val="20"/>
+        </w:rPr>
+        <w:t xml:space="preserve">Fix (automatisch im Installationsskript enthalten):</w:t>
+      </w:r>
+    </w:p>
+    <w:p>
+      <w:pPr>
+        <w:shd w:fill="F0F0F0" w:val="clear"/>
+        <w:spacing w:after="20"/>
+        <w:ind w:left="360"/>
+      </w:pPr>
+      <w:r>
+        <w:rPr>
+          <w:rFonts w:ascii="Courier New" w:cs="Courier New" w:eastAsia="Courier New" w:hAnsi="Courier New"/>
+          <w:color w:val="1A1A1A"/>
+          <w:sz w:val="18"/>
+          <w:szCs w:val="18"/>
+        </w:rPr>
+        <w:t xml:space="preserve">echo "0.0.0.0 bourbon.3liz.com" &gt;&gt; /etc/hosts</w:t>
+      </w:r>
+    </w:p>
+    <w:p>
+      <w:pPr>
+        <w:shd w:fill="F0F0F0" w:val="clear"/>
+        <w:spacing w:after="80"/>
+        <w:ind w:left="360"/>
+      </w:pPr>
+      <w:r>
+        <w:rPr>
+          <w:rFonts w:ascii="Courier New" w:cs="Courier New" w:eastAsia="Courier New" w:hAnsi="Courier New"/>
+          <w:color w:val="1A1A1A"/>
+          <w:sz w:val="18"/>
+          <w:szCs w:val="18"/>
+        </w:rPr>
+        <w:t xml:space="preserve">supervisorctl restart py-qgisserver</w:t>
+      </w:r>
+    </w:p>
+    <w:p>
+      <w:pPr>
+        <w:pStyle w:val="Heading2"/>
+        <w:spacing w:after="80" w:before="240"/>
+      </w:pPr>
+      <w:r>
+        <w:rPr>
+          <w:rFonts w:ascii="Arial" w:cs="Arial" w:eastAsia="Arial" w:hAnsi="Arial"/>
+          <w:b/>
+          <w:bCs/>
+          <w:color w:val="1F5C99"/>
+          <w:sz w:val="22"/>
+          <w:szCs w:val="22"/>
+        </w:rPr>
+        <w:t xml:space="preserve">10.2 Preload-Strategie (RAM-Engpass)</w:t>
+      </w:r>
+    </w:p>
+    <w:p>
+      <w:pPr>
+        <w:spacing w:after="80"/>
+      </w:pPr>
+      <w:r>
+        <w:rPr>
+          <w:rFonts w:ascii="Arial" w:cs="Arial" w:eastAsia="Arial" w:hAnsi="Arial"/>
+          <w:color w:val="404040"/>
+          <w:sz w:val="20"/>
+          <w:szCs w:val="20"/>
+        </w:rPr>
+        <w:t xml:space="preserve">Jedes preloaded QGIS-Projekt belegt ca. 500 MB – 2 GB RAM. Bei vielen Projekten im Preload kann der RAM erschöpft sein, bevor die ersten Anfragen ankommen. Faustregel: maximal 2–3 Projekte pro Worker preloaden. Alle anderen Projekte werden beim ersten Zugriff geladen (ca. 40 Sekunden auf schwacher Hardware, 5–10 Sekunden auf moderner Hardware).</w:t>
+      </w:r>
+    </w:p>
+    <w:p>
+      <w:pPr>
+        <w:spacing w:after="40"/>
+      </w:pPr>
+      <w:r>
+        <w:rPr>
+          <w:rFonts w:ascii="Arial" w:cs="Arial" w:eastAsia="Arial" w:hAnsi="Arial"/>
+          <w:b/>
+          <w:color w:val="404040"/>
+          <w:sz w:val="20"/>
+          <w:szCs w:val="20"/>
+        </w:rPr>
+        <w:t xml:space="preserve">Preload konfigurieren (/srv/qgis/config/preload_projects.txt):</w:t>
+      </w:r>
+    </w:p>
+    <w:p>
+      <w:pPr>
+        <w:shd w:fill="F0F0F0" w:val="clear"/>
+        <w:spacing w:after="20"/>
+        <w:ind w:left="360"/>
+      </w:pPr>
+      <w:r>
+        <w:rPr>
+          <w:rFonts w:ascii="Courier New" w:cs="Courier New" w:eastAsia="Courier New" w:hAnsi="Courier New"/>
+          <w:color w:val="1A1A1A"/>
+          <w:sz w:val="18"/>
+          <w:szCs w:val="18"/>
+        </w:rPr>
+        <w:t xml:space="preserve"># Nur das wichtigste Projekt preloaden:</w:t>
+      </w:r>
+    </w:p>
+    <w:p>
+      <w:pPr>
+        <w:shd w:fill="F0F0F0" w:val="clear"/>
+        <w:spacing w:after="80"/>
+        <w:ind w:left="360"/>
+      </w:pPr>
+      <w:r>
+        <w:rPr>
+          <w:rFonts w:ascii="Courier New" w:cs="Courier New" w:eastAsia="Courier New" w:hAnsi="Courier New"/>
+          <w:color w:val="1A1A1A"/>
+          <w:sz w:val="18"/>
+          <w:szCs w:val="18"/>
+        </w:rPr>
+        <w:t xml:space="preserve">/srv/data/hauptkarte.qgs</w:t>
+      </w:r>
+    </w:p>
+    <w:p>
+      <w:pPr>
+        <w:pStyle w:val="Heading2"/>
+        <w:spacing w:after="80" w:before="240"/>
+      </w:pPr>
+      <w:r>
+        <w:rPr>
+          <w:rFonts w:ascii="Arial" w:cs="Arial" w:eastAsia="Arial" w:hAnsi="Arial"/>
+          <w:b/>
+          <w:bCs/>
+          <w:color w:val="1F5C99"/>
+          <w:sz w:val="22"/>
+          <w:szCs w:val="22"/>
+        </w:rPr>
+        <w:t xml:space="preserve">10.3 Hardware-Empfehlungen</w:t>
+      </w:r>
+    </w:p>
+    <w:p>
+      <w:pPr>
+        <w:spacing w:after="80"/>
+      </w:pPr>
+      <w:r>
+        <w:rPr>
+          <w:rFonts w:ascii="Arial" w:cs="Arial" w:eastAsia="Arial" w:hAnsi="Arial"/>
+          <w:color w:val="404040"/>
+          <w:sz w:val="20"/>
+          <w:szCs w:val="20"/>
+        </w:rPr>
+        <w:t xml:space="preserve">QGIS Server ist CPU-intensiv. Zu schwache Hardware führt zu langen Ladezeiten und dauerhaft hoher CPU-Last. Mindestanforderung: 4 CPU-Kerne mit &gt;2000 Passmark pro Kern, 16 GB RAM.</w:t>
+      </w:r>
+    </w:p>
+    <w:tbl>
+      <w:tblPr>
+        <w:tblW w:type="dxa" w:w="9746"/>
+        <w:tblBorders>
+          <w:top w:val="single" w:color="auto" w:sz="4"/>
+          <w:left w:val="single" w:color="auto" w:sz="4"/>
+          <w:bottom w:val="single" w:color="auto" w:sz="4"/>
+          <w:right w:val="single" w:color="auto" w:sz="4"/>
+          <w:insideH w:val="single" w:color="auto" w:sz="4"/>
+          <w:insideV w:val="single" w:color="auto" w:sz="4"/>
+        </w:tblBorders>
+      </w:tblPr>
+      <w:tblGrid>
+        <w:gridCol w:w="3500"/>
+        <w:gridCol w:w="1800"/>
+        <w:gridCol w:w="4446"/>
+      </w:tblGrid>
+      <w:tr>
+        <w:trPr>
+          <w:tblHeader/>
+        </w:trPr>
+        <w:tc>
+          <w:tcPr>
+            <w:tcW w:type="dxa" w:w="3500"/>
+            <w:shd w:fill="1F5C99" w:val="clear"/>
+            <w:tcMar>
+              <w:top w:type="dxa" w:w="80"/>
+              <w:left w:type="dxa" w:w="120"/>
+              <w:bottom w:type="dxa" w:w="80"/>
+              <w:right w:type="dxa" w:w="120"/>
+            </w:tcMar>
+          </w:tcPr>
+          <w:p>
+            <w:r>
+              <w:rPr>
+                <w:rFonts w:ascii="Arial" w:cs="Arial" w:eastAsia="Arial" w:hAnsi="Arial"/>
+                <w:b/>
+                <w:color w:val="FFFFFF"/>
+                <w:sz w:val="18"/>
+                <w:szCs w:val="18"/>
+              </w:rPr>
+              <w:t>Hardware</w:t>
+            </w:r>
+          </w:p>
+        </w:tc>
+        <w:tc>
+          <w:tcPr>
+            <w:tcW w:type="dxa" w:w="1800"/>
+            <w:shd w:fill="1F5C99" w:val="clear"/>
+            <w:tcMar>
+              <w:top w:type="dxa" w:w="80"/>
+              <w:left w:type="dxa" w:w="120"/>
+              <w:bottom w:type="dxa" w:w="80"/>
+              <w:right w:type="dxa" w:w="120"/>
+            </w:tcMar>
+          </w:tcPr>
+          <w:p>
+            <w:r>
+              <w:rPr>
+                <w:rFonts w:ascii="Arial" w:cs="Arial" w:eastAsia="Arial" w:hAnsi="Arial"/>
+                <w:b/>
+                <w:color w:val="FFFFFF"/>
+                <w:sz w:val="18"/>
+                <w:szCs w:val="18"/>
+              </w:rPr>
+              <w:t>Eignung</w:t>
+            </w:r>
+          </w:p>
+        </w:tc>
+        <w:tc>
+          <w:tcPr>
+            <w:tcW w:type="dxa" w:w="4446"/>
+            <w:shd w:fill="1F5C99" w:val="clear"/>
+            <w:tcMar>
+              <w:top w:type="dxa" w:w="80"/>
+              <w:left w:type="dxa" w:w="120"/>
+              <w:bottom w:type="dxa" w:w="80"/>
+              <w:right w:type="dxa" w:w="120"/>
+            </w:tcMar>
+          </w:tcPr>
+          <w:p>
+            <w:r>
+              <w:rPr>
+                <w:rFonts w:ascii="Arial" w:cs="Arial" w:eastAsia="Arial" w:hAnsi="Arial"/>
+                <w:b/>
+                <w:color w:val="FFFFFF"/>
+                <w:sz w:val="18"/>
+                <w:szCs w:val="18"/>
+              </w:rPr>
+              <w:t>Anmerkung</w:t>
+            </w:r>
+          </w:p>
+        </w:tc>
+      </w:tr>
+      <w:tr>
+        <w:tc>
+          <w:tcPr>
+            <w:tcW w:type="dxa" w:w="3500"/>
+            <w:shd w:fill="EBF3FB" w:val="clear"/>
+            <w:tcMar>
+              <w:top w:type="dxa" w:w="80"/>
+              <w:left w:type="dxa" w:w="120"/>
+              <w:bottom w:type="dxa" w:w="80"/>
+              <w:right w:type="dxa" w:w="120"/>
+            </w:tcMar>
+          </w:tcPr>
+          <w:p>
+            <w:r>
+              <w:rPr>
+                <w:rFonts w:ascii="Arial" w:cs="Arial" w:eastAsia="Arial" w:hAnsi="Arial"/>
+                <w:color w:val="404040"/>
+                <w:sz w:val="18"/>
+                <w:szCs w:val="18"/>
+              </w:rPr>
+              <w:t xml:space="preserve">Intel Atom C2538 (2013)</w:t>
+            </w:r>
+          </w:p>
+        </w:tc>
+        <w:tc>
+          <w:tcPr>
+            <w:tcW w:type="dxa" w:w="1800"/>
+            <w:shd w:fill="EBF3FB" w:val="clear"/>
+            <w:tcMar>
+              <w:top w:type="dxa" w:w="80"/>
+              <w:left w:type="dxa" w:w="120"/>
+              <w:bottom w:type="dxa" w:w="80"/>
+              <w:right w:type="dxa" w:w="120"/>
+            </w:tcMar>
+          </w:tcPr>
+          <w:p>
+            <w:r>
+              <w:rPr>
+                <w:rFonts w:ascii="Arial" w:cs="Arial" w:eastAsia="Arial" w:hAnsi="Arial"/>
+                <w:color w:val="CC0000"/>
+                <w:sz w:val="18"/>
+                <w:szCs w:val="18"/>
+              </w:rPr>
+              <w:t>Ungeeignet</w:t>
+            </w:r>
+          </w:p>
+        </w:tc>
+        <w:tc>
+          <w:tcPr>
+            <w:tcW w:type="dxa" w:w="4446"/>
+            <w:shd w:fill="EBF3FB" w:val="clear"/>
+            <w:tcMar>
+              <w:top w:type="dxa" w:w="80"/>
+              <w:left w:type="dxa" w:w="120"/>
+              <w:bottom w:type="dxa" w:w="80"/>
+              <w:right w:type="dxa" w:w="120"/>
+            </w:tcMar>
+          </w:tcPr>
+          <w:p>
+            <w:r>
+              <w:rPr>
+                <w:rFonts w:ascii="Arial" w:cs="Arial" w:eastAsia="Arial" w:hAnsi="Arial"/>
+                <w:color w:val="404040"/>
+                <w:sz w:val="18"/>
+                <w:szCs w:val="18"/>
+              </w:rPr>
+              <w:t xml:space="preserve">~550 Passmark, QGIS-Start &gt;40s, dauerhaft hohe CPU-Last</w:t>
+            </w:r>
+          </w:p>
+        </w:tc>
+      </w:tr>
+      <w:tr>
+        <w:tc>
+          <w:tcPr>
+            <w:tcW w:type="dxa" w:w="3500"/>
+            <w:tcMar>
+              <w:top w:type="dxa" w:w="80"/>
+              <w:left w:type="dxa" w:w="120"/>
+              <w:bottom w:type="dxa" w:w="80"/>
+              <w:right w:type="dxa" w:w="120"/>
+            </w:tcMar>
+          </w:tcPr>
+          <w:p>
+            <w:r>
+              <w:rPr>
+                <w:rFonts w:ascii="Arial" w:cs="Arial" w:eastAsia="Arial" w:hAnsi="Arial"/>
+                <w:color w:val="404040"/>
+                <w:sz w:val="18"/>
+                <w:szCs w:val="18"/>
+              </w:rPr>
+              <w:t xml:space="preserve">Intel N100 (2023)</w:t>
+            </w:r>
+          </w:p>
+        </w:tc>
+        <w:tc>
+          <w:tcPr>
+            <w:tcW w:type="dxa" w:w="1800"/>
+            <w:tcMar>
+              <w:top w:type="dxa" w:w="80"/>
+              <w:left w:type="dxa" w:w="120"/>
+              <w:bottom w:type="dxa" w:w="80"/>
+              <w:right w:type="dxa" w:w="120"/>
+            </w:tcMar>
+          </w:tcPr>
+          <w:p>
+            <w:r>
+              <w:rPr>
+                <w:rFonts w:ascii="Arial" w:cs="Arial" w:eastAsia="Arial" w:hAnsi="Arial"/>
+                <w:color w:val="CC6600"/>
+                <w:sz w:val="18"/>
+                <w:szCs w:val="18"/>
+              </w:rPr>
+              <w:t xml:space="preserve">Minimale Basis</w:t>
+            </w:r>
+          </w:p>
+        </w:tc>
+        <w:tc>
+          <w:tcPr>
+            <w:tcW w:type="dxa" w:w="4446"/>
+            <w:tcMar>
+              <w:top w:type="dxa" w:w="80"/>
+              <w:left w:type="dxa" w:w="120"/>
+              <w:bottom w:type="dxa" w:w="80"/>
+              <w:right w:type="dxa" w:w="120"/>
+            </w:tcMar>
+          </w:tcPr>
+          <w:p>
+            <w:r>
+              <w:rPr>
+                <w:rFonts w:ascii="Arial" w:cs="Arial" w:eastAsia="Arial" w:hAnsi="Arial"/>
+                <w:color w:val="404040"/>
+                <w:sz w:val="18"/>
+                <w:szCs w:val="18"/>
+              </w:rPr>
+              <w:t xml:space="preserve">~3000 Passmark, für 1–2 gleichzeitige Nutzer</w:t>
+            </w:r>
+          </w:p>
+        </w:tc>
+      </w:tr>
+      <w:tr>
+        <w:tc>
+          <w:tcPr>
+            <w:tcW w:type="dxa" w:w="3500"/>
+            <w:shd w:fill="EBF3FB" w:val="clear"/>
+            <w:tcMar>
+              <w:top w:type="dxa" w:w="80"/>
+              <w:left w:type="dxa" w:w="120"/>
+              <w:bottom w:type="dxa" w:w="80"/>
+              <w:right w:type="dxa" w:w="120"/>
+            </w:tcMar>
+          </w:tcPr>
+          <w:p>
+            <w:r>
+              <w:rPr>
+                <w:rFonts w:ascii="Arial" w:cs="Arial" w:eastAsia="Arial" w:hAnsi="Arial"/>
+                <w:color w:val="404040"/>
+                <w:sz w:val="18"/>
+                <w:szCs w:val="18"/>
+              </w:rPr>
+              <w:t xml:space="preserve">AMD Ryzen 7 5800X</w:t>
+            </w:r>
+          </w:p>
+        </w:tc>
+        <w:tc>
+          <w:tcPr>
+            <w:tcW w:type="dxa" w:w="1800"/>
+            <w:shd w:fill="EBF3FB" w:val="clear"/>
+            <w:tcMar>
+              <w:top w:type="dxa" w:w="80"/>
+              <w:left w:type="dxa" w:w="120"/>
+              <w:bottom w:type="dxa" w:w="80"/>
+              <w:right w:type="dxa" w:w="120"/>
+            </w:tcMar>
+          </w:tcPr>
+          <w:p>
+            <w:r>
+              <w:rPr>
+                <w:rFonts w:ascii="Arial" w:cs="Arial" w:eastAsia="Arial" w:hAnsi="Arial"/>
+                <w:color w:val="006600"/>
+                <w:sz w:val="18"/>
+                <w:szCs w:val="18"/>
+              </w:rPr>
+              <w:t>Gut</w:t>
+            </w:r>
+          </w:p>
+        </w:tc>
+        <w:tc>
+          <w:tcPr>
+            <w:tcW w:type="dxa" w:w="4446"/>
+            <w:shd w:fill="EBF3FB" w:val="clear"/>
+            <w:tcMar>
+              <w:top w:type="dxa" w:w="80"/>
+              <w:left w:type="dxa" w:w="120"/>
+              <w:bottom w:type="dxa" w:w="80"/>
+              <w:right w:type="dxa" w:w="120"/>
+            </w:tcMar>
+          </w:tcPr>
+          <w:p>
+            <w:r>
+              <w:rPr>
+                <w:rFonts w:ascii="Arial" w:cs="Arial" w:eastAsia="Arial" w:hAnsi="Arial"/>
+                <w:color w:val="404040"/>
+                <w:sz w:val="18"/>
+                <w:szCs w:val="18"/>
+              </w:rPr>
+              <w:t xml:space="preserve">~3800 Passmark/Kern, kurze Ladezeiten, mehrere Nutzer</w:t>
+            </w:r>
+          </w:p>
+        </w:tc>
+      </w:tr>
+      <w:tr>
+        <w:tc>
+          <w:tcPr>
+            <w:tcW w:type="dxa" w:w="3500"/>
+            <w:tcMar>
+              <w:top w:type="dxa" w:w="80"/>
+              <w:left w:type="dxa" w:w="120"/>
+              <w:bottom w:type="dxa" w:w="80"/>
+              <w:right w:type="dxa" w:w="120"/>
+            </w:tcMar>
+          </w:tcPr>
+          <w:p>
+            <w:r>
+              <w:rPr>
+                <w:rFonts w:ascii="Arial" w:cs="Arial" w:eastAsia="Arial" w:hAnsi="Arial"/>
+                <w:color w:val="404040"/>
+                <w:sz w:val="18"/>
+                <w:szCs w:val="18"/>
+              </w:rPr>
+              <w:t xml:space="preserve">16+ Kerne Server-CPU</w:t>
+            </w:r>
+          </w:p>
+        </w:tc>
+        <w:tc>
+          <w:tcPr>
+            <w:tcW w:type="dxa" w:w="1800"/>
+            <w:tcMar>
+              <w:top w:type="dxa" w:w="80"/>
+              <w:left w:type="dxa" w:w="120"/>
+              <w:bottom w:type="dxa" w:w="80"/>
+              <w:right w:type="dxa" w:w="120"/>
+            </w:tcMar>
+          </w:tcPr>
+          <w:p>
+            <w:r>
+              <w:rPr>
+                <w:rFonts w:ascii="Arial" w:cs="Arial" w:eastAsia="Arial" w:hAnsi="Arial"/>
+                <w:color w:val="006600"/>
+                <w:sz w:val="18"/>
+                <w:szCs w:val="18"/>
+              </w:rPr>
+              <w:t>Optimal</w:t>
+            </w:r>
+          </w:p>
+        </w:tc>
+        <w:tc>
+          <w:tcPr>
+            <w:tcW w:type="dxa" w:w="4446"/>
+            <w:tcMar>
+              <w:top w:type="dxa" w:w="80"/>
+              <w:left w:type="dxa" w:w="120"/>
+              <w:bottom w:type="dxa" w:w="80"/>
+              <w:right w:type="dxa" w:w="120"/>
+            </w:tcMar>
+          </w:tcPr>
+          <w:p>
+            <w:r>
+              <w:rPr>
+                <w:rFonts w:ascii="Arial" w:cs="Arial" w:eastAsia="Arial" w:hAnsi="Arial"/>
+                <w:color w:val="404040"/>
+                <w:sz w:val="18"/>
+                <w:szCs w:val="18"/>
+              </w:rPr>
+              <w:t xml:space="preserve">Für Produktionsbetrieb mit vielen Nutzern</w:t>
+            </w:r>
+          </w:p>
+        </w:tc>
+      </w:tr>
+    </w:tbl>
+    <w:p>
+      <w:pPr>
+        <w:spacing w:after="120"/>
+      </w:pPr>
+      <w:r>
+        <w:t xml:space="preserve"/>
+      </w:r>
+    </w:p>
+    <w:p>
+      <w:r>
+        <w:br w:type="page"/>
+      </w:r>
+    </w:p>
+    <w:p>
+      <w:pPr>
+        <w:pStyle w:val="Heading1"/>
+        <w:pBdr>
+          <w:bottom w:val="single" w:color="1F5C99" w:sz="6" w:space="4"/>
+        </w:pBdr>
+        <w:spacing w:after="120" w:before="360"/>
+      </w:pPr>
+      <w:r>
+        <w:rPr>
+          <w:rFonts w:ascii="Arial" w:cs="Arial" w:eastAsia="Arial" w:hAnsi="Arial"/>
+          <w:b/>
+          <w:bCs/>
+          <w:color w:val="1F5C99"/>
+          <w:sz w:val="28"/>
+          <w:szCs w:val="28"/>
+        </w:rPr>
+        <w:t xml:space="preserve">11. Sicherheitshinweise</w:t>
       </w:r>
     </w:p>
     <w:p>
@@ -11288,7 +11881,7 @@
           <w:sz w:val="28"/>
           <w:szCs w:val="28"/>
         </w:rPr>
-        <w:t xml:space="preserve">11. Referenz-Links</w:t>
+        <w:t xml:space="preserve">12. Referenz-Links</w:t>
       </w:r>
     </w:p>
     <w:p>

</xml_diff>

<commit_message>
Add table of contents to installation guide docx
Insert a proper Word TOC field (scans existing Heading1-3 styles) on
its own page after the cover, and enable updateFields so Word
recalculates the TOC and the existing page-number field automatically
on first open. Page numbers were already present in the footer.

Co-Authored-By: Claude Sonnet 5 <noreply@anthropic.com>
</commit_message>
<xml_diff>
--- a/Lizmap_QGIS_Server_Installation_Guide.docx
+++ b/Lizmap_QGIS_Server_Installation_Guide.docx
@@ -100,6 +100,52 @@
           <w:szCs w:val="20"/>
         </w:rPr>
         <w:t xml:space="preserve">Basierend auf install_lizmap_qgisserver.sh / _8cpu.sh / _16cpu.sh (aktueller Stand)</w:t>
+      </w:r>
+    </w:p>
+    <w:p>
+      <w:r>
+        <w:br w:type="page"/>
+      </w:r>
+    </w:p>
+    <w:p>
+      <w:pPr>
+        <w:spacing w:after="240"/>
+      </w:pPr>
+      <w:r>
+        <w:rPr>
+          <w:rFonts w:ascii="Arial" w:cs="Arial" w:eastAsia="Arial" w:hAnsi="Arial"/>
+          <w:b/>
+          <w:bCs/>
+          <w:color w:val="1F5C99"/>
+          <w:sz w:val="28"/>
+          <w:szCs w:val="28"/>
+        </w:rPr>
+        <w:t xml:space="preserve">Inhaltsverzeichnis</w:t>
+      </w:r>
+    </w:p>
+    <w:p>
+      <w:r>
+        <w:fldChar w:fldCharType="begin" w:dirty="true"/>
+      </w:r>
+      <w:r>
+        <w:instrText xml:space="preserve"> TOC \o "1-3" \h \z \u </w:instrText>
+      </w:r>
+      <w:r>
+        <w:fldChar w:fldCharType="separate"/>
+      </w:r>
+      <w:r>
+        <w:rPr>
+          <w:rFonts w:ascii="Arial" w:cs="Arial" w:eastAsia="Arial" w:hAnsi="Arial"/>
+          <w:color w:val="808080"/>
+          <w:i/>
+          <w:iCs/>
+          <w:sz w:val="20"/>
+          <w:szCs w:val="20"/>
+        </w:rPr>
+        <w:t xml:space="preserve">Zum Aktualisieren: rechte Maustaste auf das Inhaltsverzeichnis → "Feld aktualisieren" (oder gesamtes Dokument markieren und F9 drücken).</w:t>
+      </w:r>
+      <w:r>
+        <w:fldChar w:fldCharType="end"/>
       </w:r>
     </w:p>
     <w:p>

</xml_diff>

<commit_message>
Sync Word install guide with README.md appendices
Add the sections that exist in README.md but were missing from
Lizmap_QGIS_Server_Installation_Guide.docx: 10.4 Umlaute im Dateinamen
(NFD/NFC) after Hardware-Empfehlungen, 13. Anhang: UFW Firewall
verwalten, and 14. Anhang: Ubuntu-Server 1:1 klonen mit Clonezilla —
matching the document's existing Arial/Heading1-3 style, tables, and
shaded code blocks.

Co-Authored-By: Claude Sonnet 5 <noreply@anthropic.com>
</commit_message>
<xml_diff>
--- a/Lizmap_QGIS_Server_Installation_Guide.docx
+++ b/Lizmap_QGIS_Server_Installation_Guide.docx
@@ -126,11 +126,7 @@
     <w:p>
       <w:r>
         <w:fldChar w:fldCharType="begin" w:dirty="true"/>
-      </w:r>
-      <w:r>
         <w:instrText xml:space="preserve"> TOC \o "1-3" \h \z \u </w:instrText>
-      </w:r>
-      <w:r>
         <w:fldChar w:fldCharType="separate"/>
       </w:r>
       <w:r>
@@ -11745,6 +11741,232 @@
       </w:r>
     </w:p>
     <w:p>
+      <w:pPr>
+        <w:pStyle w:val="Heading2"/>
+        <w:spacing w:after="80" w:before="240"/>
+      </w:pPr>
+      <w:r>
+        <w:rPr>
+          <w:rFonts w:ascii="Arial" w:cs="Arial" w:eastAsia="Arial" w:hAnsi="Arial"/>
+          <w:b/>
+          <w:bCs/>
+          <w:color w:val="1F5C99"/>
+          <w:sz w:val="22"/>
+          <w:szCs w:val="22"/>
+        </w:rPr>
+        <w:t xml:space="preserve">10.4 Umlaute im Dateinamen (NFD/NFC) nach Mac-Synchronisation</w:t>
+      </w:r>
+    </w:p>
+    <w:p>
+      <w:pPr>
+        <w:spacing w:after="80"/>
+      </w:pPr>
+      <w:r>
+        <w:rPr>
+          <w:rFonts w:ascii="Arial" w:cs="Arial" w:eastAsia="Arial" w:hAnsi="Arial"/>
+          <w:color w:val="404040"/>
+          <w:sz w:val="20"/>
+          <w:szCs w:val="20"/>
+        </w:rPr>
+        <w:t xml:space="preserve">Symptom: Nach dem Synchronisieren von Medien-/Upload-Verzeichnissen zwischen zwei Ubuntu-Systemen über einen Mac als Zwischenstation (z.B. via ForkLift: Ubuntu → Mac → Ubuntu) liefert der Lizmap getMedia-Endpunkt für Dateien, deren Name Umlaute oder andere Sonderzeichen enthält, einen 404 — obwohl die Datei nachweislich am erwarteten Pfad liegt.</w:t>
+      </w:r>
+    </w:p>
+    <w:p>
+      <w:pPr>
+        <w:spacing w:after="80"/>
+      </w:pPr>
+      <w:r>
+        <w:rPr>
+          <w:rFonts w:ascii="Arial" w:cs="Arial" w:eastAsia="Arial" w:hAnsi="Arial"/>
+          <w:color w:val="404040"/>
+          <w:sz w:val="20"/>
+          <w:szCs w:val="20"/>
+        </w:rPr>
+        <w:t xml:space="preserve">Ursache: macOS normalisiert Dateinamen mit Sonderzeichen beim Anlegen/Kopieren standardmässig nach Unicode NFD (zerlegte Form), Linux/PHP erwartet dagegen NFC (vorkomponierte Form). Der Dateiname aus der URL ist dadurch byte-technisch nicht identisch mit dem Namen auf der Platte, obwohl beide optisch gleich aussehen.</w:t>
+      </w:r>
+    </w:p>
+    <w:p>
+      <w:pPr>
+        <w:spacing w:after="80"/>
+      </w:pPr>
+      <w:r>
+        <w:rPr>
+          <w:rFonts w:ascii="Arial" w:cs="Arial" w:eastAsia="Arial" w:hAnsi="Arial"/>
+          <w:color w:val="404040"/>
+          <w:sz w:val="20"/>
+          <w:szCs w:val="20"/>
+        </w:rPr>
+        <w:t xml:space="preserve">Diagnose (im betroffenen Verzeichnis prüfen, welche Dateien NFD statt NFC sind):</w:t>
+      </w:r>
+    </w:p>
+    <w:p>
+      <w:pPr>
+        <w:shd w:fill="F0F0F0" w:val="clear"/>
+        <w:spacing w:after="80"/>
+        <w:ind w:left="360"/>
+      </w:pPr>
+      <w:r>
+        <w:rPr>
+          <w:rFonts w:ascii="Courier New" w:cs="Courier New" w:eastAsia="Courier New" w:hAnsi="Courier New"/>
+          <w:color w:val="1A1A1A"/>
+          <w:sz w:val="18"/>
+          <w:szCs w:val="18"/>
+        </w:rPr>
+        <w:t xml:space="preserve">cd /pfad/zum/media/upload/verzeichnis/</w:t>
+      </w:r>
+    </w:p>
+    <w:p>
+      <w:pPr>
+        <w:shd w:fill="F0F0F0" w:val="clear"/>
+        <w:spacing w:after="80"/>
+        <w:ind w:left="360"/>
+      </w:pPr>
+      <w:r>
+        <w:rPr>
+          <w:rFonts w:ascii="Courier New" w:cs="Courier New" w:eastAsia="Courier New" w:hAnsi="Courier New"/>
+          <w:color w:val="1A1A1A"/>
+          <w:sz w:val="18"/>
+          <w:szCs w:val="18"/>
+        </w:rPr>
+        <w:t xml:space="preserve">python3 -c "</w:t>
+      </w:r>
+    </w:p>
+    <w:p>
+      <w:pPr>
+        <w:shd w:fill="F0F0F0" w:val="clear"/>
+        <w:spacing w:after="80"/>
+        <w:ind w:left="360"/>
+      </w:pPr>
+      <w:r>
+        <w:rPr>
+          <w:rFonts w:ascii="Courier New" w:cs="Courier New" w:eastAsia="Courier New" w:hAnsi="Courier New"/>
+          <w:color w:val="1A1A1A"/>
+          <w:sz w:val="18"/>
+          <w:szCs w:val="18"/>
+        </w:rPr>
+        <w:t xml:space="preserve">import unicodedata, os</w:t>
+      </w:r>
+    </w:p>
+    <w:p>
+      <w:pPr>
+        <w:shd w:fill="F0F0F0" w:val="clear"/>
+        <w:spacing w:after="80"/>
+        <w:ind w:left="360"/>
+      </w:pPr>
+      <w:r>
+        <w:rPr>
+          <w:rFonts w:ascii="Courier New" w:cs="Courier New" w:eastAsia="Courier New" w:hAnsi="Courier New"/>
+          <w:color w:val="1A1A1A"/>
+          <w:sz w:val="18"/>
+          <w:szCs w:val="18"/>
+        </w:rPr>
+        <w:t xml:space="preserve">for f in os.listdir('.'):</w:t>
+      </w:r>
+    </w:p>
+    <w:p>
+      <w:pPr>
+        <w:shd w:fill="F0F0F0" w:val="clear"/>
+        <w:spacing w:after="80"/>
+        <w:ind w:left="360"/>
+      </w:pPr>
+      <w:r>
+        <w:rPr>
+          <w:rFonts w:ascii="Courier New" w:cs="Courier New" w:eastAsia="Courier New" w:hAnsi="Courier New"/>
+          <w:color w:val="1A1A1A"/>
+          <w:sz w:val="18"/>
+          <w:szCs w:val="18"/>
+        </w:rPr>
+        <w:t xml:space="preserve">    print(f, '-&gt; NFC' if unicodedata.is_normalized('NFC', f) else '-&gt; NFD/andere Form')</w:t>
+      </w:r>
+    </w:p>
+    <w:p>
+      <w:pPr>
+        <w:shd w:fill="F0F0F0" w:val="clear"/>
+        <w:spacing w:after="80"/>
+        <w:ind w:left="360"/>
+      </w:pPr>
+      <w:r>
+        <w:rPr>
+          <w:rFonts w:ascii="Courier New" w:cs="Courier New" w:eastAsia="Courier New" w:hAnsi="Courier New"/>
+          <w:color w:val="1A1A1A"/>
+          <w:sz w:val="18"/>
+          <w:szCs w:val="18"/>
+        </w:rPr>
+        <w:t xml:space="preserve">"</w:t>
+      </w:r>
+    </w:p>
+    <w:p>
+      <w:pPr>
+        <w:spacing w:after="80"/>
+      </w:pPr>
+      <w:r>
+        <w:rPr>
+          <w:rFonts w:ascii="Arial" w:cs="Arial" w:eastAsia="Arial" w:hAnsi="Arial"/>
+          <w:color w:val="404040"/>
+          <w:sz w:val="20"/>
+          <w:szCs w:val="20"/>
+        </w:rPr>
+        <w:t xml:space="preserve">Fix (einmalig, für bereits betroffene Dateien):</w:t>
+      </w:r>
+    </w:p>
+    <w:p>
+      <w:pPr>
+        <w:shd w:fill="F0F0F0" w:val="clear"/>
+        <w:spacing w:after="80"/>
+        <w:ind w:left="360"/>
+      </w:pPr>
+      <w:r>
+        <w:rPr>
+          <w:rFonts w:ascii="Courier New" w:cs="Courier New" w:eastAsia="Courier New" w:hAnsi="Courier New"/>
+          <w:color w:val="1A1A1A"/>
+          <w:sz w:val="18"/>
+          <w:szCs w:val="18"/>
+        </w:rPr>
+        <w:t xml:space="preserve">sudo apt install -y convmv</w:t>
+      </w:r>
+    </w:p>
+    <w:p>
+      <w:pPr>
+        <w:shd w:fill="F0F0F0" w:val="clear"/>
+        <w:spacing w:after="80"/>
+        <w:ind w:left="360"/>
+      </w:pPr>
+      <w:r>
+        <w:rPr>
+          <w:rFonts w:ascii="Courier New" w:cs="Courier New" w:eastAsia="Courier New" w:hAnsi="Courier New"/>
+          <w:color w:val="1A1A1A"/>
+          <w:sz w:val="18"/>
+          <w:szCs w:val="18"/>
+        </w:rPr>
+        <w:t xml:space="preserve">convmv -f utf8 -t utf8 --nfc -r --notest /srv/data/</w:t>
+      </w:r>
+    </w:p>
+    <w:p>
+      <w:pPr>
+        <w:spacing w:after="80"/>
+      </w:pPr>
+      <w:r>
+        <w:rPr>
+          <w:rFonts w:ascii="Arial" w:cs="Arial" w:eastAsia="Arial" w:hAnsi="Arial"/>
+          <w:b/>
+          <w:bCs/>
+          <w:color w:val="CC6600"/>
+          <w:sz w:val="20"/>
+          <w:szCs w:val="20"/>
+        </w:rPr>
+        <w:t xml:space="preserve">Automatisch: </w:t>
+      </w:r>
+      <w:r>
+        <w:rPr>
+          <w:rFonts w:ascii="Arial" w:cs="Arial" w:eastAsia="Arial" w:hAnsi="Arial"/>
+          <w:color w:val="404040"/>
+          <w:sz w:val="20"/>
+          <w:szCs w:val="20"/>
+        </w:rPr>
+        <w:t xml:space="preserve">Das Installationsskript kann optional einen systemd-Timer einrichten, der neu ankommende Dateien alle 15 Minuten automatisch auf NFC normalisiert — INSTALL_CONVMV_TIMER=true im Skript-Header setzen. Standard: false.</w:t>
+      </w:r>
+    </w:p>
+    <w:p>
       <w:r>
         <w:br w:type="page"/>
       </w:r>
@@ -12097,6 +12319,4019 @@
           <w:t xml:space="preserve">https://www.pgadmin.org</w:t>
         </w:r>
       </w:hyperlink>
+    </w:p>
+    <w:p>
+      <w:pPr>
+        <w:pStyle w:val="Heading1"/>
+        <w:pBdr>
+          <w:bottom w:val="single" w:color="1F5C99" w:sz="6" w:space="4"/>
+        </w:pBdr>
+        <w:spacing w:after="120" w:before="360"/>
+      </w:pPr>
+      <w:r>
+        <w:rPr>
+          <w:rFonts w:ascii="Arial" w:cs="Arial" w:eastAsia="Arial" w:hAnsi="Arial"/>
+          <w:b/>
+          <w:bCs/>
+          <w:color w:val="1F5C99"/>
+          <w:sz w:val="28"/>
+          <w:szCs w:val="28"/>
+        </w:rPr>
+        <w:t xml:space="preserve">13. Anhang: UFW Firewall verwalten</w:t>
+      </w:r>
+    </w:p>
+    <w:p>
+      <w:pPr>
+        <w:spacing w:after="80"/>
+      </w:pPr>
+      <w:r>
+        <w:rPr>
+          <w:rFonts w:ascii="Arial" w:cs="Arial" w:eastAsia="Arial" w:hAnsi="Arial"/>
+          <w:color w:val="404040"/>
+          <w:sz w:val="20"/>
+          <w:szCs w:val="20"/>
+        </w:rPr>
+        <w:t xml:space="preserve">Installation, Grundregeln und ein sicherer Weg zur Aktivierung — ohne sich per SSH auszusperren. INSTALL_SECURITY=true richtet UFW bereits mit sinnvollen Grundregeln ein (SSH, HTTP/HTTPS, RDP-Port); dieser Anhang ist für alle, die die Firewall darüber hinaus manuell anpassen wollen (z.B. einen Datenbank-Port nur für eine bestimmte Client-IP öffnen).</w:t>
+      </w:r>
+    </w:p>
+    <w:p>
+      <w:pPr>
+        <w:pStyle w:val="Heading2"/>
+        <w:spacing w:after="80" w:before="240"/>
+      </w:pPr>
+      <w:r>
+        <w:rPr>
+          <w:rFonts w:ascii="Arial" w:cs="Arial" w:eastAsia="Arial" w:hAnsi="Arial"/>
+          <w:b/>
+          <w:bCs/>
+          <w:color w:val="1F5C99"/>
+          <w:sz w:val="22"/>
+          <w:szCs w:val="22"/>
+        </w:rPr>
+        <w:t xml:space="preserve">Funktionsprinzip</w:t>
+      </w:r>
+    </w:p>
+    <w:p>
+      <w:pPr>
+        <w:spacing w:after="80"/>
+      </w:pPr>
+      <w:r>
+        <w:rPr>
+          <w:rFonts w:ascii="Arial" w:cs="Arial" w:eastAsia="Arial" w:hAnsi="Arial"/>
+          <w:color w:val="404040"/>
+          <w:sz w:val="20"/>
+          <w:szCs w:val="20"/>
+        </w:rPr>
+        <w:t xml:space="preserve">UFW (Uncomplicated Firewall) ist kein eigener Paketfilter, sondern eine vereinfachte Kommandozeile vor dem Linux-Kernel-Paketfilter (iptables/nftables). Statt Chains und Tables von Hand zu verwalten, schreibt man Regeln wie allow 22/tcp — UFW übersetzt das dahinter in die passenden Kernel-Regeln.</w:t>
+      </w:r>
+    </w:p>
+    <w:p>
+      <w:pPr>
+        <w:spacing w:after="80"/>
+      </w:pPr>
+      <w:r>
+        <w:rPr>
+          <w:rFonts w:ascii="Arial" w:cs="Arial" w:eastAsia="Arial" w:hAnsi="Arial"/>
+          <w:b/>
+          <w:bCs/>
+          <w:color w:val="404040"/>
+          <w:sz w:val="20"/>
+          <w:szCs w:val="20"/>
+        </w:rPr>
+        <w:t xml:space="preserve">Grundprinzip: </w:t>
+      </w:r>
+      <w:r>
+        <w:rPr>
+          <w:rFonts w:ascii="Arial" w:cs="Arial" w:eastAsia="Arial" w:hAnsi="Arial"/>
+          <w:color w:val="404040"/>
+          <w:sz w:val="20"/>
+          <w:szCs w:val="20"/>
+        </w:rPr>
+        <w:t xml:space="preserve">immer Default Deny, explizit erlauben — eingehender Verkehr wird standardmässig verworfen, und nur was durch eine passende ALLOW-Regel abgedeckt ist, kommt durch.</w:t>
+      </w:r>
+    </w:p>
+    <w:p>
+      <w:pPr>
+        <w:spacing w:after="80"/>
+      </w:pPr>
+      <w:r>
+        <w:rPr>
+          <w:rFonts w:ascii="Arial" w:cs="Arial" w:eastAsia="Arial" w:hAnsi="Arial"/>
+          <w:color w:val="404040"/>
+          <w:sz w:val="20"/>
+          <w:szCs w:val="20"/>
+        </w:rPr>
+        <w:t xml:space="preserve">Jedes eingehende Paket durchläuft die Regelliste der Reihe nach — die erste passende Regel entscheidet. Ohne Treffer greift die Default-Policy (DENY): das Paket wird verworfen, ohne Antwort oder Reset.</w:t>
+      </w:r>
+    </w:p>
+    <w:p>
+      <w:pPr>
+        <w:pStyle w:val="Heading2"/>
+        <w:spacing w:after="80" w:before="240"/>
+      </w:pPr>
+      <w:r>
+        <w:rPr>
+          <w:rFonts w:ascii="Arial" w:cs="Arial" w:eastAsia="Arial" w:hAnsi="Arial"/>
+          <w:b/>
+          <w:bCs/>
+          <w:color w:val="1F5C99"/>
+          <w:sz w:val="22"/>
+          <w:szCs w:val="22"/>
+        </w:rPr>
+        <w:t xml:space="preserve">13.1 Installation</w:t>
+      </w:r>
+    </w:p>
+    <w:p>
+      <w:pPr>
+        <w:spacing w:after="80"/>
+      </w:pPr>
+      <w:r>
+        <w:rPr>
+          <w:rFonts w:ascii="Arial" w:cs="Arial" w:eastAsia="Arial" w:hAnsi="Arial"/>
+          <w:color w:val="404040"/>
+          <w:sz w:val="20"/>
+          <w:szCs w:val="20"/>
+        </w:rPr>
+        <w:t xml:space="preserve">Auf aktuellen Ubuntu-Server-Images ist UFW meist schon vorinstalliert, aber (noch) nicht aktiv. Prüfen und ggf. nachinstallieren:</w:t>
+      </w:r>
+    </w:p>
+    <w:p>
+      <w:pPr>
+        <w:shd w:fill="F0F0F0" w:val="clear"/>
+        <w:spacing w:after="80"/>
+        <w:ind w:left="360"/>
+      </w:pPr>
+      <w:r>
+        <w:rPr>
+          <w:rFonts w:ascii="Courier New" w:cs="Courier New" w:eastAsia="Courier New" w:hAnsi="Courier New"/>
+          <w:color w:val="1A1A1A"/>
+          <w:sz w:val="18"/>
+          <w:szCs w:val="18"/>
+        </w:rPr>
+        <w:t xml:space="preserve"># Version / Vorhandensein prüfen</w:t>
+      </w:r>
+    </w:p>
+    <w:p>
+      <w:pPr>
+        <w:shd w:fill="F0F0F0" w:val="clear"/>
+        <w:spacing w:after="80"/>
+        <w:ind w:left="360"/>
+      </w:pPr>
+      <w:r>
+        <w:rPr>
+          <w:rFonts w:ascii="Courier New" w:cs="Courier New" w:eastAsia="Courier New" w:hAnsi="Courier New"/>
+          <w:color w:val="1A1A1A"/>
+          <w:sz w:val="18"/>
+          <w:szCs w:val="18"/>
+        </w:rPr>
+        <w:t xml:space="preserve">sudo ufw version</w:t>
+      </w:r>
+    </w:p>
+    <w:p>
+      <w:pPr>
+        <w:shd w:fill="F0F0F0" w:val="clear"/>
+        <w:spacing w:after="80"/>
+        <w:ind w:left="360"/>
+      </w:pPr>
+      <w:r>
+        <w:rPr>
+          <w:rFonts w:ascii="Courier New" w:cs="Courier New" w:eastAsia="Courier New" w:hAnsi="Courier New"/>
+          <w:color w:val="1A1A1A"/>
+          <w:sz w:val="18"/>
+          <w:szCs w:val="18"/>
+        </w:rPr>
+        <w:t xml:space="preserve"># falls nicht vorhanden</w:t>
+      </w:r>
+    </w:p>
+    <w:p>
+      <w:pPr>
+        <w:shd w:fill="F0F0F0" w:val="clear"/>
+        <w:spacing w:after="80"/>
+        <w:ind w:left="360"/>
+      </w:pPr>
+      <w:r>
+        <w:rPr>
+          <w:rFonts w:ascii="Courier New" w:cs="Courier New" w:eastAsia="Courier New" w:hAnsi="Courier New"/>
+          <w:color w:val="1A1A1A"/>
+          <w:sz w:val="18"/>
+          <w:szCs w:val="18"/>
+        </w:rPr>
+        <w:t xml:space="preserve">sudo apt update</w:t>
+      </w:r>
+    </w:p>
+    <w:p>
+      <w:pPr>
+        <w:shd w:fill="F0F0F0" w:val="clear"/>
+        <w:spacing w:after="80"/>
+        <w:ind w:left="360"/>
+      </w:pPr>
+      <w:r>
+        <w:rPr>
+          <w:rFonts w:ascii="Courier New" w:cs="Courier New" w:eastAsia="Courier New" w:hAnsi="Courier New"/>
+          <w:color w:val="1A1A1A"/>
+          <w:sz w:val="18"/>
+          <w:szCs w:val="18"/>
+        </w:rPr>
+        <w:t xml:space="preserve">sudo apt install ufw -y</w:t>
+      </w:r>
+    </w:p>
+    <w:p>
+      <w:pPr>
+        <w:pStyle w:val="Heading2"/>
+        <w:spacing w:after="80" w:before="240"/>
+      </w:pPr>
+      <w:r>
+        <w:rPr>
+          <w:rFonts w:ascii="Arial" w:cs="Arial" w:eastAsia="Arial" w:hAnsi="Arial"/>
+          <w:b/>
+          <w:bCs/>
+          <w:color w:val="1F5C99"/>
+          <w:sz w:val="22"/>
+          <w:szCs w:val="22"/>
+        </w:rPr>
+        <w:t xml:space="preserve">13.2 Grundregeln festlegen</w:t>
+      </w:r>
+    </w:p>
+    <w:p>
+      <w:pPr>
+        <w:spacing w:after="80"/>
+      </w:pPr>
+      <w:r>
+        <w:rPr>
+          <w:rFonts w:ascii="Arial" w:cs="Arial" w:eastAsia="Arial" w:hAnsi="Arial"/>
+          <w:color w:val="404040"/>
+          <w:sz w:val="20"/>
+          <w:szCs w:val="20"/>
+        </w:rPr>
+        <w:t xml:space="preserve">Bevor irgendetwas erlaubt wird, die Default-Policies setzen — eingehend zu, ausgehend offen:</w:t>
+      </w:r>
+    </w:p>
+    <w:p>
+      <w:pPr>
+        <w:shd w:fill="F0F0F0" w:val="clear"/>
+        <w:spacing w:after="80"/>
+        <w:ind w:left="360"/>
+      </w:pPr>
+      <w:r>
+        <w:rPr>
+          <w:rFonts w:ascii="Courier New" w:cs="Courier New" w:eastAsia="Courier New" w:hAnsi="Courier New"/>
+          <w:color w:val="1A1A1A"/>
+          <w:sz w:val="18"/>
+          <w:szCs w:val="18"/>
+        </w:rPr>
+        <w:t xml:space="preserve">sudo ufw default deny incoming</w:t>
+      </w:r>
+    </w:p>
+    <w:p>
+      <w:pPr>
+        <w:shd w:fill="F0F0F0" w:val="clear"/>
+        <w:spacing w:after="80"/>
+        <w:ind w:left="360"/>
+      </w:pPr>
+      <w:r>
+        <w:rPr>
+          <w:rFonts w:ascii="Courier New" w:cs="Courier New" w:eastAsia="Courier New" w:hAnsi="Courier New"/>
+          <w:color w:val="1A1A1A"/>
+          <w:sz w:val="18"/>
+          <w:szCs w:val="18"/>
+        </w:rPr>
+        <w:t xml:space="preserve">sudo ufw default allow outgoing</w:t>
+      </w:r>
+    </w:p>
+    <w:p>
+      <w:pPr>
+        <w:spacing w:after="80"/>
+      </w:pPr>
+      <w:r>
+        <w:rPr>
+          <w:rFonts w:ascii="Arial" w:cs="Arial" w:eastAsia="Arial" w:hAnsi="Arial"/>
+          <w:color w:val="404040"/>
+          <w:sz w:val="20"/>
+          <w:szCs w:val="20"/>
+        </w:rPr>
+        <w:t xml:space="preserve">Diese Befehle ändern nur die Konfiguration, nicht den laufenden Zustand — UFW ist an dieser Stelle noch nicht aktiv (siehe 13.5 Aktivieren).</w:t>
+      </w:r>
+    </w:p>
+    <w:p>
+      <w:pPr>
+        <w:pStyle w:val="Heading2"/>
+        <w:spacing w:after="80" w:before="240"/>
+      </w:pPr>
+      <w:r>
+        <w:rPr>
+          <w:rFonts w:ascii="Arial" w:cs="Arial" w:eastAsia="Arial" w:hAnsi="Arial"/>
+          <w:b/>
+          <w:bCs/>
+          <w:color w:val="1F5C99"/>
+          <w:sz w:val="22"/>
+          <w:szCs w:val="22"/>
+        </w:rPr>
+        <w:t xml:space="preserve">13.3 Regeln setzen</w:t>
+      </w:r>
+    </w:p>
+    <w:p>
+      <w:pPr>
+        <w:spacing w:after="80"/>
+      </w:pPr>
+      <w:r>
+        <w:rPr>
+          <w:rFonts w:ascii="Arial" w:cs="Arial" w:eastAsia="Arial" w:hAnsi="Arial"/>
+          <w:color w:val="404040"/>
+          <w:sz w:val="20"/>
+          <w:szCs w:val="20"/>
+        </w:rPr>
+        <w:t xml:space="preserve">Regeln lassen sich nach Port, Protokoll, Quelle oder einer Kombination davon definieren. Ein Kommentar (comment) hilft, sich Monate später noch zu erinnern, wofür eine Regel gedacht war.</w:t>
+      </w:r>
+    </w:p>
+    <w:p>
+      <w:pPr>
+        <w:spacing w:after="80"/>
+      </w:pPr>
+      <w:r>
+        <w:rPr>
+          <w:rFonts w:ascii="Arial" w:cs="Arial" w:eastAsia="Arial" w:hAnsi="Arial"/>
+          <w:b/>
+          <w:bCs/>
+          <w:color w:val="404040"/>
+          <w:sz w:val="20"/>
+          <w:szCs w:val="20"/>
+        </w:rPr>
+        <w:t xml:space="preserve">Nach Port/Protokoll — für alle:</w:t>
+      </w:r>
+    </w:p>
+    <w:p>
+      <w:pPr>
+        <w:shd w:fill="F0F0F0" w:val="clear"/>
+        <w:spacing w:after="80"/>
+        <w:ind w:left="360"/>
+      </w:pPr>
+      <w:r>
+        <w:rPr>
+          <w:rFonts w:ascii="Courier New" w:cs="Courier New" w:eastAsia="Courier New" w:hAnsi="Courier New"/>
+          <w:color w:val="1A1A1A"/>
+          <w:sz w:val="18"/>
+          <w:szCs w:val="18"/>
+        </w:rPr>
+        <w:t xml:space="preserve">sudo ufw allow 22/tcp comment 'SSH'</w:t>
+      </w:r>
+    </w:p>
+    <w:p>
+      <w:pPr>
+        <w:shd w:fill="F0F0F0" w:val="clear"/>
+        <w:spacing w:after="80"/>
+        <w:ind w:left="360"/>
+      </w:pPr>
+      <w:r>
+        <w:rPr>
+          <w:rFonts w:ascii="Courier New" w:cs="Courier New" w:eastAsia="Courier New" w:hAnsi="Courier New"/>
+          <w:color w:val="1A1A1A"/>
+          <w:sz w:val="18"/>
+          <w:szCs w:val="18"/>
+        </w:rPr>
+        <w:t xml:space="preserve">sudo ufw allow 80/tcp comment 'HTTP'</w:t>
+      </w:r>
+    </w:p>
+    <w:p>
+      <w:pPr>
+        <w:shd w:fill="F0F0F0" w:val="clear"/>
+        <w:spacing w:after="80"/>
+        <w:ind w:left="360"/>
+      </w:pPr>
+      <w:r>
+        <w:rPr>
+          <w:rFonts w:ascii="Courier New" w:cs="Courier New" w:eastAsia="Courier New" w:hAnsi="Courier New"/>
+          <w:color w:val="1A1A1A"/>
+          <w:sz w:val="18"/>
+          <w:szCs w:val="18"/>
+        </w:rPr>
+        <w:t xml:space="preserve">sudo ufw allow 443/tcp comment 'HTTPS'</w:t>
+      </w:r>
+    </w:p>
+    <w:p>
+      <w:pPr>
+        <w:spacing w:after="80"/>
+      </w:pPr>
+      <w:r>
+        <w:rPr>
+          <w:rFonts w:ascii="Arial" w:cs="Arial" w:eastAsia="Arial" w:hAnsi="Arial"/>
+          <w:b/>
+          <w:bCs/>
+          <w:color w:val="404040"/>
+          <w:sz w:val="20"/>
+          <w:szCs w:val="20"/>
+        </w:rPr>
+        <w:t xml:space="preserve">Nach Quell-IP — nur für einen bestimmten Client:</w:t>
+      </w:r>
+    </w:p>
+    <w:p>
+      <w:pPr>
+        <w:shd w:fill="F0F0F0" w:val="clear"/>
+        <w:spacing w:after="80"/>
+        <w:ind w:left="360"/>
+      </w:pPr>
+      <w:r>
+        <w:rPr>
+          <w:rFonts w:ascii="Courier New" w:cs="Courier New" w:eastAsia="Courier New" w:hAnsi="Courier New"/>
+          <w:color w:val="1A1A1A"/>
+          <w:sz w:val="18"/>
+          <w:szCs w:val="18"/>
+        </w:rPr>
+        <w:t xml:space="preserve">sudo ufw allow from 203.0.113.10 to any port 5432 proto tcp comment 'Postgres-Client Büro'</w:t>
+      </w:r>
+    </w:p>
+    <w:p>
+      <w:pPr>
+        <w:spacing w:after="80"/>
+      </w:pPr>
+      <w:r>
+        <w:rPr>
+          <w:rFonts w:ascii="Arial" w:cs="Arial" w:eastAsia="Arial" w:hAnsi="Arial"/>
+          <w:color w:val="404040"/>
+          <w:sz w:val="20"/>
+          <w:szCs w:val="20"/>
+        </w:rPr>
+        <w:t xml:space="preserve">Diese Regel öffnet ausschliesslich 203.0.113.10 den Zugriff auf Port 5432 — alle anderen Quellen bleiben durch die Default-Policy blockiert.</w:t>
+      </w:r>
+    </w:p>
+    <w:p>
+      <w:pPr>
+        <w:spacing w:after="80"/>
+      </w:pPr>
+      <w:r>
+        <w:rPr>
+          <w:rFonts w:ascii="Arial" w:cs="Arial" w:eastAsia="Arial" w:hAnsi="Arial"/>
+          <w:b/>
+          <w:bCs/>
+          <w:color w:val="404040"/>
+          <w:sz w:val="20"/>
+          <w:szCs w:val="20"/>
+        </w:rPr>
+        <w:t xml:space="preserve">Ganzes Subnetz statt Einzel-IP:</w:t>
+      </w:r>
+    </w:p>
+    <w:p>
+      <w:pPr>
+        <w:shd w:fill="F0F0F0" w:val="clear"/>
+        <w:spacing w:after="80"/>
+        <w:ind w:left="360"/>
+      </w:pPr>
+      <w:r>
+        <w:rPr>
+          <w:rFonts w:ascii="Courier New" w:cs="Courier New" w:eastAsia="Courier New" w:hAnsi="Courier New"/>
+          <w:color w:val="1A1A1A"/>
+          <w:sz w:val="18"/>
+          <w:szCs w:val="18"/>
+        </w:rPr>
+        <w:t xml:space="preserve">sudo ufw allow from 203.0.113.0/24 to any port 5432 proto tcp</w:t>
+      </w:r>
+    </w:p>
+    <w:p>
+      <w:pPr>
+        <w:spacing w:after="80"/>
+      </w:pPr>
+      <w:r>
+        <w:rPr>
+          <w:rFonts w:ascii="Arial" w:cs="Arial" w:eastAsia="Arial" w:hAnsi="Arial"/>
+          <w:b/>
+          <w:bCs/>
+          <w:color w:val="1F5C99"/>
+          <w:sz w:val="20"/>
+          <w:szCs w:val="20"/>
+        </w:rPr>
+        <w:t xml:space="preserve">Tipp: </w:t>
+      </w:r>
+      <w:r>
+        <w:rPr>
+          <w:rFonts w:ascii="Arial" w:cs="Arial" w:eastAsia="Arial" w:hAnsi="Arial"/>
+          <w:color w:val="404040"/>
+          <w:sz w:val="20"/>
+          <w:szCs w:val="20"/>
+        </w:rPr>
+        <w:t xml:space="preserve">Bei dynamischer IP-Vergabe (z. B. Heimanschluss ohne feste IP) lieber grosszügiger fassen (Subnetz statt Einzel-IP) oder den Dienst stattdessen nur per SSH-Tunnel erreichbar machen — sonst muss die Regel bei jedem IP-Wechsel des Providers nachgezogen werden.</w:t>
+      </w:r>
+    </w:p>
+    <w:p>
+      <w:pPr>
+        <w:spacing w:after="80"/>
+      </w:pPr>
+      <w:r>
+        <w:rPr>
+          <w:rFonts w:ascii="Arial" w:cs="Arial" w:eastAsia="Arial" w:hAnsi="Arial"/>
+          <w:color w:val="404040"/>
+          <w:sz w:val="20"/>
+          <w:szCs w:val="20"/>
+        </w:rPr>
+        <w:t xml:space="preserve">So sieht ein typisches Regel-Set danach aus (Ausgabe von ufw status verbose):</w:t>
+      </w:r>
+    </w:p>
+    <w:tbl>
+      <w:tblPr>
+        <w:tblW w:type="dxa" w:w="9746"/>
+        <w:tblBorders>
+          <w:top w:val="single" w:color="auto" w:sz="4"/>
+          <w:left w:val="single" w:color="auto" w:sz="4"/>
+          <w:bottom w:val="single" w:color="auto" w:sz="4"/>
+          <w:right w:val="single" w:color="auto" w:sz="4"/>
+          <w:insideH w:val="single" w:color="auto" w:sz="4"/>
+          <w:insideV w:val="single" w:color="auto" w:sz="4"/>
+        </w:tblBorders>
+      </w:tblPr>
+      <w:tblGrid>
+        <w:gridCol w:w="1800"/>
+        <w:gridCol w:w="1800"/>
+        <w:gridCol w:w="3146"/>
+        <w:gridCol w:w="3000"/>
+      </w:tblGrid>
+      <w:tr>
+        <w:trPr>
+          <w:tblHeader/>
+        </w:trPr>
+        <w:tc>
+          <w:tcPr>
+            <w:tcW w:type="dxa" w:w="1800"/>
+            <w:shd w:fill="1F5C99" w:val="clear"/>
+            <w:tcMar>
+              <w:top w:type="dxa" w:w="80"/>
+              <w:left w:type="dxa" w:w="120"/>
+              <w:bottom w:type="dxa" w:w="80"/>
+              <w:right w:type="dxa" w:w="120"/>
+            </w:tcMar>
+          </w:tcPr>
+          <w:p>
+            <w:r>
+              <w:rPr>
+                <w:rFonts w:ascii="Arial" w:cs="Arial" w:eastAsia="Arial" w:hAnsi="Arial"/>
+                <w:b/>
+                <w:bCs/>
+                <w:color w:val="FFFFFF"/>
+                <w:sz w:val="18"/>
+                <w:szCs w:val="18"/>
+              </w:rPr>
+              <w:t xml:space="preserve">Aktion</w:t>
+            </w:r>
+          </w:p>
+        </w:tc>
+        <w:tc>
+          <w:tcPr>
+            <w:tcW w:type="dxa" w:w="1800"/>
+            <w:shd w:fill="1F5C99" w:val="clear"/>
+            <w:tcMar>
+              <w:top w:type="dxa" w:w="80"/>
+              <w:left w:type="dxa" w:w="120"/>
+              <w:bottom w:type="dxa" w:w="80"/>
+              <w:right w:type="dxa" w:w="120"/>
+            </w:tcMar>
+          </w:tcPr>
+          <w:p>
+            <w:r>
+              <w:rPr>
+                <w:rFonts w:ascii="Arial" w:cs="Arial" w:eastAsia="Arial" w:hAnsi="Arial"/>
+                <w:b/>
+                <w:bCs/>
+                <w:color w:val="FFFFFF"/>
+                <w:sz w:val="18"/>
+                <w:szCs w:val="18"/>
+              </w:rPr>
+              <w:t xml:space="preserve">Port</w:t>
+            </w:r>
+          </w:p>
+        </w:tc>
+        <w:tc>
+          <w:tcPr>
+            <w:tcW w:type="dxa" w:w="3146"/>
+            <w:shd w:fill="1F5C99" w:val="clear"/>
+            <w:tcMar>
+              <w:top w:type="dxa" w:w="80"/>
+              <w:left w:type="dxa" w:w="120"/>
+              <w:bottom w:type="dxa" w:w="80"/>
+              <w:right w:type="dxa" w:w="120"/>
+            </w:tcMar>
+          </w:tcPr>
+          <w:p>
+            <w:r>
+              <w:rPr>
+                <w:rFonts w:ascii="Arial" w:cs="Arial" w:eastAsia="Arial" w:hAnsi="Arial"/>
+                <w:b/>
+                <w:bCs/>
+                <w:color w:val="FFFFFF"/>
+                <w:sz w:val="18"/>
+                <w:szCs w:val="18"/>
+              </w:rPr>
+              <w:t xml:space="preserve">Quelle</w:t>
+            </w:r>
+          </w:p>
+        </w:tc>
+        <w:tc>
+          <w:tcPr>
+            <w:tcW w:type="dxa" w:w="3000"/>
+            <w:shd w:fill="1F5C99" w:val="clear"/>
+            <w:tcMar>
+              <w:top w:type="dxa" w:w="80"/>
+              <w:left w:type="dxa" w:w="120"/>
+              <w:bottom w:type="dxa" w:w="80"/>
+              <w:right w:type="dxa" w:w="120"/>
+            </w:tcMar>
+          </w:tcPr>
+          <w:p>
+            <w:r>
+              <w:rPr>
+                <w:rFonts w:ascii="Arial" w:cs="Arial" w:eastAsia="Arial" w:hAnsi="Arial"/>
+                <w:b/>
+                <w:bCs/>
+                <w:color w:val="FFFFFF"/>
+                <w:sz w:val="18"/>
+                <w:szCs w:val="18"/>
+              </w:rPr>
+              <w:t xml:space="preserve">Kommentar</w:t>
+            </w:r>
+          </w:p>
+        </w:tc>
+      </w:tr>
+      <w:tr>
+        <w:tc>
+          <w:tcPr>
+            <w:tcW w:type="dxa" w:w="1800"/>
+            <w:shd w:fill="EBF3FB" w:val="clear"/>
+            <w:tcMar>
+              <w:top w:type="dxa" w:w="80"/>
+              <w:left w:type="dxa" w:w="120"/>
+              <w:bottom w:type="dxa" w:w="80"/>
+              <w:right w:type="dxa" w:w="120"/>
+            </w:tcMar>
+          </w:tcPr>
+          <w:p>
+            <w:r>
+              <w:rPr>
+                <w:rFonts w:ascii="Arial" w:cs="Arial" w:eastAsia="Arial" w:hAnsi="Arial"/>
+                <w:color w:val="404040"/>
+                <w:sz w:val="18"/>
+                <w:szCs w:val="18"/>
+              </w:rPr>
+              <w:t xml:space="preserve">ALLOW</w:t>
+            </w:r>
+          </w:p>
+        </w:tc>
+        <w:tc>
+          <w:tcPr>
+            <w:tcW w:type="dxa" w:w="1800"/>
+            <w:shd w:fill="EBF3FB" w:val="clear"/>
+            <w:tcMar>
+              <w:top w:type="dxa" w:w="80"/>
+              <w:left w:type="dxa" w:w="120"/>
+              <w:bottom w:type="dxa" w:w="80"/>
+              <w:right w:type="dxa" w:w="120"/>
+            </w:tcMar>
+          </w:tcPr>
+          <w:p>
+            <w:r>
+              <w:rPr>
+                <w:rFonts w:ascii="Arial" w:cs="Arial" w:eastAsia="Arial" w:hAnsi="Arial"/>
+                <w:color w:val="404040"/>
+                <w:sz w:val="18"/>
+                <w:szCs w:val="18"/>
+              </w:rPr>
+              <w:t xml:space="preserve">22/tcp</w:t>
+            </w:r>
+          </w:p>
+        </w:tc>
+        <w:tc>
+          <w:tcPr>
+            <w:tcW w:type="dxa" w:w="3146"/>
+            <w:shd w:fill="EBF3FB" w:val="clear"/>
+            <w:tcMar>
+              <w:top w:type="dxa" w:w="80"/>
+              <w:left w:type="dxa" w:w="120"/>
+              <w:bottom w:type="dxa" w:w="80"/>
+              <w:right w:type="dxa" w:w="120"/>
+            </w:tcMar>
+          </w:tcPr>
+          <w:p>
+            <w:r>
+              <w:rPr>
+                <w:rFonts w:ascii="Arial" w:cs="Arial" w:eastAsia="Arial" w:hAnsi="Arial"/>
+                <w:color w:val="404040"/>
+                <w:sz w:val="18"/>
+                <w:szCs w:val="18"/>
+              </w:rPr>
+              <w:t xml:space="preserve">von überall</w:t>
+            </w:r>
+          </w:p>
+        </w:tc>
+        <w:tc>
+          <w:tcPr>
+            <w:tcW w:type="dxa" w:w="3000"/>
+            <w:shd w:fill="EBF3FB" w:val="clear"/>
+            <w:tcMar>
+              <w:top w:type="dxa" w:w="80"/>
+              <w:left w:type="dxa" w:w="120"/>
+              <w:bottom w:type="dxa" w:w="80"/>
+              <w:right w:type="dxa" w:w="120"/>
+            </w:tcMar>
+          </w:tcPr>
+          <w:p>
+            <w:r>
+              <w:rPr>
+                <w:rFonts w:ascii="Arial" w:cs="Arial" w:eastAsia="Arial" w:hAnsi="Arial"/>
+                <w:color w:val="404040"/>
+                <w:sz w:val="18"/>
+                <w:szCs w:val="18"/>
+              </w:rPr>
+              <w:t xml:space="preserve">SSH</w:t>
+            </w:r>
+          </w:p>
+        </w:tc>
+      </w:tr>
+      <w:tr>
+        <w:tc>
+          <w:tcPr>
+            <w:tcW w:type="dxa" w:w="1800"/>
+            <w:tcMar>
+              <w:top w:type="dxa" w:w="80"/>
+              <w:left w:type="dxa" w:w="120"/>
+              <w:bottom w:type="dxa" w:w="80"/>
+              <w:right w:type="dxa" w:w="120"/>
+            </w:tcMar>
+          </w:tcPr>
+          <w:p>
+            <w:r>
+              <w:rPr>
+                <w:rFonts w:ascii="Arial" w:cs="Arial" w:eastAsia="Arial" w:hAnsi="Arial"/>
+                <w:color w:val="404040"/>
+                <w:sz w:val="18"/>
+                <w:szCs w:val="18"/>
+              </w:rPr>
+              <w:t xml:space="preserve">ALLOW</w:t>
+            </w:r>
+          </w:p>
+        </w:tc>
+        <w:tc>
+          <w:tcPr>
+            <w:tcW w:type="dxa" w:w="1800"/>
+            <w:tcMar>
+              <w:top w:type="dxa" w:w="80"/>
+              <w:left w:type="dxa" w:w="120"/>
+              <w:bottom w:type="dxa" w:w="80"/>
+              <w:right w:type="dxa" w:w="120"/>
+            </w:tcMar>
+          </w:tcPr>
+          <w:p>
+            <w:r>
+              <w:rPr>
+                <w:rFonts w:ascii="Arial" w:cs="Arial" w:eastAsia="Arial" w:hAnsi="Arial"/>
+                <w:color w:val="404040"/>
+                <w:sz w:val="18"/>
+                <w:szCs w:val="18"/>
+              </w:rPr>
+              <w:t xml:space="preserve">80/tcp</w:t>
+            </w:r>
+          </w:p>
+        </w:tc>
+        <w:tc>
+          <w:tcPr>
+            <w:tcW w:type="dxa" w:w="3146"/>
+            <w:tcMar>
+              <w:top w:type="dxa" w:w="80"/>
+              <w:left w:type="dxa" w:w="120"/>
+              <w:bottom w:type="dxa" w:w="80"/>
+              <w:right w:type="dxa" w:w="120"/>
+            </w:tcMar>
+          </w:tcPr>
+          <w:p>
+            <w:r>
+              <w:rPr>
+                <w:rFonts w:ascii="Arial" w:cs="Arial" w:eastAsia="Arial" w:hAnsi="Arial"/>
+                <w:color w:val="404040"/>
+                <w:sz w:val="18"/>
+                <w:szCs w:val="18"/>
+              </w:rPr>
+              <w:t xml:space="preserve">von überall</w:t>
+            </w:r>
+          </w:p>
+        </w:tc>
+        <w:tc>
+          <w:tcPr>
+            <w:tcW w:type="dxa" w:w="3000"/>
+            <w:tcMar>
+              <w:top w:type="dxa" w:w="80"/>
+              <w:left w:type="dxa" w:w="120"/>
+              <w:bottom w:type="dxa" w:w="80"/>
+              <w:right w:type="dxa" w:w="120"/>
+            </w:tcMar>
+          </w:tcPr>
+          <w:p>
+            <w:r>
+              <w:rPr>
+                <w:rFonts w:ascii="Arial" w:cs="Arial" w:eastAsia="Arial" w:hAnsi="Arial"/>
+                <w:color w:val="404040"/>
+                <w:sz w:val="18"/>
+                <w:szCs w:val="18"/>
+              </w:rPr>
+              <w:t xml:space="preserve">HTTP</w:t>
+            </w:r>
+          </w:p>
+        </w:tc>
+      </w:tr>
+      <w:tr>
+        <w:tc>
+          <w:tcPr>
+            <w:tcW w:type="dxa" w:w="1800"/>
+            <w:shd w:fill="EBF3FB" w:val="clear"/>
+            <w:tcMar>
+              <w:top w:type="dxa" w:w="80"/>
+              <w:left w:type="dxa" w:w="120"/>
+              <w:bottom w:type="dxa" w:w="80"/>
+              <w:right w:type="dxa" w:w="120"/>
+            </w:tcMar>
+          </w:tcPr>
+          <w:p>
+            <w:r>
+              <w:rPr>
+                <w:rFonts w:ascii="Arial" w:cs="Arial" w:eastAsia="Arial" w:hAnsi="Arial"/>
+                <w:color w:val="404040"/>
+                <w:sz w:val="18"/>
+                <w:szCs w:val="18"/>
+              </w:rPr>
+              <w:t xml:space="preserve">ALLOW</w:t>
+            </w:r>
+          </w:p>
+        </w:tc>
+        <w:tc>
+          <w:tcPr>
+            <w:tcW w:type="dxa" w:w="1800"/>
+            <w:shd w:fill="EBF3FB" w:val="clear"/>
+            <w:tcMar>
+              <w:top w:type="dxa" w:w="80"/>
+              <w:left w:type="dxa" w:w="120"/>
+              <w:bottom w:type="dxa" w:w="80"/>
+              <w:right w:type="dxa" w:w="120"/>
+            </w:tcMar>
+          </w:tcPr>
+          <w:p>
+            <w:r>
+              <w:rPr>
+                <w:rFonts w:ascii="Arial" w:cs="Arial" w:eastAsia="Arial" w:hAnsi="Arial"/>
+                <w:color w:val="404040"/>
+                <w:sz w:val="18"/>
+                <w:szCs w:val="18"/>
+              </w:rPr>
+              <w:t xml:space="preserve">443/tcp</w:t>
+            </w:r>
+          </w:p>
+        </w:tc>
+        <w:tc>
+          <w:tcPr>
+            <w:tcW w:type="dxa" w:w="3146"/>
+            <w:shd w:fill="EBF3FB" w:val="clear"/>
+            <w:tcMar>
+              <w:top w:type="dxa" w:w="80"/>
+              <w:left w:type="dxa" w:w="120"/>
+              <w:bottom w:type="dxa" w:w="80"/>
+              <w:right w:type="dxa" w:w="120"/>
+            </w:tcMar>
+          </w:tcPr>
+          <w:p>
+            <w:r>
+              <w:rPr>
+                <w:rFonts w:ascii="Arial" w:cs="Arial" w:eastAsia="Arial" w:hAnsi="Arial"/>
+                <w:color w:val="404040"/>
+                <w:sz w:val="18"/>
+                <w:szCs w:val="18"/>
+              </w:rPr>
+              <w:t xml:space="preserve">von überall</w:t>
+            </w:r>
+          </w:p>
+        </w:tc>
+        <w:tc>
+          <w:tcPr>
+            <w:tcW w:type="dxa" w:w="3000"/>
+            <w:shd w:fill="EBF3FB" w:val="clear"/>
+            <w:tcMar>
+              <w:top w:type="dxa" w:w="80"/>
+              <w:left w:type="dxa" w:w="120"/>
+              <w:bottom w:type="dxa" w:w="80"/>
+              <w:right w:type="dxa" w:w="120"/>
+            </w:tcMar>
+          </w:tcPr>
+          <w:p>
+            <w:r>
+              <w:rPr>
+                <w:rFonts w:ascii="Arial" w:cs="Arial" w:eastAsia="Arial" w:hAnsi="Arial"/>
+                <w:color w:val="404040"/>
+                <w:sz w:val="18"/>
+                <w:szCs w:val="18"/>
+              </w:rPr>
+              <w:t xml:space="preserve">HTTPS</w:t>
+            </w:r>
+          </w:p>
+        </w:tc>
+      </w:tr>
+      <w:tr>
+        <w:tc>
+          <w:tcPr>
+            <w:tcW w:type="dxa" w:w="1800"/>
+            <w:tcMar>
+              <w:top w:type="dxa" w:w="80"/>
+              <w:left w:type="dxa" w:w="120"/>
+              <w:bottom w:type="dxa" w:w="80"/>
+              <w:right w:type="dxa" w:w="120"/>
+            </w:tcMar>
+          </w:tcPr>
+          <w:p>
+            <w:r>
+              <w:rPr>
+                <w:rFonts w:ascii="Arial" w:cs="Arial" w:eastAsia="Arial" w:hAnsi="Arial"/>
+                <w:color w:val="404040"/>
+                <w:sz w:val="18"/>
+                <w:szCs w:val="18"/>
+              </w:rPr>
+              <w:t xml:space="preserve">ALLOW</w:t>
+            </w:r>
+          </w:p>
+        </w:tc>
+        <w:tc>
+          <w:tcPr>
+            <w:tcW w:type="dxa" w:w="1800"/>
+            <w:tcMar>
+              <w:top w:type="dxa" w:w="80"/>
+              <w:left w:type="dxa" w:w="120"/>
+              <w:bottom w:type="dxa" w:w="80"/>
+              <w:right w:type="dxa" w:w="120"/>
+            </w:tcMar>
+          </w:tcPr>
+          <w:p>
+            <w:r>
+              <w:rPr>
+                <w:rFonts w:ascii="Arial" w:cs="Arial" w:eastAsia="Arial" w:hAnsi="Arial"/>
+                <w:color w:val="404040"/>
+                <w:sz w:val="18"/>
+                <w:szCs w:val="18"/>
+              </w:rPr>
+              <w:t xml:space="preserve">5432/tcp</w:t>
+            </w:r>
+          </w:p>
+        </w:tc>
+        <w:tc>
+          <w:tcPr>
+            <w:tcW w:type="dxa" w:w="3146"/>
+            <w:tcMar>
+              <w:top w:type="dxa" w:w="80"/>
+              <w:left w:type="dxa" w:w="120"/>
+              <w:bottom w:type="dxa" w:w="80"/>
+              <w:right w:type="dxa" w:w="120"/>
+            </w:tcMar>
+          </w:tcPr>
+          <w:p>
+            <w:r>
+              <w:rPr>
+                <w:rFonts w:ascii="Arial" w:cs="Arial" w:eastAsia="Arial" w:hAnsi="Arial"/>
+                <w:color w:val="404040"/>
+                <w:sz w:val="18"/>
+                <w:szCs w:val="18"/>
+              </w:rPr>
+              <w:t xml:space="preserve">nur von 203.0.113.10</w:t>
+            </w:r>
+          </w:p>
+        </w:tc>
+        <w:tc>
+          <w:tcPr>
+            <w:tcW w:type="dxa" w:w="3000"/>
+            <w:tcMar>
+              <w:top w:type="dxa" w:w="80"/>
+              <w:left w:type="dxa" w:w="120"/>
+              <w:bottom w:type="dxa" w:w="80"/>
+              <w:right w:type="dxa" w:w="120"/>
+            </w:tcMar>
+          </w:tcPr>
+          <w:p>
+            <w:r>
+              <w:rPr>
+                <w:rFonts w:ascii="Arial" w:cs="Arial" w:eastAsia="Arial" w:hAnsi="Arial"/>
+                <w:color w:val="404040"/>
+                <w:sz w:val="18"/>
+                <w:szCs w:val="18"/>
+              </w:rPr>
+              <w:t xml:space="preserve">—</w:t>
+            </w:r>
+          </w:p>
+        </w:tc>
+      </w:tr>
+      <w:tr>
+        <w:tc>
+          <w:tcPr>
+            <w:tcW w:type="dxa" w:w="1800"/>
+            <w:shd w:fill="EBF3FB" w:val="clear"/>
+            <w:tcMar>
+              <w:top w:type="dxa" w:w="80"/>
+              <w:left w:type="dxa" w:w="120"/>
+              <w:bottom w:type="dxa" w:w="80"/>
+              <w:right w:type="dxa" w:w="120"/>
+            </w:tcMar>
+          </w:tcPr>
+          <w:p>
+            <w:r>
+              <w:rPr>
+                <w:rFonts w:ascii="Arial" w:cs="Arial" w:eastAsia="Arial" w:hAnsi="Arial"/>
+                <w:color w:val="404040"/>
+                <w:sz w:val="18"/>
+                <w:szCs w:val="18"/>
+              </w:rPr>
+              <w:t xml:space="preserve">DENY</w:t>
+            </w:r>
+          </w:p>
+        </w:tc>
+        <w:tc>
+          <w:tcPr>
+            <w:tcW w:type="dxa" w:w="1800"/>
+            <w:shd w:fill="EBF3FB" w:val="clear"/>
+            <w:tcMar>
+              <w:top w:type="dxa" w:w="80"/>
+              <w:left w:type="dxa" w:w="120"/>
+              <w:bottom w:type="dxa" w:w="80"/>
+              <w:right w:type="dxa" w:w="120"/>
+            </w:tcMar>
+          </w:tcPr>
+          <w:p>
+            <w:r>
+              <w:rPr>
+                <w:rFonts w:ascii="Arial" w:cs="Arial" w:eastAsia="Arial" w:hAnsi="Arial"/>
+                <w:color w:val="404040"/>
+                <w:sz w:val="18"/>
+                <w:szCs w:val="18"/>
+              </w:rPr>
+              <w:t xml:space="preserve">alles andere</w:t>
+            </w:r>
+          </w:p>
+        </w:tc>
+        <w:tc>
+          <w:tcPr>
+            <w:tcW w:type="dxa" w:w="3146"/>
+            <w:shd w:fill="EBF3FB" w:val="clear"/>
+            <w:tcMar>
+              <w:top w:type="dxa" w:w="80"/>
+              <w:left w:type="dxa" w:w="120"/>
+              <w:bottom w:type="dxa" w:w="80"/>
+              <w:right w:type="dxa" w:w="120"/>
+            </w:tcMar>
+          </w:tcPr>
+          <w:p>
+            <w:r>
+              <w:rPr>
+                <w:rFonts w:ascii="Arial" w:cs="Arial" w:eastAsia="Arial" w:hAnsi="Arial"/>
+                <w:color w:val="404040"/>
+                <w:sz w:val="18"/>
+                <w:szCs w:val="18"/>
+              </w:rPr>
+              <w:t xml:space="preserve">—</w:t>
+            </w:r>
+          </w:p>
+        </w:tc>
+        <w:tc>
+          <w:tcPr>
+            <w:tcW w:type="dxa" w:w="3000"/>
+            <w:shd w:fill="EBF3FB" w:val="clear"/>
+            <w:tcMar>
+              <w:top w:type="dxa" w:w="80"/>
+              <w:left w:type="dxa" w:w="120"/>
+              <w:bottom w:type="dxa" w:w="80"/>
+              <w:right w:type="dxa" w:w="120"/>
+            </w:tcMar>
+          </w:tcPr>
+          <w:p>
+            <w:r>
+              <w:rPr>
+                <w:rFonts w:ascii="Arial" w:cs="Arial" w:eastAsia="Arial" w:hAnsi="Arial"/>
+                <w:color w:val="404040"/>
+                <w:sz w:val="18"/>
+                <w:szCs w:val="18"/>
+              </w:rPr>
+              <w:t xml:space="preserve">Default-Policy</w:t>
+            </w:r>
+          </w:p>
+        </w:tc>
+      </w:tr>
+    </w:tbl>
+    <w:p>
+      <w:pPr>
+        <w:spacing w:after="80"/>
+      </w:pPr>
+      <w:r>
+        <w:rPr>
+          <w:rFonts w:ascii="Arial" w:cs="Arial" w:eastAsia="Arial" w:hAnsi="Arial"/>
+          <w:color w:val="404040"/>
+          <w:sz w:val="20"/>
+          <w:szCs w:val="20"/>
+        </w:rPr>
+        <w:t xml:space="preserve">Regeln vorbereiten, ohne sie sofort zu aktivieren:</w:t>
+      </w:r>
+    </w:p>
+    <w:p>
+      <w:pPr>
+        <w:shd w:fill="F0F0F0" w:val="clear"/>
+        <w:spacing w:after="80"/>
+        <w:ind w:left="360"/>
+      </w:pPr>
+      <w:r>
+        <w:rPr>
+          <w:rFonts w:ascii="Courier New" w:cs="Courier New" w:eastAsia="Courier New" w:hAnsi="Courier New"/>
+          <w:color w:val="1A1A1A"/>
+          <w:sz w:val="18"/>
+          <w:szCs w:val="18"/>
+        </w:rPr>
+        <w:t xml:space="preserve">sudo ufw show added</w:t>
+      </w:r>
+    </w:p>
+    <w:p>
+      <w:pPr>
+        <w:spacing w:after="80"/>
+      </w:pPr>
+      <w:r>
+        <w:rPr>
+          <w:rFonts w:ascii="Arial" w:cs="Arial" w:eastAsia="Arial" w:hAnsi="Arial"/>
+          <w:color w:val="404040"/>
+          <w:sz w:val="20"/>
+          <w:szCs w:val="20"/>
+        </w:rPr>
+        <w:t xml:space="preserve">Zeigt alle bisher hinzugefügten Regeln, ohne dass UFW selbst schon läuft — praktisch, um die komplette Liste einmal gegenzuprüfen, bevor man aktiviert.</w:t>
+      </w:r>
+    </w:p>
+    <w:p>
+      <w:pPr>
+        <w:pStyle w:val="Heading2"/>
+        <w:spacing w:after="80" w:before="240"/>
+      </w:pPr>
+      <w:r>
+        <w:rPr>
+          <w:rFonts w:ascii="Arial" w:cs="Arial" w:eastAsia="Arial" w:hAnsi="Arial"/>
+          <w:b/>
+          <w:bCs/>
+          <w:color w:val="1F5C99"/>
+          <w:sz w:val="22"/>
+          <w:szCs w:val="22"/>
+        </w:rPr>
+        <w:t xml:space="preserve">13.4 IPv6</w:t>
+      </w:r>
+    </w:p>
+    <w:p>
+      <w:pPr>
+        <w:spacing w:after="80"/>
+      </w:pPr>
+      <w:r>
+        <w:rPr>
+          <w:rFonts w:ascii="Arial" w:cs="Arial" w:eastAsia="Arial" w:hAnsi="Arial"/>
+          <w:color w:val="404040"/>
+          <w:sz w:val="20"/>
+          <w:szCs w:val="20"/>
+        </w:rPr>
+        <w:t xml:space="preserve">UFW verwaltet IPv6 automatisch mit, solange IPV6=yes in /etc/default/ufw steht (Standard auf Ubuntu). Jede Portregel wird dann zusätzlich als (v6)-Variante angelegt — sichtbar in ufw status verbose. Eine IP-spezifische Regel wie allow from 203.0.113.10 gilt dagegen nur für die genannte Adressfamilie.</w:t>
+      </w:r>
+    </w:p>
+    <w:p>
+      <w:pPr>
+        <w:pStyle w:val="Heading2"/>
+        <w:spacing w:after="80" w:before="240"/>
+      </w:pPr>
+      <w:r>
+        <w:rPr>
+          <w:rFonts w:ascii="Arial" w:cs="Arial" w:eastAsia="Arial" w:hAnsi="Arial"/>
+          <w:b/>
+          <w:bCs/>
+          <w:color w:val="1F5C99"/>
+          <w:sz w:val="22"/>
+          <w:szCs w:val="22"/>
+        </w:rPr>
+        <w:t xml:space="preserve">13.5 Aktivieren</w:t>
+      </w:r>
+    </w:p>
+    <w:p>
+      <w:pPr>
+        <w:spacing w:after="80"/>
+      </w:pPr>
+      <w:r>
+        <w:rPr>
+          <w:rFonts w:ascii="Arial" w:cs="Arial" w:eastAsia="Arial" w:hAnsi="Arial"/>
+          <w:b/>
+          <w:bCs/>
+          <w:color w:val="CC0000"/>
+          <w:sz w:val="20"/>
+          <w:szCs w:val="20"/>
+        </w:rPr>
+        <w:t xml:space="preserve">Achtung: </w:t>
+      </w:r>
+      <w:r>
+        <w:rPr>
+          <w:rFonts w:ascii="Arial" w:cs="Arial" w:eastAsia="Arial" w:hAnsi="Arial"/>
+          <w:color w:val="404040"/>
+          <w:sz w:val="20"/>
+          <w:szCs w:val="20"/>
+        </w:rPr>
+        <w:t xml:space="preserve">Auf einem Remote-Server ist das der Schritt, bei dem man sich versehentlich aussperren kann — wenn die SSH-Regel fehlt oder falsch ist, ist die Verbindung sofort weg und es gibt keine zweite Chance über dieselbe Session.</w:t>
+      </w:r>
+    </w:p>
+    <w:p>
+      <w:pPr>
+        <w:shd w:fill="F0F0F0" w:val="clear"/>
+        <w:spacing w:after="80"/>
+        <w:ind w:left="360"/>
+      </w:pPr>
+      <w:r>
+        <w:rPr>
+          <w:rFonts w:ascii="Courier New" w:cs="Courier New" w:eastAsia="Courier New" w:hAnsi="Courier New"/>
+          <w:color w:val="1A1A1A"/>
+          <w:sz w:val="18"/>
+          <w:szCs w:val="18"/>
+        </w:rPr>
+        <w:t xml:space="preserve">sudo ufw enable</w:t>
+      </w:r>
+    </w:p>
+    <w:p>
+      <w:pPr>
+        <w:shd w:fill="F0F0F0" w:val="clear"/>
+        <w:spacing w:after="80"/>
+        <w:ind w:left="360"/>
+      </w:pPr>
+      <w:r>
+        <w:rPr>
+          <w:rFonts w:ascii="Courier New" w:cs="Courier New" w:eastAsia="Courier New" w:hAnsi="Courier New"/>
+          <w:color w:val="1A1A1A"/>
+          <w:sz w:val="18"/>
+          <w:szCs w:val="18"/>
+        </w:rPr>
+        <w:t xml:space="preserve">sudo ufw status verbose</w:t>
+      </w:r>
+    </w:p>
+    <w:p>
+      <w:pPr>
+        <w:spacing w:after="80"/>
+      </w:pPr>
+      <w:r>
+        <w:rPr>
+          <w:rFonts w:ascii="Arial" w:cs="Arial" w:eastAsia="Arial" w:hAnsi="Arial"/>
+          <w:color w:val="404040"/>
+          <w:sz w:val="20"/>
+          <w:szCs w:val="20"/>
+        </w:rPr>
+        <w:t xml:space="preserve">Direkt danach, ohne die aktuelle Session zu schliessen: in einem zweiten, separaten Terminal eine neue SSH-Verbindung aufbauen. Klappt sie, ist bestätigt, dass die Regeln passen. Klappt sie nicht, bleibt die erste Session offen — dort sofort sudo ufw disable zum Zurückrollen, dann die Regeln korrigieren.</w:t>
+      </w:r>
+    </w:p>
+    <w:p>
+      <w:pPr>
+        <w:spacing w:after="80"/>
+      </w:pPr>
+      <w:r>
+        <w:rPr>
+          <w:rFonts w:ascii="Arial" w:cs="Arial" w:eastAsia="Arial" w:hAnsi="Arial"/>
+          <w:color w:val="404040"/>
+          <w:sz w:val="20"/>
+          <w:szCs w:val="20"/>
+        </w:rPr>
+        <w:t xml:space="preserve">Bei einem Server ohne Netzwerkzugriff als Rückfallebene (z. B. Serial-/Rescue-Console des Hosting-Anbieters) lohnt es sich, vorher kurz zu prüfen, dass dieser Zugang funktioniert — als zusätzliches Sicherheitsnetz, falls doch beide SSH-Wege blockiert sind.</w:t>
+      </w:r>
+    </w:p>
+    <w:p>
+      <w:pPr>
+        <w:pStyle w:val="Heading2"/>
+        <w:spacing w:after="80" w:before="240"/>
+      </w:pPr>
+      <w:r>
+        <w:rPr>
+          <w:rFonts w:ascii="Arial" w:cs="Arial" w:eastAsia="Arial" w:hAnsi="Arial"/>
+          <w:b/>
+          <w:bCs/>
+          <w:color w:val="1F5C99"/>
+          <w:sz w:val="22"/>
+          <w:szCs w:val="22"/>
+        </w:rPr>
+        <w:t xml:space="preserve">13.6 Verwaltung im laufenden Betrieb</w:t>
+      </w:r>
+    </w:p>
+    <w:p>
+      <w:pPr>
+        <w:shd w:fill="F0F0F0" w:val="clear"/>
+        <w:spacing w:after="80"/>
+        <w:ind w:left="360"/>
+      </w:pPr>
+      <w:r>
+        <w:rPr>
+          <w:rFonts w:ascii="Courier New" w:cs="Courier New" w:eastAsia="Courier New" w:hAnsi="Courier New"/>
+          <w:color w:val="1A1A1A"/>
+          <w:sz w:val="18"/>
+          <w:szCs w:val="18"/>
+        </w:rPr>
+        <w:t xml:space="preserve"># Regeln mit Nummern anzeigen (für gezieltes Löschen)</w:t>
+      </w:r>
+    </w:p>
+    <w:p>
+      <w:pPr>
+        <w:shd w:fill="F0F0F0" w:val="clear"/>
+        <w:spacing w:after="80"/>
+        <w:ind w:left="360"/>
+      </w:pPr>
+      <w:r>
+        <w:rPr>
+          <w:rFonts w:ascii="Courier New" w:cs="Courier New" w:eastAsia="Courier New" w:hAnsi="Courier New"/>
+          <w:color w:val="1A1A1A"/>
+          <w:sz w:val="18"/>
+          <w:szCs w:val="18"/>
+        </w:rPr>
+        <w:t xml:space="preserve">sudo ufw status numbered</w:t>
+      </w:r>
+    </w:p>
+    <w:p>
+      <w:pPr>
+        <w:shd w:fill="F0F0F0" w:val="clear"/>
+        <w:spacing w:after="80"/>
+        <w:ind w:left="360"/>
+      </w:pPr>
+      <w:r>
+        <w:rPr>
+          <w:rFonts w:ascii="Courier New" w:cs="Courier New" w:eastAsia="Courier New" w:hAnsi="Courier New"/>
+          <w:color w:val="1A1A1A"/>
+          <w:sz w:val="18"/>
+          <w:szCs w:val="18"/>
+        </w:rPr>
+        <w:t xml:space="preserve"># Regel Nr. 3 löschen</w:t>
+      </w:r>
+    </w:p>
+    <w:p>
+      <w:pPr>
+        <w:shd w:fill="F0F0F0" w:val="clear"/>
+        <w:spacing w:after="80"/>
+        <w:ind w:left="360"/>
+      </w:pPr>
+      <w:r>
+        <w:rPr>
+          <w:rFonts w:ascii="Courier New" w:cs="Courier New" w:eastAsia="Courier New" w:hAnsi="Courier New"/>
+          <w:color w:val="1A1A1A"/>
+          <w:sz w:val="18"/>
+          <w:szCs w:val="18"/>
+        </w:rPr>
+        <w:t xml:space="preserve">sudo ufw delete 3</w:t>
+      </w:r>
+    </w:p>
+    <w:p>
+      <w:pPr>
+        <w:shd w:fill="F0F0F0" w:val="clear"/>
+        <w:spacing w:after="80"/>
+        <w:ind w:left="360"/>
+      </w:pPr>
+      <w:r>
+        <w:rPr>
+          <w:rFonts w:ascii="Courier New" w:cs="Courier New" w:eastAsia="Courier New" w:hAnsi="Courier New"/>
+          <w:color w:val="1A1A1A"/>
+          <w:sz w:val="18"/>
+          <w:szCs w:val="18"/>
+        </w:rPr>
+        <w:t xml:space="preserve"># Regel per Definition statt Nummer löschen</w:t>
+      </w:r>
+    </w:p>
+    <w:p>
+      <w:pPr>
+        <w:shd w:fill="F0F0F0" w:val="clear"/>
+        <w:spacing w:after="80"/>
+        <w:ind w:left="360"/>
+      </w:pPr>
+      <w:r>
+        <w:rPr>
+          <w:rFonts w:ascii="Courier New" w:cs="Courier New" w:eastAsia="Courier New" w:hAnsi="Courier New"/>
+          <w:color w:val="1A1A1A"/>
+          <w:sz w:val="18"/>
+          <w:szCs w:val="18"/>
+        </w:rPr>
+        <w:t xml:space="preserve">sudo ufw delete allow 8080/tcp</w:t>
+      </w:r>
+    </w:p>
+    <w:p>
+      <w:pPr>
+        <w:shd w:fill="F0F0F0" w:val="clear"/>
+        <w:spacing w:after="80"/>
+        <w:ind w:left="360"/>
+      </w:pPr>
+      <w:r>
+        <w:rPr>
+          <w:rFonts w:ascii="Courier New" w:cs="Courier New" w:eastAsia="Courier New" w:hAnsi="Courier New"/>
+          <w:color w:val="1A1A1A"/>
+          <w:sz w:val="18"/>
+          <w:szCs w:val="18"/>
+        </w:rPr>
+        <w:t xml:space="preserve"># UFW deaktivieren (Regeln bleiben gespeichert)</w:t>
+      </w:r>
+    </w:p>
+    <w:p>
+      <w:pPr>
+        <w:shd w:fill="F0F0F0" w:val="clear"/>
+        <w:spacing w:after="80"/>
+        <w:ind w:left="360"/>
+      </w:pPr>
+      <w:r>
+        <w:rPr>
+          <w:rFonts w:ascii="Courier New" w:cs="Courier New" w:eastAsia="Courier New" w:hAnsi="Courier New"/>
+          <w:color w:val="1A1A1A"/>
+          <w:sz w:val="18"/>
+          <w:szCs w:val="18"/>
+        </w:rPr>
+        <w:t xml:space="preserve">sudo ufw disable</w:t>
+      </w:r>
+    </w:p>
+    <w:p>
+      <w:pPr>
+        <w:shd w:fill="F0F0F0" w:val="clear"/>
+        <w:spacing w:after="80"/>
+        <w:ind w:left="360"/>
+      </w:pPr>
+      <w:r>
+        <w:rPr>
+          <w:rFonts w:ascii="Courier New" w:cs="Courier New" w:eastAsia="Courier New" w:hAnsi="Courier New"/>
+          <w:color w:val="1A1A1A"/>
+          <w:sz w:val="18"/>
+          <w:szCs w:val="18"/>
+        </w:rPr>
+        <w:t xml:space="preserve"># komplett zurücksetzen (alle Regeln löschen)</w:t>
+      </w:r>
+    </w:p>
+    <w:p>
+      <w:pPr>
+        <w:shd w:fill="F0F0F0" w:val="clear"/>
+        <w:spacing w:after="80"/>
+        <w:ind w:left="360"/>
+      </w:pPr>
+      <w:r>
+        <w:rPr>
+          <w:rFonts w:ascii="Courier New" w:cs="Courier New" w:eastAsia="Courier New" w:hAnsi="Courier New"/>
+          <w:color w:val="1A1A1A"/>
+          <w:sz w:val="18"/>
+          <w:szCs w:val="18"/>
+        </w:rPr>
+        <w:t xml:space="preserve">sudo ufw reset</w:t>
+      </w:r>
+    </w:p>
+    <w:p>
+      <w:pPr>
+        <w:spacing w:after="80"/>
+      </w:pPr>
+      <w:r>
+        <w:rPr>
+          <w:rFonts w:ascii="Arial" w:cs="Arial" w:eastAsia="Arial" w:hAnsi="Arial"/>
+          <w:color w:val="404040"/>
+          <w:sz w:val="20"/>
+          <w:szCs w:val="20"/>
+        </w:rPr>
+        <w:t xml:space="preserve">Einmal aktiviert, überstehen die Regeln auch einen Neustart — UFW baut sie beim Boot über einen eigenen systemd-Dienst automatisch wieder auf.</w:t>
+      </w:r>
+    </w:p>
+    <w:p>
+      <w:pPr>
+        <w:pStyle w:val="Heading2"/>
+        <w:spacing w:after="80" w:before="240"/>
+      </w:pPr>
+      <w:r>
+        <w:rPr>
+          <w:rFonts w:ascii="Arial" w:cs="Arial" w:eastAsia="Arial" w:hAnsi="Arial"/>
+          <w:b/>
+          <w:bCs/>
+          <w:color w:val="1F5C99"/>
+          <w:sz w:val="22"/>
+          <w:szCs w:val="22"/>
+        </w:rPr>
+        <w:t xml:space="preserve">13.7 Ergänzung: fail2ban gegen Brute-Force</w:t>
+      </w:r>
+    </w:p>
+    <w:p>
+      <w:pPr>
+        <w:spacing w:after="80"/>
+      </w:pPr>
+      <w:r>
+        <w:rPr>
+          <w:rFonts w:ascii="Arial" w:cs="Arial" w:eastAsia="Arial" w:hAnsi="Arial"/>
+          <w:color w:val="404040"/>
+          <w:sz w:val="20"/>
+          <w:szCs w:val="20"/>
+        </w:rPr>
+        <w:t xml:space="preserve">UFW entscheidet nur ob ein Port erreichbar ist — nicht, wie oft jemand von derselben IP erfolglos versucht, sich anzumelden. Dafür ergänzt fail2ban die Firewall sinnvoll: es liest Log-Dateien (z. B. sshd) und sperrt IPs nach zu vielen Fehlversuchen automatisch.</w:t>
+      </w:r>
+    </w:p>
+    <w:p>
+      <w:pPr>
+        <w:shd w:fill="F0F0F0" w:val="clear"/>
+        <w:spacing w:after="80"/>
+        <w:ind w:left="360"/>
+      </w:pPr>
+      <w:r>
+        <w:rPr>
+          <w:rFonts w:ascii="Courier New" w:cs="Courier New" w:eastAsia="Courier New" w:hAnsi="Courier New"/>
+          <w:color w:val="1A1A1A"/>
+          <w:sz w:val="18"/>
+          <w:szCs w:val="18"/>
+        </w:rPr>
+        <w:t xml:space="preserve">sudo apt install fail2ban -y</w:t>
+      </w:r>
+    </w:p>
+    <w:p>
+      <w:pPr>
+        <w:spacing w:after="80"/>
+      </w:pPr>
+      <w:r>
+        <w:rPr>
+          <w:rFonts w:ascii="Arial" w:cs="Arial" w:eastAsia="Arial" w:hAnsi="Arial"/>
+          <w:b/>
+          <w:bCs/>
+          <w:color w:val="404040"/>
+          <w:sz w:val="20"/>
+          <w:szCs w:val="20"/>
+        </w:rPr>
+        <w:t xml:space="preserve">/etc/fail2ban/jail.local:</w:t>
+      </w:r>
+    </w:p>
+    <w:p>
+      <w:pPr>
+        <w:shd w:fill="F0F0F0" w:val="clear"/>
+        <w:spacing w:after="80"/>
+        <w:ind w:left="360"/>
+      </w:pPr>
+      <w:r>
+        <w:rPr>
+          <w:rFonts w:ascii="Courier New" w:cs="Courier New" w:eastAsia="Courier New" w:hAnsi="Courier New"/>
+          <w:color w:val="1A1A1A"/>
+          <w:sz w:val="18"/>
+          <w:szCs w:val="18"/>
+        </w:rPr>
+        <w:t xml:space="preserve">[sshd]</w:t>
+      </w:r>
+    </w:p>
+    <w:p>
+      <w:pPr>
+        <w:shd w:fill="F0F0F0" w:val="clear"/>
+        <w:spacing w:after="80"/>
+        <w:ind w:left="360"/>
+      </w:pPr>
+      <w:r>
+        <w:rPr>
+          <w:rFonts w:ascii="Courier New" w:cs="Courier New" w:eastAsia="Courier New" w:hAnsi="Courier New"/>
+          <w:color w:val="1A1A1A"/>
+          <w:sz w:val="18"/>
+          <w:szCs w:val="18"/>
+        </w:rPr>
+        <w:t xml:space="preserve">enabled = true</w:t>
+      </w:r>
+    </w:p>
+    <w:p>
+      <w:pPr>
+        <w:shd w:fill="F0F0F0" w:val="clear"/>
+        <w:spacing w:after="80"/>
+        <w:ind w:left="360"/>
+      </w:pPr>
+      <w:r>
+        <w:rPr>
+          <w:rFonts w:ascii="Courier New" w:cs="Courier New" w:eastAsia="Courier New" w:hAnsi="Courier New"/>
+          <w:color w:val="1A1A1A"/>
+          <w:sz w:val="18"/>
+          <w:szCs w:val="18"/>
+        </w:rPr>
+        <w:t xml:space="preserve">maxretry = 5</w:t>
+      </w:r>
+    </w:p>
+    <w:p>
+      <w:pPr>
+        <w:shd w:fill="F0F0F0" w:val="clear"/>
+        <w:spacing w:after="80"/>
+        <w:ind w:left="360"/>
+      </w:pPr>
+      <w:r>
+        <w:rPr>
+          <w:rFonts w:ascii="Courier New" w:cs="Courier New" w:eastAsia="Courier New" w:hAnsi="Courier New"/>
+          <w:color w:val="1A1A1A"/>
+          <w:sz w:val="18"/>
+          <w:szCs w:val="18"/>
+        </w:rPr>
+        <w:t xml:space="preserve">findtime = 10m</w:t>
+      </w:r>
+    </w:p>
+    <w:p>
+      <w:pPr>
+        <w:shd w:fill="F0F0F0" w:val="clear"/>
+        <w:spacing w:after="80"/>
+        <w:ind w:left="360"/>
+      </w:pPr>
+      <w:r>
+        <w:rPr>
+          <w:rFonts w:ascii="Courier New" w:cs="Courier New" w:eastAsia="Courier New" w:hAnsi="Courier New"/>
+          <w:color w:val="1A1A1A"/>
+          <w:sz w:val="18"/>
+          <w:szCs w:val="18"/>
+        </w:rPr>
+        <w:t xml:space="preserve">bantime = 1h</w:t>
+      </w:r>
+    </w:p>
+    <w:p>
+      <w:pPr>
+        <w:shd w:fill="F0F0F0" w:val="clear"/>
+        <w:spacing w:after="80"/>
+        <w:ind w:left="360"/>
+      </w:pPr>
+      <w:r>
+        <w:rPr>
+          <w:rFonts w:ascii="Courier New" w:cs="Courier New" w:eastAsia="Courier New" w:hAnsi="Courier New"/>
+          <w:color w:val="1A1A1A"/>
+          <w:sz w:val="18"/>
+          <w:szCs w:val="18"/>
+        </w:rPr>
+        <w:t xml:space="preserve">sudo systemctl enable --now fail2ban</w:t>
+      </w:r>
+    </w:p>
+    <w:p>
+      <w:pPr>
+        <w:shd w:fill="F0F0F0" w:val="clear"/>
+        <w:spacing w:after="80"/>
+        <w:ind w:left="360"/>
+      </w:pPr>
+      <w:r>
+        <w:rPr>
+          <w:rFonts w:ascii="Courier New" w:cs="Courier New" w:eastAsia="Courier New" w:hAnsi="Courier New"/>
+          <w:color w:val="1A1A1A"/>
+          <w:sz w:val="18"/>
+          <w:szCs w:val="18"/>
+        </w:rPr>
+        <w:t xml:space="preserve">sudo fail2ban-client status sshd</w:t>
+      </w:r>
+    </w:p>
+    <w:p>
+      <w:pPr>
+        <w:pStyle w:val="Heading2"/>
+        <w:spacing w:after="80" w:before="240"/>
+      </w:pPr>
+      <w:r>
+        <w:rPr>
+          <w:rFonts w:ascii="Arial" w:cs="Arial" w:eastAsia="Arial" w:hAnsi="Arial"/>
+          <w:b/>
+          <w:bCs/>
+          <w:color w:val="1F5C99"/>
+          <w:sz w:val="22"/>
+          <w:szCs w:val="22"/>
+        </w:rPr>
+        <w:t xml:space="preserve">Cheat-Sheet</w:t>
+      </w:r>
+    </w:p>
+    <w:p>
+      <w:pPr>
+        <w:spacing w:after="80"/>
+      </w:pPr>
+      <w:r>
+        <w:rPr>
+          <w:rFonts w:ascii="Arial" w:cs="Arial" w:eastAsia="Arial" w:hAnsi="Arial"/>
+          <w:color w:val="404040"/>
+          <w:sz w:val="20"/>
+          <w:szCs w:val="20"/>
+        </w:rPr>
+        <w:t xml:space="preserve">Die Befehle, die im Alltag am häufigsten gebraucht werden.</w:t>
+      </w:r>
+    </w:p>
+    <w:tbl>
+      <w:tblPr>
+        <w:tblW w:type="dxa" w:w="9746"/>
+        <w:tblBorders>
+          <w:top w:val="single" w:color="auto" w:sz="4"/>
+          <w:left w:val="single" w:color="auto" w:sz="4"/>
+          <w:bottom w:val="single" w:color="auto" w:sz="4"/>
+          <w:right w:val="single" w:color="auto" w:sz="4"/>
+          <w:insideH w:val="single" w:color="auto" w:sz="4"/>
+          <w:insideV w:val="single" w:color="auto" w:sz="4"/>
+        </w:tblBorders>
+      </w:tblPr>
+      <w:tblGrid>
+        <w:gridCol w:w="3200"/>
+        <w:gridCol w:w="6546"/>
+      </w:tblGrid>
+      <w:tr>
+        <w:trPr>
+          <w:tblHeader/>
+        </w:trPr>
+        <w:tc>
+          <w:tcPr>
+            <w:tcW w:type="dxa" w:w="3200"/>
+            <w:shd w:fill="1F5C99" w:val="clear"/>
+            <w:tcMar>
+              <w:top w:type="dxa" w:w="80"/>
+              <w:left w:type="dxa" w:w="120"/>
+              <w:bottom w:type="dxa" w:w="80"/>
+              <w:right w:type="dxa" w:w="120"/>
+            </w:tcMar>
+          </w:tcPr>
+          <w:p>
+            <w:r>
+              <w:rPr>
+                <w:rFonts w:ascii="Arial" w:cs="Arial" w:eastAsia="Arial" w:hAnsi="Arial"/>
+                <w:b/>
+                <w:bCs/>
+                <w:color w:val="FFFFFF"/>
+                <w:sz w:val="18"/>
+                <w:szCs w:val="18"/>
+              </w:rPr>
+              <w:t xml:space="preserve">Zweck</w:t>
+            </w:r>
+          </w:p>
+        </w:tc>
+        <w:tc>
+          <w:tcPr>
+            <w:tcW w:type="dxa" w:w="6546"/>
+            <w:shd w:fill="1F5C99" w:val="clear"/>
+            <w:tcMar>
+              <w:top w:type="dxa" w:w="80"/>
+              <w:left w:type="dxa" w:w="120"/>
+              <w:bottom w:type="dxa" w:w="80"/>
+              <w:right w:type="dxa" w:w="120"/>
+            </w:tcMar>
+          </w:tcPr>
+          <w:p>
+            <w:r>
+              <w:rPr>
+                <w:rFonts w:ascii="Arial" w:cs="Arial" w:eastAsia="Arial" w:hAnsi="Arial"/>
+                <w:b/>
+                <w:bCs/>
+                <w:color w:val="FFFFFF"/>
+                <w:sz w:val="18"/>
+                <w:szCs w:val="18"/>
+              </w:rPr>
+              <w:t xml:space="preserve">Befehl</w:t>
+            </w:r>
+          </w:p>
+        </w:tc>
+      </w:tr>
+      <w:tr>
+        <w:tc>
+          <w:tcPr>
+            <w:tcW w:type="dxa" w:w="3200"/>
+            <w:shd w:fill="EBF3FB" w:val="clear"/>
+            <w:tcMar>
+              <w:top w:type="dxa" w:w="80"/>
+              <w:left w:type="dxa" w:w="120"/>
+              <w:bottom w:type="dxa" w:w="80"/>
+              <w:right w:type="dxa" w:w="120"/>
+            </w:tcMar>
+          </w:tcPr>
+          <w:p>
+            <w:r>
+              <w:rPr>
+                <w:rFonts w:ascii="Arial" w:cs="Arial" w:eastAsia="Arial" w:hAnsi="Arial"/>
+                <w:color w:val="404040"/>
+                <w:sz w:val="18"/>
+                <w:szCs w:val="18"/>
+              </w:rPr>
+              <w:t xml:space="preserve">Status ansehen</w:t>
+            </w:r>
+          </w:p>
+        </w:tc>
+        <w:tc>
+          <w:tcPr>
+            <w:tcW w:type="dxa" w:w="6546"/>
+            <w:shd w:fill="EBF3FB" w:val="clear"/>
+            <w:tcMar>
+              <w:top w:type="dxa" w:w="80"/>
+              <w:left w:type="dxa" w:w="120"/>
+              <w:bottom w:type="dxa" w:w="80"/>
+              <w:right w:type="dxa" w:w="120"/>
+            </w:tcMar>
+          </w:tcPr>
+          <w:p>
+            <w:r>
+              <w:rPr>
+                <w:rFonts w:ascii="Arial" w:cs="Arial" w:eastAsia="Arial" w:hAnsi="Arial"/>
+                <w:color w:val="404040"/>
+                <w:sz w:val="18"/>
+                <w:szCs w:val="18"/>
+              </w:rPr>
+              <w:t xml:space="preserve">sudo ufw status verbose</w:t>
+            </w:r>
+          </w:p>
+        </w:tc>
+      </w:tr>
+      <w:tr>
+        <w:tc>
+          <w:tcPr>
+            <w:tcW w:type="dxa" w:w="3200"/>
+            <w:tcMar>
+              <w:top w:type="dxa" w:w="80"/>
+              <w:left w:type="dxa" w:w="120"/>
+              <w:bottom w:type="dxa" w:w="80"/>
+              <w:right w:type="dxa" w:w="120"/>
+            </w:tcMar>
+          </w:tcPr>
+          <w:p>
+            <w:r>
+              <w:rPr>
+                <w:rFonts w:ascii="Arial" w:cs="Arial" w:eastAsia="Arial" w:hAnsi="Arial"/>
+                <w:color w:val="404040"/>
+                <w:sz w:val="18"/>
+                <w:szCs w:val="18"/>
+              </w:rPr>
+              <w:t xml:space="preserve">Status mit Regelnummern</w:t>
+            </w:r>
+          </w:p>
+        </w:tc>
+        <w:tc>
+          <w:tcPr>
+            <w:tcW w:type="dxa" w:w="6546"/>
+            <w:tcMar>
+              <w:top w:type="dxa" w:w="80"/>
+              <w:left w:type="dxa" w:w="120"/>
+              <w:bottom w:type="dxa" w:w="80"/>
+              <w:right w:type="dxa" w:w="120"/>
+            </w:tcMar>
+          </w:tcPr>
+          <w:p>
+            <w:r>
+              <w:rPr>
+                <w:rFonts w:ascii="Arial" w:cs="Arial" w:eastAsia="Arial" w:hAnsi="Arial"/>
+                <w:color w:val="404040"/>
+                <w:sz w:val="18"/>
+                <w:szCs w:val="18"/>
+              </w:rPr>
+              <w:t xml:space="preserve">sudo ufw status numbered</w:t>
+            </w:r>
+          </w:p>
+        </w:tc>
+      </w:tr>
+      <w:tr>
+        <w:tc>
+          <w:tcPr>
+            <w:tcW w:type="dxa" w:w="3200"/>
+            <w:shd w:fill="EBF3FB" w:val="clear"/>
+            <w:tcMar>
+              <w:top w:type="dxa" w:w="80"/>
+              <w:left w:type="dxa" w:w="120"/>
+              <w:bottom w:type="dxa" w:w="80"/>
+              <w:right w:type="dxa" w:w="120"/>
+            </w:tcMar>
+          </w:tcPr>
+          <w:p>
+            <w:r>
+              <w:rPr>
+                <w:rFonts w:ascii="Arial" w:cs="Arial" w:eastAsia="Arial" w:hAnsi="Arial"/>
+                <w:color w:val="404040"/>
+                <w:sz w:val="18"/>
+                <w:szCs w:val="18"/>
+              </w:rPr>
+              <w:t xml:space="preserve">Port für alle öffnen</w:t>
+            </w:r>
+          </w:p>
+        </w:tc>
+        <w:tc>
+          <w:tcPr>
+            <w:tcW w:type="dxa" w:w="6546"/>
+            <w:shd w:fill="EBF3FB" w:val="clear"/>
+            <w:tcMar>
+              <w:top w:type="dxa" w:w="80"/>
+              <w:left w:type="dxa" w:w="120"/>
+              <w:bottom w:type="dxa" w:w="80"/>
+              <w:right w:type="dxa" w:w="120"/>
+            </w:tcMar>
+          </w:tcPr>
+          <w:p>
+            <w:r>
+              <w:rPr>
+                <w:rFonts w:ascii="Arial" w:cs="Arial" w:eastAsia="Arial" w:hAnsi="Arial"/>
+                <w:color w:val="404040"/>
+                <w:sz w:val="18"/>
+                <w:szCs w:val="18"/>
+              </w:rPr>
+              <w:t xml:space="preserve">sudo ufw allow 443/tcp</w:t>
+            </w:r>
+          </w:p>
+        </w:tc>
+      </w:tr>
+      <w:tr>
+        <w:tc>
+          <w:tcPr>
+            <w:tcW w:type="dxa" w:w="3200"/>
+            <w:tcMar>
+              <w:top w:type="dxa" w:w="80"/>
+              <w:left w:type="dxa" w:w="120"/>
+              <w:bottom w:type="dxa" w:w="80"/>
+              <w:right w:type="dxa" w:w="120"/>
+            </w:tcMar>
+          </w:tcPr>
+          <w:p>
+            <w:r>
+              <w:rPr>
+                <w:rFonts w:ascii="Arial" w:cs="Arial" w:eastAsia="Arial" w:hAnsi="Arial"/>
+                <w:color w:val="404040"/>
+                <w:sz w:val="18"/>
+                <w:szCs w:val="18"/>
+              </w:rPr>
+              <w:t xml:space="preserve">Port nur für eine IP öffnen</w:t>
+            </w:r>
+          </w:p>
+        </w:tc>
+        <w:tc>
+          <w:tcPr>
+            <w:tcW w:type="dxa" w:w="6546"/>
+            <w:tcMar>
+              <w:top w:type="dxa" w:w="80"/>
+              <w:left w:type="dxa" w:w="120"/>
+              <w:bottom w:type="dxa" w:w="80"/>
+              <w:right w:type="dxa" w:w="120"/>
+            </w:tcMar>
+          </w:tcPr>
+          <w:p>
+            <w:r>
+              <w:rPr>
+                <w:rFonts w:ascii="Arial" w:cs="Arial" w:eastAsia="Arial" w:hAnsi="Arial"/>
+                <w:color w:val="404040"/>
+                <w:sz w:val="18"/>
+                <w:szCs w:val="18"/>
+              </w:rPr>
+              <w:t xml:space="preserve">sudo ufw allow from &lt;ip&gt; to any port &lt;port&gt; proto tcp</w:t>
+            </w:r>
+          </w:p>
+        </w:tc>
+      </w:tr>
+      <w:tr>
+        <w:tc>
+          <w:tcPr>
+            <w:tcW w:type="dxa" w:w="3200"/>
+            <w:shd w:fill="EBF3FB" w:val="clear"/>
+            <w:tcMar>
+              <w:top w:type="dxa" w:w="80"/>
+              <w:left w:type="dxa" w:w="120"/>
+              <w:bottom w:type="dxa" w:w="80"/>
+              <w:right w:type="dxa" w:w="120"/>
+            </w:tcMar>
+          </w:tcPr>
+          <w:p>
+            <w:r>
+              <w:rPr>
+                <w:rFonts w:ascii="Arial" w:cs="Arial" w:eastAsia="Arial" w:hAnsi="Arial"/>
+                <w:color w:val="404040"/>
+                <w:sz w:val="18"/>
+                <w:szCs w:val="18"/>
+              </w:rPr>
+              <w:t xml:space="preserve">Regel entfernen</w:t>
+            </w:r>
+          </w:p>
+        </w:tc>
+        <w:tc>
+          <w:tcPr>
+            <w:tcW w:type="dxa" w:w="6546"/>
+            <w:shd w:fill="EBF3FB" w:val="clear"/>
+            <w:tcMar>
+              <w:top w:type="dxa" w:w="80"/>
+              <w:left w:type="dxa" w:w="120"/>
+              <w:bottom w:type="dxa" w:w="80"/>
+              <w:right w:type="dxa" w:w="120"/>
+            </w:tcMar>
+          </w:tcPr>
+          <w:p>
+            <w:r>
+              <w:rPr>
+                <w:rFonts w:ascii="Arial" w:cs="Arial" w:eastAsia="Arial" w:hAnsi="Arial"/>
+                <w:color w:val="404040"/>
+                <w:sz w:val="18"/>
+                <w:szCs w:val="18"/>
+              </w:rPr>
+              <w:t xml:space="preserve">sudo ufw delete &lt;nummer&gt;</w:t>
+            </w:r>
+          </w:p>
+        </w:tc>
+      </w:tr>
+      <w:tr>
+        <w:tc>
+          <w:tcPr>
+            <w:tcW w:type="dxa" w:w="3200"/>
+            <w:tcMar>
+              <w:top w:type="dxa" w:w="80"/>
+              <w:left w:type="dxa" w:w="120"/>
+              <w:bottom w:type="dxa" w:w="80"/>
+              <w:right w:type="dxa" w:w="120"/>
+            </w:tcMar>
+          </w:tcPr>
+          <w:p>
+            <w:r>
+              <w:rPr>
+                <w:rFonts w:ascii="Arial" w:cs="Arial" w:eastAsia="Arial" w:hAnsi="Arial"/>
+                <w:color w:val="404040"/>
+                <w:sz w:val="18"/>
+                <w:szCs w:val="18"/>
+              </w:rPr>
+              <w:t xml:space="preserve">Aktivieren</w:t>
+            </w:r>
+          </w:p>
+        </w:tc>
+        <w:tc>
+          <w:tcPr>
+            <w:tcW w:type="dxa" w:w="6546"/>
+            <w:tcMar>
+              <w:top w:type="dxa" w:w="80"/>
+              <w:left w:type="dxa" w:w="120"/>
+              <w:bottom w:type="dxa" w:w="80"/>
+              <w:right w:type="dxa" w:w="120"/>
+            </w:tcMar>
+          </w:tcPr>
+          <w:p>
+            <w:r>
+              <w:rPr>
+                <w:rFonts w:ascii="Arial" w:cs="Arial" w:eastAsia="Arial" w:hAnsi="Arial"/>
+                <w:color w:val="404040"/>
+                <w:sz w:val="18"/>
+                <w:szCs w:val="18"/>
+              </w:rPr>
+              <w:t xml:space="preserve">sudo ufw enable</w:t>
+            </w:r>
+          </w:p>
+        </w:tc>
+      </w:tr>
+      <w:tr>
+        <w:tc>
+          <w:tcPr>
+            <w:tcW w:type="dxa" w:w="3200"/>
+            <w:shd w:fill="EBF3FB" w:val="clear"/>
+            <w:tcMar>
+              <w:top w:type="dxa" w:w="80"/>
+              <w:left w:type="dxa" w:w="120"/>
+              <w:bottom w:type="dxa" w:w="80"/>
+              <w:right w:type="dxa" w:w="120"/>
+            </w:tcMar>
+          </w:tcPr>
+          <w:p>
+            <w:r>
+              <w:rPr>
+                <w:rFonts w:ascii="Arial" w:cs="Arial" w:eastAsia="Arial" w:hAnsi="Arial"/>
+                <w:color w:val="404040"/>
+                <w:sz w:val="18"/>
+                <w:szCs w:val="18"/>
+              </w:rPr>
+              <w:t xml:space="preserve">Deaktivieren (Notausstieg)</w:t>
+            </w:r>
+          </w:p>
+        </w:tc>
+        <w:tc>
+          <w:tcPr>
+            <w:tcW w:type="dxa" w:w="6546"/>
+            <w:shd w:fill="EBF3FB" w:val="clear"/>
+            <w:tcMar>
+              <w:top w:type="dxa" w:w="80"/>
+              <w:left w:type="dxa" w:w="120"/>
+              <w:bottom w:type="dxa" w:w="80"/>
+              <w:right w:type="dxa" w:w="120"/>
+            </w:tcMar>
+          </w:tcPr>
+          <w:p>
+            <w:r>
+              <w:rPr>
+                <w:rFonts w:ascii="Arial" w:cs="Arial" w:eastAsia="Arial" w:hAnsi="Arial"/>
+                <w:color w:val="404040"/>
+                <w:sz w:val="18"/>
+                <w:szCs w:val="18"/>
+              </w:rPr>
+              <w:t xml:space="preserve">sudo ufw disable</w:t>
+            </w:r>
+          </w:p>
+        </w:tc>
+      </w:tr>
+      <w:tr>
+        <w:tc>
+          <w:tcPr>
+            <w:tcW w:type="dxa" w:w="3200"/>
+            <w:tcMar>
+              <w:top w:type="dxa" w:w="80"/>
+              <w:left w:type="dxa" w:w="120"/>
+              <w:bottom w:type="dxa" w:w="80"/>
+              <w:right w:type="dxa" w:w="120"/>
+            </w:tcMar>
+          </w:tcPr>
+          <w:p>
+            <w:r>
+              <w:rPr>
+                <w:rFonts w:ascii="Arial" w:cs="Arial" w:eastAsia="Arial" w:hAnsi="Arial"/>
+                <w:color w:val="404040"/>
+                <w:sz w:val="18"/>
+                <w:szCs w:val="18"/>
+              </w:rPr>
+              <w:t xml:space="preserve">Vorbereitete Regeln ansehen</w:t>
+            </w:r>
+          </w:p>
+        </w:tc>
+        <w:tc>
+          <w:tcPr>
+            <w:tcW w:type="dxa" w:w="6546"/>
+            <w:tcMar>
+              <w:top w:type="dxa" w:w="80"/>
+              <w:left w:type="dxa" w:w="120"/>
+              <w:bottom w:type="dxa" w:w="80"/>
+              <w:right w:type="dxa" w:w="120"/>
+            </w:tcMar>
+          </w:tcPr>
+          <w:p>
+            <w:r>
+              <w:rPr>
+                <w:rFonts w:ascii="Arial" w:cs="Arial" w:eastAsia="Arial" w:hAnsi="Arial"/>
+                <w:color w:val="404040"/>
+                <w:sz w:val="18"/>
+                <w:szCs w:val="18"/>
+              </w:rPr>
+              <w:t xml:space="preserve">sudo ufw show added</w:t>
+            </w:r>
+          </w:p>
+        </w:tc>
+      </w:tr>
+      <w:tr>
+        <w:tc>
+          <w:tcPr>
+            <w:tcW w:type="dxa" w:w="3200"/>
+            <w:shd w:fill="EBF3FB" w:val="clear"/>
+            <w:tcMar>
+              <w:top w:type="dxa" w:w="80"/>
+              <w:left w:type="dxa" w:w="120"/>
+              <w:bottom w:type="dxa" w:w="80"/>
+              <w:right w:type="dxa" w:w="120"/>
+            </w:tcMar>
+          </w:tcPr>
+          <w:p>
+            <w:r>
+              <w:rPr>
+                <w:rFonts w:ascii="Arial" w:cs="Arial" w:eastAsia="Arial" w:hAnsi="Arial"/>
+                <w:color w:val="404040"/>
+                <w:sz w:val="18"/>
+                <w:szCs w:val="18"/>
+              </w:rPr>
+              <w:t xml:space="preserve">Alles zurücksetzen</w:t>
+            </w:r>
+          </w:p>
+        </w:tc>
+        <w:tc>
+          <w:tcPr>
+            <w:tcW w:type="dxa" w:w="6546"/>
+            <w:shd w:fill="EBF3FB" w:val="clear"/>
+            <w:tcMar>
+              <w:top w:type="dxa" w:w="80"/>
+              <w:left w:type="dxa" w:w="120"/>
+              <w:bottom w:type="dxa" w:w="80"/>
+              <w:right w:type="dxa" w:w="120"/>
+            </w:tcMar>
+          </w:tcPr>
+          <w:p>
+            <w:r>
+              <w:rPr>
+                <w:rFonts w:ascii="Arial" w:cs="Arial" w:eastAsia="Arial" w:hAnsi="Arial"/>
+                <w:color w:val="404040"/>
+                <w:sz w:val="18"/>
+                <w:szCs w:val="18"/>
+              </w:rPr>
+              <w:t xml:space="preserve">sudo ufw reset</w:t>
+            </w:r>
+          </w:p>
+        </w:tc>
+      </w:tr>
+    </w:tbl>
+    <w:p>
+      <w:pPr>
+        <w:pStyle w:val="Heading2"/>
+        <w:spacing w:after="80" w:before="240"/>
+      </w:pPr>
+      <w:r>
+        <w:rPr>
+          <w:rFonts w:ascii="Arial" w:cs="Arial" w:eastAsia="Arial" w:hAnsi="Arial"/>
+          <w:b/>
+          <w:bCs/>
+          <w:color w:val="1F5C99"/>
+          <w:sz w:val="22"/>
+          <w:szCs w:val="22"/>
+        </w:rPr>
+        <w:t xml:space="preserve">Häufige Fallstricke</w:t>
+      </w:r>
+    </w:p>
+    <w:p>
+      <w:pPr>
+        <w:pStyle w:val="ListParagraph"/>
+        <w:numPr>
+          <w:ilvl w:val="0"/>
+          <w:numId w:val="2"/>
+        </w:numPr>
+        <w:spacing w:after="60"/>
+      </w:pPr>
+      <w:r>
+        <w:rPr>
+          <w:rFonts w:ascii="Arial" w:cs="Arial" w:eastAsia="Arial" w:hAnsi="Arial"/>
+          <w:color w:val="404040"/>
+          <w:sz w:val="20"/>
+          <w:szCs w:val="20"/>
+        </w:rPr>
+        <w:t xml:space="preserve">SSH-Regel vor dem Aktivieren vergessen. ufw enable, bevor Port 22 erlaubt ist, kappt die eigene Verbindung sofort.</w:t>
+      </w:r>
+    </w:p>
+    <w:p>
+      <w:pPr>
+        <w:pStyle w:val="ListParagraph"/>
+        <w:numPr>
+          <w:ilvl w:val="0"/>
+          <w:numId w:val="2"/>
+        </w:numPr>
+        <w:spacing w:after="60"/>
+      </w:pPr>
+      <w:r>
+        <w:rPr>
+          <w:rFonts w:ascii="Arial" w:cs="Arial" w:eastAsia="Arial" w:hAnsi="Arial"/>
+          <w:color w:val="404040"/>
+          <w:sz w:val="20"/>
+          <w:szCs w:val="20"/>
+        </w:rPr>
+        <w:t xml:space="preserve">Zwei Firewalls gleichzeitig aktiv. Läuft parallel noch eine andere Lösung (z. B. CSF), die ebenfalls iptables direkt verwaltet, können sich beide Regelsätze überschreiben oder gegenseitig aushebeln. Die alte Lösung sauber deaktivieren, bevor UFW dauerhaft übernimmt.</w:t>
+      </w:r>
+    </w:p>
+    <w:p>
+      <w:pPr>
+        <w:pStyle w:val="ListParagraph"/>
+        <w:numPr>
+          <w:ilvl w:val="0"/>
+          <w:numId w:val="2"/>
+        </w:numPr>
+        <w:spacing w:after="60"/>
+      </w:pPr>
+      <w:r>
+        <w:rPr>
+          <w:rFonts w:ascii="Arial" w:cs="Arial" w:eastAsia="Arial" w:hAnsi="Arial"/>
+          <w:color w:val="404040"/>
+          <w:sz w:val="20"/>
+          <w:szCs w:val="20"/>
+        </w:rPr>
+        <w:t xml:space="preserve">Regeln, die „offen für alle“ statt „offen für bekannte Quellen“ sind. Besonders bei Datenbank-, RDP- oder SMB-Ports lohnt sich fast immer die Einschränkung auf bestimmte IPs statt eines pauschalen allow &lt;port&gt;.</w:t>
+      </w:r>
+    </w:p>
+    <w:p>
+      <w:pPr>
+        <w:pStyle w:val="ListParagraph"/>
+        <w:numPr>
+          <w:ilvl w:val="0"/>
+          <w:numId w:val="2"/>
+        </w:numPr>
+        <w:spacing w:after="60"/>
+      </w:pPr>
+      <w:r>
+        <w:rPr>
+          <w:rFonts w:ascii="Arial" w:cs="Arial" w:eastAsia="Arial" w:hAnsi="Arial"/>
+          <w:color w:val="404040"/>
+          <w:sz w:val="20"/>
+          <w:szCs w:val="20"/>
+        </w:rPr>
+        <w:t xml:space="preserve">Reihenfolge bei sich widersprechenden Regeln. UFW wertet in der Reihenfolge aus, in der Regeln existieren — eine weiter gefasste Regel kann eine speziellere, später hinzugefügte, wirkungslos machen. Im Zweifel mit ufw status numbered die tatsächliche Reihenfolge prüfen.</w:t>
+      </w:r>
+    </w:p>
+    <w:p>
+      <w:pPr>
+        <w:pStyle w:val="Heading1"/>
+        <w:pBdr>
+          <w:bottom w:val="single" w:color="1F5C99" w:sz="6" w:space="4"/>
+        </w:pBdr>
+        <w:spacing w:after="120" w:before="360"/>
+      </w:pPr>
+      <w:r>
+        <w:rPr>
+          <w:rFonts w:ascii="Arial" w:cs="Arial" w:eastAsia="Arial" w:hAnsi="Arial"/>
+          <w:b/>
+          <w:bCs/>
+          <w:color w:val="1F5C99"/>
+          <w:sz w:val="28"/>
+          <w:szCs w:val="28"/>
+        </w:rPr>
+        <w:t xml:space="preserve">14. Anhang: Ubuntu-Server 1:1 klonen mit Clonezilla</w:t>
+      </w:r>
+    </w:p>
+    <w:p>
+      <w:pPr>
+        <w:spacing w:after="80"/>
+      </w:pPr>
+      <w:r>
+        <w:rPr>
+          <w:rFonts w:ascii="Arial" w:cs="Arial" w:eastAsia="Arial" w:hAnsi="Arial"/>
+          <w:color w:val="404040"/>
+          <w:sz w:val="20"/>
+          <w:szCs w:val="20"/>
+        </w:rPr>
+        <w:t xml:space="preserve">Anleitung: physischen Ubuntu-Server (z. B. HP ProDesk 600 G3 DM, GIS-/Lizmap-Server) auf einen zweiten, baugleichen PC mit grösserer Festplatte klonen. Stand: 7. September 2026.</w:t>
+      </w:r>
+    </w:p>
+    <w:p>
+      <w:pPr>
+        <w:pStyle w:val="Heading2"/>
+        <w:spacing w:after="80" w:before="240"/>
+      </w:pPr>
+      <w:r>
+        <w:rPr>
+          <w:rFonts w:ascii="Arial" w:cs="Arial" w:eastAsia="Arial" w:hAnsi="Arial"/>
+          <w:b/>
+          <w:bCs/>
+          <w:color w:val="1F5C99"/>
+          <w:sz w:val="22"/>
+          <w:szCs w:val="22"/>
+        </w:rPr>
+        <w:t xml:space="preserve">14.1 Zweck und Voraussetzungen</w:t>
+      </w:r>
+    </w:p>
+    <w:p>
+      <w:pPr>
+        <w:spacing w:after="80"/>
+      </w:pPr>
+      <w:r>
+        <w:rPr>
+          <w:rFonts w:ascii="Arial" w:cs="Arial" w:eastAsia="Arial" w:hAnsi="Arial"/>
+          <w:color w:val="404040"/>
+          <w:sz w:val="20"/>
+          <w:szCs w:val="20"/>
+        </w:rPr>
+        <w:t xml:space="preserve">Diese Anleitung beschreibt, wie ein bestehender Ubuntu-Server 1:1 auf einen zweiten PC geklont wird — inklusive Betriebssystem, allen Konfigurationen, xrdp/XFCE-Desktop, PostgreSQL-Datenbank usw. Der Ziel-PC braucht dafür kein vorinstalliertes Betriebssystem.</w:t>
+      </w:r>
+    </w:p>
+    <w:p>
+      <w:pPr>
+        <w:spacing w:after="80"/>
+      </w:pPr>
+      <w:r>
+        <w:rPr>
+          <w:rFonts w:ascii="Arial" w:cs="Arial" w:eastAsia="Arial" w:hAnsi="Arial"/>
+          <w:b/>
+          <w:bCs/>
+          <w:color w:val="404040"/>
+          <w:sz w:val="20"/>
+          <w:szCs w:val="20"/>
+        </w:rPr>
+        <w:t xml:space="preserve">Voraussetzungen:</w:t>
+      </w:r>
+    </w:p>
+    <w:p>
+      <w:pPr>
+        <w:pStyle w:val="ListParagraph"/>
+        <w:numPr>
+          <w:ilvl w:val="0"/>
+          <w:numId w:val="2"/>
+        </w:numPr>
+        <w:spacing w:after="60"/>
+      </w:pPr>
+      <w:r>
+        <w:rPr>
+          <w:rFonts w:ascii="Arial" w:cs="Arial" w:eastAsia="Arial" w:hAnsi="Arial"/>
+          <w:color w:val="404040"/>
+          <w:sz w:val="20"/>
+          <w:szCs w:val="20"/>
+        </w:rPr>
+        <w:t xml:space="preserve">Ein leerer USB-Stick (mind. 1 GB) für den Clonezilla-Live-Boot-Stick.</w:t>
+      </w:r>
+    </w:p>
+    <w:p>
+      <w:pPr>
+        <w:pStyle w:val="ListParagraph"/>
+        <w:numPr>
+          <w:ilvl w:val="0"/>
+          <w:numId w:val="2"/>
+        </w:numPr>
+        <w:spacing w:after="60"/>
+      </w:pPr>
+      <w:r>
+        <w:rPr>
+          <w:rFonts w:ascii="Arial" w:cs="Arial" w:eastAsia="Arial" w:hAnsi="Arial"/>
+          <w:color w:val="404040"/>
+          <w:sz w:val="20"/>
+          <w:szCs w:val="20"/>
+        </w:rPr>
+        <w:t xml:space="preserve">Quell- und Ziel-PC im selben LAN (für den Netzwerk-Klon in 14.5).</w:t>
+      </w:r>
+    </w:p>
+    <w:p>
+      <w:pPr>
+        <w:pStyle w:val="ListParagraph"/>
+        <w:numPr>
+          <w:ilvl w:val="0"/>
+          <w:numId w:val="2"/>
+        </w:numPr>
+        <w:spacing w:after="60"/>
+      </w:pPr>
+      <w:r>
+        <w:rPr>
+          <w:rFonts w:ascii="Arial" w:cs="Arial" w:eastAsia="Arial" w:hAnsi="Arial"/>
+          <w:color w:val="404040"/>
+          <w:sz w:val="20"/>
+          <w:szCs w:val="20"/>
+        </w:rPr>
+        <w:t xml:space="preserve">Physischer Zugriff auf beide PCs, um vom Stick zu booten (Tastatur/Bildschirm oder Fernzugriff über eine Management-Konsole).</w:t>
+      </w:r>
+    </w:p>
+    <w:p>
+      <w:pPr>
+        <w:pStyle w:val="ListParagraph"/>
+        <w:numPr>
+          <w:ilvl w:val="0"/>
+          <w:numId w:val="2"/>
+        </w:numPr>
+        <w:spacing w:after="60"/>
+      </w:pPr>
+      <w:r>
+        <w:rPr>
+          <w:rFonts w:ascii="Arial" w:cs="Arial" w:eastAsia="Arial" w:hAnsi="Arial"/>
+          <w:color w:val="404040"/>
+          <w:sz w:val="20"/>
+          <w:szCs w:val="20"/>
+        </w:rPr>
+        <w:t xml:space="preserve">Zielplatte gleich gross oder grösser als die Quellplatte. Ist sie grösser, wird der zusätzliche Platz erst nach dem Klonen nutzbar gemacht (14.6).</w:t>
+      </w:r>
+    </w:p>
+    <w:p>
+      <w:pPr>
+        <w:pStyle w:val="Heading2"/>
+        <w:spacing w:after="80" w:before="240"/>
+      </w:pPr>
+      <w:r>
+        <w:rPr>
+          <w:rFonts w:ascii="Arial" w:cs="Arial" w:eastAsia="Arial" w:hAnsi="Arial"/>
+          <w:b/>
+          <w:bCs/>
+          <w:color w:val="1F5C99"/>
+          <w:sz w:val="22"/>
+          <w:szCs w:val="22"/>
+        </w:rPr>
+        <w:t xml:space="preserve">14.2 Clonezilla-Live-USB-Stick erstellen</w:t>
+      </w:r>
+    </w:p>
+    <w:p>
+      <w:pPr>
+        <w:pStyle w:val="Heading3"/>
+        <w:spacing w:after="60" w:before="160"/>
+      </w:pPr>
+      <w:r>
+        <w:rPr>
+          <w:rFonts w:ascii="Arial" w:cs="Arial" w:eastAsia="Arial" w:hAnsi="Arial"/>
+          <w:b/>
+          <w:bCs/>
+          <w:color w:val="404040"/>
+          <w:sz w:val="20"/>
+          <w:szCs w:val="20"/>
+        </w:rPr>
+        <w:t xml:space="preserve">14.2.1 ISO herunterladen</w:t>
+      </w:r>
+    </w:p>
+    <w:p>
+      <w:pPr>
+        <w:spacing w:after="80"/>
+      </w:pPr>
+      <w:r>
+        <w:rPr>
+          <w:rFonts w:ascii="Arial" w:cs="Arial" w:eastAsia="Arial" w:hAnsi="Arial"/>
+          <w:color w:val="404040"/>
+          <w:sz w:val="20"/>
+          <w:szCs w:val="20"/>
+        </w:rPr>
+        <w:t xml:space="preserve">Von clonezilla.org die Version „Clonezilla live (Stable)“ herunterladen, Plattform amd64, Dateityp iso.</w:t>
+      </w:r>
+    </w:p>
+    <w:p>
+      <w:pPr>
+        <w:pStyle w:val="Heading3"/>
+        <w:spacing w:after="60" w:before="160"/>
+      </w:pPr>
+      <w:r>
+        <w:rPr>
+          <w:rFonts w:ascii="Arial" w:cs="Arial" w:eastAsia="Arial" w:hAnsi="Arial"/>
+          <w:b/>
+          <w:bCs/>
+          <w:color w:val="404040"/>
+          <w:sz w:val="20"/>
+          <w:szCs w:val="20"/>
+        </w:rPr>
+        <w:t xml:space="preserve">14.2.2 Stick schreiben unter macOS</w:t>
+      </w:r>
+    </w:p>
+    <w:p>
+      <w:pPr>
+        <w:spacing w:after="80"/>
+      </w:pPr>
+      <w:r>
+        <w:rPr>
+          <w:rFonts w:ascii="Arial" w:cs="Arial" w:eastAsia="Arial" w:hAnsi="Arial"/>
+          <w:color w:val="404040"/>
+          <w:sz w:val="20"/>
+          <w:szCs w:val="20"/>
+        </w:rPr>
+        <w:t xml:space="preserve">Grafisch mit balenaEtcher (kostenlos, etcher.balena.io): App öffnen, das ISO auswählen, den USB-Stick als Ziel wählen, „Flash!“ klicken. Alternativ im Terminal:</w:t>
+      </w:r>
+    </w:p>
+    <w:p>
+      <w:pPr>
+        <w:shd w:fill="F0F0F0" w:val="clear"/>
+        <w:spacing w:after="80"/>
+        <w:ind w:left="360"/>
+      </w:pPr>
+      <w:r>
+        <w:rPr>
+          <w:rFonts w:ascii="Courier New" w:cs="Courier New" w:eastAsia="Courier New" w:hAnsi="Courier New"/>
+          <w:color w:val="1A1A1A"/>
+          <w:sz w:val="18"/>
+          <w:szCs w:val="18"/>
+        </w:rPr>
+        <w:t xml:space="preserve">diskutil list                                    # richtigen Stick identifizieren</w:t>
+      </w:r>
+    </w:p>
+    <w:p>
+      <w:pPr>
+        <w:shd w:fill="F0F0F0" w:val="clear"/>
+        <w:spacing w:after="80"/>
+        <w:ind w:left="360"/>
+      </w:pPr>
+      <w:r>
+        <w:rPr>
+          <w:rFonts w:ascii="Courier New" w:cs="Courier New" w:eastAsia="Courier New" w:hAnsi="Courier New"/>
+          <w:color w:val="1A1A1A"/>
+          <w:sz w:val="18"/>
+          <w:szCs w:val="18"/>
+        </w:rPr>
+        <w:t xml:space="preserve">diskutil unmountDisk /dev/diskN</w:t>
+      </w:r>
+    </w:p>
+    <w:p>
+      <w:pPr>
+        <w:shd w:fill="F0F0F0" w:val="clear"/>
+        <w:spacing w:after="80"/>
+        <w:ind w:left="360"/>
+      </w:pPr>
+      <w:r>
+        <w:rPr>
+          <w:rFonts w:ascii="Courier New" w:cs="Courier New" w:eastAsia="Courier New" w:hAnsi="Courier New"/>
+          <w:color w:val="1A1A1A"/>
+          <w:sz w:val="18"/>
+          <w:szCs w:val="18"/>
+        </w:rPr>
+        <w:t xml:space="preserve">sudo dd if=clonezilla-live-*-amd64.iso of=/dev/rdiskN bs=4m status=progress</w:t>
+      </w:r>
+    </w:p>
+    <w:p>
+      <w:pPr>
+        <w:shd w:fill="F0F0F0" w:val="clear"/>
+        <w:spacing w:after="80"/>
+        <w:ind w:left="360"/>
+      </w:pPr>
+      <w:r>
+        <w:rPr>
+          <w:rFonts w:ascii="Courier New" w:cs="Courier New" w:eastAsia="Courier New" w:hAnsi="Courier New"/>
+          <w:color w:val="1A1A1A"/>
+          <w:sz w:val="18"/>
+          <w:szCs w:val="18"/>
+        </w:rPr>
+        <w:t xml:space="preserve">diskutil eject /dev/diskN</w:t>
+      </w:r>
+    </w:p>
+    <w:p>
+      <w:pPr>
+        <w:spacing w:after="80"/>
+      </w:pPr>
+      <w:r>
+        <w:rPr>
+          <w:rFonts w:ascii="Arial" w:cs="Arial" w:eastAsia="Arial" w:hAnsi="Arial"/>
+          <w:b/>
+          <w:bCs/>
+          <w:color w:val="CC0000"/>
+          <w:sz w:val="20"/>
+          <w:szCs w:val="20"/>
+        </w:rPr>
+        <w:t xml:space="preserve">Hinweis: </w:t>
+      </w:r>
+      <w:r>
+        <w:rPr>
+          <w:rFonts w:ascii="Arial" w:cs="Arial" w:eastAsia="Arial" w:hAnsi="Arial"/>
+          <w:color w:val="404040"/>
+          <w:sz w:val="20"/>
+          <w:szCs w:val="20"/>
+        </w:rPr>
+        <w:t xml:space="preserve">Unbedingt /dev/rdiskN (mit „r“ für raw) verwenden und die Disk-Nummer vorher mit diskutil list prüfen — der Befehl löscht den kompletten Inhalt des gewählten Sticks.</w:t>
+      </w:r>
+    </w:p>
+    <w:p>
+      <w:pPr>
+        <w:pStyle w:val="Heading3"/>
+        <w:spacing w:after="60" w:before="160"/>
+      </w:pPr>
+      <w:r>
+        <w:rPr>
+          <w:rFonts w:ascii="Arial" w:cs="Arial" w:eastAsia="Arial" w:hAnsi="Arial"/>
+          <w:b/>
+          <w:bCs/>
+          <w:color w:val="404040"/>
+          <w:sz w:val="20"/>
+          <w:szCs w:val="20"/>
+        </w:rPr>
+        <w:t xml:space="preserve">14.2.3 Stick schreiben unter Windows</w:t>
+      </w:r>
+    </w:p>
+    <w:p>
+      <w:pPr>
+        <w:spacing w:after="80"/>
+      </w:pPr>
+      <w:r>
+        <w:rPr>
+          <w:rFonts w:ascii="Arial" w:cs="Arial" w:eastAsia="Arial" w:hAnsi="Arial"/>
+          <w:color w:val="404040"/>
+          <w:sz w:val="20"/>
+          <w:szCs w:val="20"/>
+        </w:rPr>
+        <w:t xml:space="preserve">Mit Rufus (kostenlos, rufus.ie): Gerät = USB-Stick, Startart = Auswahl → heruntergeladenes ISO angeben → Start. Fragt Rufus nach ISO-Image-Modus oder DD-Image-Modus: zuerst ISO-Image-Modus probieren (Standard). Bootet der Stick damit nicht, den Stick mit DD-Image-Modus neu schreiben.</w:t>
+      </w:r>
+    </w:p>
+    <w:p>
+      <w:pPr>
+        <w:pStyle w:val="Heading2"/>
+        <w:spacing w:after="80" w:before="240"/>
+      </w:pPr>
+      <w:r>
+        <w:rPr>
+          <w:rFonts w:ascii="Arial" w:cs="Arial" w:eastAsia="Arial" w:hAnsi="Arial"/>
+          <w:b/>
+          <w:bCs/>
+          <w:color w:val="1F5C99"/>
+          <w:sz w:val="22"/>
+          <w:szCs w:val="22"/>
+        </w:rPr>
+        <w:t xml:space="preserve">14.3 PC vom Stick booten</w:t>
+      </w:r>
+    </w:p>
+    <w:p>
+      <w:pPr>
+        <w:pStyle w:val="ListParagraph"/>
+        <w:numPr>
+          <w:ilvl w:val="0"/>
+          <w:numId w:val="2"/>
+        </w:numPr>
+        <w:spacing w:after="60"/>
+      </w:pPr>
+      <w:r>
+        <w:rPr>
+          <w:rFonts w:ascii="Arial" w:cs="Arial" w:eastAsia="Arial" w:hAnsi="Arial"/>
+          <w:color w:val="404040"/>
+          <w:sz w:val="20"/>
+          <w:szCs w:val="20"/>
+        </w:rPr>
+        <w:t xml:space="preserve">USB-Stick einstecken, PC einschalten.</w:t>
+      </w:r>
+    </w:p>
+    <w:p>
+      <w:pPr>
+        <w:pStyle w:val="ListParagraph"/>
+        <w:numPr>
+          <w:ilvl w:val="0"/>
+          <w:numId w:val="2"/>
+        </w:numPr>
+        <w:spacing w:after="60"/>
+      </w:pPr>
+      <w:r>
+        <w:rPr>
+          <w:rFonts w:ascii="Arial" w:cs="Arial" w:eastAsia="Arial" w:hAnsi="Arial"/>
+          <w:color w:val="404040"/>
+          <w:sz w:val="20"/>
+          <w:szCs w:val="20"/>
+        </w:rPr>
+        <w:t xml:space="preserve">Boot-Menü aufrufen (bei HP-Geräten meist F9, manchmal Esc oder F10).</w:t>
+      </w:r>
+    </w:p>
+    <w:p>
+      <w:pPr>
+        <w:pStyle w:val="ListParagraph"/>
+        <w:numPr>
+          <w:ilvl w:val="0"/>
+          <w:numId w:val="2"/>
+        </w:numPr>
+        <w:spacing w:after="60"/>
+      </w:pPr>
+      <w:r>
+        <w:rPr>
+          <w:rFonts w:ascii="Arial" w:cs="Arial" w:eastAsia="Arial" w:hAnsi="Arial"/>
+          <w:color w:val="404040"/>
+          <w:sz w:val="20"/>
+          <w:szCs w:val="20"/>
+        </w:rPr>
+        <w:t xml:space="preserve">Den USB-Stick als Boot-Gerät wählen.</w:t>
+      </w:r>
+    </w:p>
+    <w:p>
+      <w:pPr>
+        <w:spacing w:after="80"/>
+      </w:pPr>
+      <w:r>
+        <w:rPr>
+          <w:rFonts w:ascii="Arial" w:cs="Arial" w:eastAsia="Arial" w:hAnsi="Arial"/>
+          <w:color w:val="404040"/>
+          <w:sz w:val="20"/>
+          <w:szCs w:val="20"/>
+        </w:rPr>
+        <w:t xml:space="preserve">Das Live-System startet unabhängig davon, was auf der internen Platte liegt — bei einem leeren Ziel-PC ist das kein Problem.</w:t>
+      </w:r>
+    </w:p>
+    <w:p>
+      <w:pPr>
+        <w:spacing w:after="80"/>
+      </w:pPr>
+      <w:r>
+        <w:rPr>
+          <w:rFonts w:ascii="Arial" w:cs="Arial" w:eastAsia="Arial" w:hAnsi="Arial"/>
+          <w:b/>
+          <w:bCs/>
+          <w:color w:val="1F5C99"/>
+          <w:sz w:val="20"/>
+          <w:szCs w:val="20"/>
+        </w:rPr>
+        <w:t xml:space="preserve">Hinweis: </w:t>
+      </w:r>
+      <w:r>
+        <w:rPr>
+          <w:rFonts w:ascii="Arial" w:cs="Arial" w:eastAsia="Arial" w:hAnsi="Arial"/>
+          <w:color w:val="404040"/>
+          <w:sz w:val="20"/>
+          <w:szCs w:val="20"/>
+        </w:rPr>
+        <w:t xml:space="preserve">Boot-Modus (UEFI vs. Legacy/CSM) sollte auf beiden PCs gleich eingestellt sein, sonst findet der Ziel-PC den geklonten Bootloader später eventuell nicht. Bei zwei ähnlichen HP-ProDesk-Geräten ist das im Werkszustand praktisch immer beidseitig UEFI.</w:t>
+      </w:r>
+    </w:p>
+    <w:p>
+      <w:pPr>
+        <w:pStyle w:val="Heading2"/>
+        <w:spacing w:after="80" w:before="240"/>
+      </w:pPr>
+      <w:r>
+        <w:rPr>
+          <w:rFonts w:ascii="Arial" w:cs="Arial" w:eastAsia="Arial" w:hAnsi="Arial"/>
+          <w:b/>
+          <w:bCs/>
+          <w:color w:val="1F5C99"/>
+          <w:sz w:val="22"/>
+          <w:szCs w:val="22"/>
+        </w:rPr>
+        <w:t xml:space="preserve">14.4 Klon-Methoden im Überblick</w:t>
+      </w:r>
+    </w:p>
+    <w:p>
+      <w:pPr>
+        <w:spacing w:after="80"/>
+      </w:pPr>
+      <w:r>
+        <w:rPr>
+          <w:rFonts w:ascii="Arial" w:cs="Arial" w:eastAsia="Arial" w:hAnsi="Arial"/>
+          <w:color w:val="404040"/>
+          <w:sz w:val="20"/>
+          <w:szCs w:val="20"/>
+        </w:rPr>
+        <w:t xml:space="preserve">Drei grundsätzliche Wege, die beiden Platten zu verbinden:</w:t>
+      </w:r>
+    </w:p>
+    <w:p>
+      <w:pPr>
+        <w:pStyle w:val="ListParagraph"/>
+        <w:numPr>
+          <w:ilvl w:val="0"/>
+          <w:numId w:val="2"/>
+        </w:numPr>
+        <w:spacing w:after="60"/>
+      </w:pPr>
+      <w:r>
+        <w:rPr>
+          <w:rFonts w:ascii="Arial" w:cs="Arial" w:eastAsia="Arial" w:hAnsi="Arial"/>
+          <w:color w:val="404040"/>
+          <w:sz w:val="20"/>
+          <w:szCs w:val="20"/>
+        </w:rPr>
+        <w:t xml:space="preserve">Über ein Zwischen-Image: erst am Quell-PC sichern („device-image“) auf eine externe Platte oder einen Netzwerk-Share, dann am Ziel-PC zurückspielen („image-device“). Mehr Schritte, dafür liegt danach auch gleich ein Backup vor.</w:t>
+      </w:r>
+    </w:p>
+    <w:p>
+      <w:pPr>
+        <w:pStyle w:val="ListParagraph"/>
+        <w:numPr>
+          <w:ilvl w:val="0"/>
+          <w:numId w:val="2"/>
+        </w:numPr>
+        <w:spacing w:after="60"/>
+      </w:pPr>
+      <w:r>
+        <w:rPr>
+          <w:rFonts w:ascii="Arial" w:cs="Arial" w:eastAsia="Arial" w:hAnsi="Arial"/>
+          <w:color w:val="404040"/>
+          <w:sz w:val="20"/>
+          <w:szCs w:val="20"/>
+        </w:rPr>
+        <w:t xml:space="preserve">Beide Platten an einem PC: Zielplatte zusätzlich einbauen oder per USB-SATA-Adapter anschliessen, dann „device-device“ direkt in einem Rutsch, ohne Zwischenspeicher.</w:t>
+      </w:r>
+    </w:p>
+    <w:p>
+      <w:pPr>
+        <w:pStyle w:val="ListParagraph"/>
+        <w:numPr>
+          <w:ilvl w:val="0"/>
+          <w:numId w:val="2"/>
+        </w:numPr>
+        <w:spacing w:after="60"/>
+      </w:pPr>
+      <w:r>
+        <w:rPr>
+          <w:rFonts w:ascii="Arial" w:cs="Arial" w:eastAsia="Arial" w:hAnsi="Arial"/>
+          <w:color w:val="404040"/>
+          <w:sz w:val="20"/>
+          <w:szCs w:val="20"/>
+        </w:rPr>
+        <w:t xml:space="preserve">Beide PCs gleichzeitig übers Netzwerk: direkter Klon zwischen den beiden laufenden Live-Systemen, kein Kabel/Adapter nötig. Siehe 14.5 — dieser Weg wird hier im Detail beschrieben.</w:t>
+      </w:r>
+    </w:p>
+    <w:p>
+      <w:pPr>
+        <w:pStyle w:val="Heading2"/>
+        <w:spacing w:after="80" w:before="240"/>
+      </w:pPr>
+      <w:r>
+        <w:rPr>
+          <w:rFonts w:ascii="Arial" w:cs="Arial" w:eastAsia="Arial" w:hAnsi="Arial"/>
+          <w:b/>
+          <w:bCs/>
+          <w:color w:val="1F5C99"/>
+          <w:sz w:val="22"/>
+          <w:szCs w:val="22"/>
+        </w:rPr>
+        <w:t xml:space="preserve">14.5 Direkter Netzwerk-Klon (PC-zu-PC, ohne Zwischenspeicher)</w:t>
+      </w:r>
+    </w:p>
+    <w:p>
+      <w:pPr>
+        <w:spacing w:after="80"/>
+      </w:pPr>
+      <w:r>
+        <w:rPr>
+          <w:rFonts w:ascii="Arial" w:cs="Arial" w:eastAsia="Arial" w:hAnsi="Arial"/>
+          <w:color w:val="404040"/>
+          <w:sz w:val="20"/>
+          <w:szCs w:val="20"/>
+        </w:rPr>
+        <w:t xml:space="preserve">Clonezillas geführte Oberfläche bietet keinen sauberen Menüpunkt für einen reinen Netzwerk-Klon ohne Zwischen-Image. Die Netzwerkfunktionen (SSH-/Samba-/NFS-Ziel, „Lite Server“) laufen immer über ein Image. Ein echter direkter Klon zwischen zwei Maschinen läuft daher über die Shell, die im Live-System bereits mit dd, ssh und Netzwerk-Tools bereitsteht.</w:t>
+      </w:r>
+    </w:p>
+    <w:p>
+      <w:pPr>
+        <w:pStyle w:val="Heading3"/>
+        <w:spacing w:after="60" w:before="160"/>
+      </w:pPr>
+      <w:r>
+        <w:rPr>
+          <w:rFonts w:ascii="Arial" w:cs="Arial" w:eastAsia="Arial" w:hAnsi="Arial"/>
+          <w:b/>
+          <w:bCs/>
+          <w:color w:val="404040"/>
+          <w:sz w:val="20"/>
+          <w:szCs w:val="20"/>
+        </w:rPr>
+        <w:t xml:space="preserve">14.5.1 In die Shell wechseln</w:t>
+      </w:r>
+    </w:p>
+    <w:p>
+      <w:pPr>
+        <w:spacing w:after="80"/>
+      </w:pPr>
+      <w:r>
+        <w:rPr>
+          <w:rFonts w:ascii="Arial" w:cs="Arial" w:eastAsia="Arial" w:hAnsi="Arial"/>
+          <w:color w:val="404040"/>
+          <w:sz w:val="20"/>
+          <w:szCs w:val="20"/>
+        </w:rPr>
+        <w:t xml:space="preserve">Im Clonezilla-Startmenü nicht „Start_Clonezilla“ wählen, sondern „Enter_shell“. Das auf beiden PCs durchführen.</w:t>
+      </w:r>
+    </w:p>
+    <w:p>
+      <w:pPr>
+        <w:pStyle w:val="Heading3"/>
+        <w:spacing w:after="60" w:before="160"/>
+      </w:pPr>
+      <w:r>
+        <w:rPr>
+          <w:rFonts w:ascii="Arial" w:cs="Arial" w:eastAsia="Arial" w:hAnsi="Arial"/>
+          <w:b/>
+          <w:bCs/>
+          <w:color w:val="404040"/>
+          <w:sz w:val="20"/>
+          <w:szCs w:val="20"/>
+        </w:rPr>
+        <w:t xml:space="preserve">14.5.2 Netzwerk auf dem Ziel-PC einrichten</w:t>
+      </w:r>
+    </w:p>
+    <w:p>
+      <w:pPr>
+        <w:spacing w:after="80"/>
+      </w:pPr>
+      <w:r>
+        <w:rPr>
+          <w:rFonts w:ascii="Arial" w:cs="Arial" w:eastAsia="Arial" w:hAnsi="Arial"/>
+          <w:color w:val="404040"/>
+          <w:sz w:val="20"/>
+          <w:szCs w:val="20"/>
+        </w:rPr>
+        <w:t xml:space="preserve">Interface-Namen und Status prüfen:</w:t>
+      </w:r>
+    </w:p>
+    <w:p>
+      <w:pPr>
+        <w:shd w:fill="F0F0F0" w:val="clear"/>
+        <w:spacing w:after="80"/>
+        <w:ind w:left="360"/>
+      </w:pPr>
+      <w:r>
+        <w:rPr>
+          <w:rFonts w:ascii="Courier New" w:cs="Courier New" w:eastAsia="Courier New" w:hAnsi="Courier New"/>
+          <w:color w:val="1A1A1A"/>
+          <w:sz w:val="18"/>
+          <w:szCs w:val="18"/>
+        </w:rPr>
+        <w:t xml:space="preserve">ip link</w:t>
+      </w:r>
+    </w:p>
+    <w:p>
+      <w:pPr>
+        <w:spacing w:after="80"/>
+      </w:pPr>
+      <w:r>
+        <w:rPr>
+          <w:rFonts w:ascii="Arial" w:cs="Arial" w:eastAsia="Arial" w:hAnsi="Arial"/>
+          <w:color w:val="404040"/>
+          <w:sz w:val="20"/>
+          <w:szCs w:val="20"/>
+        </w:rPr>
+        <w:t xml:space="preserve">Zeigt state DOWN oder NO-CARRIER → Kabel/Switch-Port prüfen, dann Interface aktivieren (Namen aus obigem Befehl einsetzen):</w:t>
+      </w:r>
+    </w:p>
+    <w:p>
+      <w:pPr>
+        <w:shd w:fill="F0F0F0" w:val="clear"/>
+        <w:spacing w:after="80"/>
+        <w:ind w:left="360"/>
+      </w:pPr>
+      <w:r>
+        <w:rPr>
+          <w:rFonts w:ascii="Courier New" w:cs="Courier New" w:eastAsia="Courier New" w:hAnsi="Courier New"/>
+          <w:color w:val="1A1A1A"/>
+          <w:sz w:val="18"/>
+          <w:szCs w:val="18"/>
+        </w:rPr>
+        <w:t xml:space="preserve">sudo ip link set &lt;interface&gt; up</w:t>
+      </w:r>
+    </w:p>
+    <w:p>
+      <w:pPr>
+        <w:spacing w:after="80"/>
+      </w:pPr>
+      <w:r>
+        <w:rPr>
+          <w:rFonts w:ascii="Arial" w:cs="Arial" w:eastAsia="Arial" w:hAnsi="Arial"/>
+          <w:color w:val="404040"/>
+          <w:sz w:val="20"/>
+          <w:szCs w:val="20"/>
+        </w:rPr>
+        <w:t xml:space="preserve">Per DHCP eine Adresse anfordern:</w:t>
+      </w:r>
+    </w:p>
+    <w:p>
+      <w:pPr>
+        <w:shd w:fill="F0F0F0" w:val="clear"/>
+        <w:spacing w:after="80"/>
+        <w:ind w:left="360"/>
+      </w:pPr>
+      <w:r>
+        <w:rPr>
+          <w:rFonts w:ascii="Courier New" w:cs="Courier New" w:eastAsia="Courier New" w:hAnsi="Courier New"/>
+          <w:color w:val="1A1A1A"/>
+          <w:sz w:val="18"/>
+          <w:szCs w:val="18"/>
+        </w:rPr>
+        <w:t xml:space="preserve">sudo dhclient -v &lt;interface&gt;</w:t>
+      </w:r>
+    </w:p>
+    <w:p>
+      <w:pPr>
+        <w:shd w:fill="F0F0F0" w:val="clear"/>
+        <w:spacing w:after="80"/>
+        <w:ind w:left="360"/>
+      </w:pPr>
+      <w:r>
+        <w:rPr>
+          <w:rFonts w:ascii="Courier New" w:cs="Courier New" w:eastAsia="Courier New" w:hAnsi="Courier New"/>
+          <w:color w:val="1A1A1A"/>
+          <w:sz w:val="18"/>
+          <w:szCs w:val="18"/>
+        </w:rPr>
+        <w:t xml:space="preserve">ip a</w:t>
+      </w:r>
+    </w:p>
+    <w:p>
+      <w:pPr>
+        <w:spacing w:after="80"/>
+      </w:pPr>
+      <w:r>
+        <w:rPr>
+          <w:rFonts w:ascii="Arial" w:cs="Arial" w:eastAsia="Arial" w:hAnsi="Arial"/>
+          <w:color w:val="404040"/>
+          <w:sz w:val="20"/>
+          <w:szCs w:val="20"/>
+        </w:rPr>
+        <w:t xml:space="preserve">Kommt auch über dhclient keine Adresse (z. B. weil DHCP auf diesem Port/VLAN eingeschränkt ist), die IP manuell passend zum Ziel-LAN setzen:</w:t>
+      </w:r>
+    </w:p>
+    <w:p>
+      <w:pPr>
+        <w:shd w:fill="F0F0F0" w:val="clear"/>
+        <w:spacing w:after="80"/>
+        <w:ind w:left="360"/>
+      </w:pPr>
+      <w:r>
+        <w:rPr>
+          <w:rFonts w:ascii="Courier New" w:cs="Courier New" w:eastAsia="Courier New" w:hAnsi="Courier New"/>
+          <w:color w:val="1A1A1A"/>
+          <w:sz w:val="18"/>
+          <w:szCs w:val="18"/>
+        </w:rPr>
+        <w:t xml:space="preserve">sudo ip addr add &lt;FREIE-IP&gt;/24 dev &lt;interface&gt;</w:t>
+      </w:r>
+    </w:p>
+    <w:p>
+      <w:pPr>
+        <w:shd w:fill="F0F0F0" w:val="clear"/>
+        <w:spacing w:after="80"/>
+        <w:ind w:left="360"/>
+      </w:pPr>
+      <w:r>
+        <w:rPr>
+          <w:rFonts w:ascii="Courier New" w:cs="Courier New" w:eastAsia="Courier New" w:hAnsi="Courier New"/>
+          <w:color w:val="1A1A1A"/>
+          <w:sz w:val="18"/>
+          <w:szCs w:val="18"/>
+        </w:rPr>
+        <w:t xml:space="preserve">sudo ip route add default via &lt;GATEWAY-IP&gt;</w:t>
+      </w:r>
+    </w:p>
+    <w:p>
+      <w:pPr>
+        <w:pStyle w:val="Heading3"/>
+        <w:spacing w:after="60" w:before="160"/>
+      </w:pPr>
+      <w:r>
+        <w:rPr>
+          <w:rFonts w:ascii="Arial" w:cs="Arial" w:eastAsia="Arial" w:hAnsi="Arial"/>
+          <w:b/>
+          <w:bCs/>
+          <w:color w:val="404040"/>
+          <w:sz w:val="20"/>
+          <w:szCs w:val="20"/>
+        </w:rPr>
+        <w:t xml:space="preserve">14.5.3 SSH-Zugriff auf dem Ziel-PC vorbereiten</w:t>
+      </w:r>
+    </w:p>
+    <w:p>
+      <w:pPr>
+        <w:shd w:fill="F0F0F0" w:val="clear"/>
+        <w:spacing w:after="80"/>
+        <w:ind w:left="360"/>
+      </w:pPr>
+      <w:r>
+        <w:rPr>
+          <w:rFonts w:ascii="Courier New" w:cs="Courier New" w:eastAsia="Courier New" w:hAnsi="Courier New"/>
+          <w:color w:val="1A1A1A"/>
+          <w:sz w:val="18"/>
+          <w:szCs w:val="18"/>
+        </w:rPr>
+        <w:t xml:space="preserve">sudo passwd              # Root-Passwort setzen, für SSH-Login nötig</w:t>
+      </w:r>
+    </w:p>
+    <w:p>
+      <w:pPr>
+        <w:shd w:fill="F0F0F0" w:val="clear"/>
+        <w:spacing w:after="80"/>
+        <w:ind w:left="360"/>
+      </w:pPr>
+      <w:r>
+        <w:rPr>
+          <w:rFonts w:ascii="Courier New" w:cs="Courier New" w:eastAsia="Courier New" w:hAnsi="Courier New"/>
+          <w:color w:val="1A1A1A"/>
+          <w:sz w:val="18"/>
+          <w:szCs w:val="18"/>
+        </w:rPr>
+        <w:t xml:space="preserve">sudo service ssh start   # falls SSH-Dienst noch nicht läuft</w:t>
+      </w:r>
+    </w:p>
+    <w:p>
+      <w:pPr>
+        <w:shd w:fill="F0F0F0" w:val="clear"/>
+        <w:spacing w:after="80"/>
+        <w:ind w:left="360"/>
+      </w:pPr>
+      <w:r>
+        <w:rPr>
+          <w:rFonts w:ascii="Courier New" w:cs="Courier New" w:eastAsia="Courier New" w:hAnsi="Courier New"/>
+          <w:color w:val="1A1A1A"/>
+          <w:sz w:val="18"/>
+          <w:szCs w:val="18"/>
+        </w:rPr>
+        <w:t xml:space="preserve">ip a                     # IP-Adresse notieren</w:t>
+      </w:r>
+    </w:p>
+    <w:p>
+      <w:pPr>
+        <w:pStyle w:val="Heading3"/>
+        <w:spacing w:after="60" w:before="160"/>
+      </w:pPr>
+      <w:r>
+        <w:rPr>
+          <w:rFonts w:ascii="Arial" w:cs="Arial" w:eastAsia="Arial" w:hAnsi="Arial"/>
+          <w:b/>
+          <w:bCs/>
+          <w:color w:val="404040"/>
+          <w:sz w:val="20"/>
+          <w:szCs w:val="20"/>
+        </w:rPr>
+        <w:t xml:space="preserve">14.5.4 Platten identifizieren</w:t>
+      </w:r>
+    </w:p>
+    <w:p>
+      <w:pPr>
+        <w:spacing w:after="80"/>
+      </w:pPr>
+      <w:r>
+        <w:rPr>
+          <w:rFonts w:ascii="Arial" w:cs="Arial" w:eastAsia="Arial" w:hAnsi="Arial"/>
+          <w:color w:val="404040"/>
+          <w:sz w:val="20"/>
+          <w:szCs w:val="20"/>
+        </w:rPr>
+        <w:t xml:space="preserve">Auf beiden PCs die Disk-Bezeichnung prüfen — nicht blind übernehmen, da sie je nach Controller variiert (z. B. /dev/sda vs. /dev/nvme0n1):</w:t>
+      </w:r>
+    </w:p>
+    <w:p>
+      <w:pPr>
+        <w:shd w:fill="F0F0F0" w:val="clear"/>
+        <w:spacing w:after="80"/>
+        <w:ind w:left="360"/>
+      </w:pPr>
+      <w:r>
+        <w:rPr>
+          <w:rFonts w:ascii="Courier New" w:cs="Courier New" w:eastAsia="Courier New" w:hAnsi="Courier New"/>
+          <w:color w:val="1A1A1A"/>
+          <w:sz w:val="18"/>
+          <w:szCs w:val="18"/>
+        </w:rPr>
+        <w:t xml:space="preserve">lsblk</w:t>
+      </w:r>
+    </w:p>
+    <w:p>
+      <w:pPr>
+        <w:pStyle w:val="Heading3"/>
+        <w:spacing w:after="60" w:before="160"/>
+      </w:pPr>
+      <w:r>
+        <w:rPr>
+          <w:rFonts w:ascii="Arial" w:cs="Arial" w:eastAsia="Arial" w:hAnsi="Arial"/>
+          <w:b/>
+          <w:bCs/>
+          <w:color w:val="404040"/>
+          <w:sz w:val="20"/>
+          <w:szCs w:val="20"/>
+        </w:rPr>
+        <w:t xml:space="preserve">14.5.5 Klonen: direkter Disk-zu-Disk-Klon über SSH</w:t>
+      </w:r>
+    </w:p>
+    <w:p>
+      <w:pPr>
+        <w:spacing w:after="80"/>
+      </w:pPr>
+      <w:r>
+        <w:rPr>
+          <w:rFonts w:ascii="Arial" w:cs="Arial" w:eastAsia="Arial" w:hAnsi="Arial"/>
+          <w:color w:val="404040"/>
+          <w:sz w:val="20"/>
+          <w:szCs w:val="20"/>
+        </w:rPr>
+        <w:t xml:space="preserve">Auf dem Quell-PC ausführen (Platzhalter durch die tatsächlichen Werte aus 14.5.3/14.5.4 ersetzen):</w:t>
+      </w:r>
+    </w:p>
+    <w:p>
+      <w:pPr>
+        <w:shd w:fill="F0F0F0" w:val="clear"/>
+        <w:spacing w:after="80"/>
+        <w:ind w:left="360"/>
+      </w:pPr>
+      <w:r>
+        <w:rPr>
+          <w:rFonts w:ascii="Courier New" w:cs="Courier New" w:eastAsia="Courier New" w:hAnsi="Courier New"/>
+          <w:color w:val="1A1A1A"/>
+          <w:sz w:val="18"/>
+          <w:szCs w:val="18"/>
+        </w:rPr>
+        <w:t xml:space="preserve">sudo dd if=&lt;QUELL-DISK&gt; bs=4M status=progress \</w:t>
+      </w:r>
+    </w:p>
+    <w:p>
+      <w:pPr>
+        <w:shd w:fill="F0F0F0" w:val="clear"/>
+        <w:spacing w:after="80"/>
+        <w:ind w:left="360"/>
+      </w:pPr>
+      <w:r>
+        <w:rPr>
+          <w:rFonts w:ascii="Courier New" w:cs="Courier New" w:eastAsia="Courier New" w:hAnsi="Courier New"/>
+          <w:color w:val="1A1A1A"/>
+          <w:sz w:val="18"/>
+          <w:szCs w:val="18"/>
+        </w:rPr>
+        <w:t xml:space="preserve">  | ssh root@&lt;ZIEL-IP&gt; "dd of=&lt;ZIEL-DISK&gt; bs=4M"</w:t>
+      </w:r>
+    </w:p>
+    <w:p>
+      <w:pPr>
+        <w:spacing w:after="80"/>
+      </w:pPr>
+      <w:r>
+        <w:rPr>
+          <w:rFonts w:ascii="Arial" w:cs="Arial" w:eastAsia="Arial" w:hAnsi="Arial"/>
+          <w:color w:val="404040"/>
+          <w:sz w:val="20"/>
+          <w:szCs w:val="20"/>
+        </w:rPr>
+        <w:t xml:space="preserve">Beispiel mit konkreten Werten:</w:t>
+      </w:r>
+    </w:p>
+    <w:p>
+      <w:pPr>
+        <w:shd w:fill="F0F0F0" w:val="clear"/>
+        <w:spacing w:after="80"/>
+        <w:ind w:left="360"/>
+      </w:pPr>
+      <w:r>
+        <w:rPr>
+          <w:rFonts w:ascii="Courier New" w:cs="Courier New" w:eastAsia="Courier New" w:hAnsi="Courier New"/>
+          <w:color w:val="1A1A1A"/>
+          <w:sz w:val="18"/>
+          <w:szCs w:val="18"/>
+        </w:rPr>
+        <w:t xml:space="preserve">sudo dd if=/dev/sda bs=4M status=progress \</w:t>
+      </w:r>
+    </w:p>
+    <w:p>
+      <w:pPr>
+        <w:shd w:fill="F0F0F0" w:val="clear"/>
+        <w:spacing w:after="80"/>
+        <w:ind w:left="360"/>
+      </w:pPr>
+      <w:r>
+        <w:rPr>
+          <w:rFonts w:ascii="Courier New" w:cs="Courier New" w:eastAsia="Courier New" w:hAnsi="Courier New"/>
+          <w:color w:val="1A1A1A"/>
+          <w:sz w:val="18"/>
+          <w:szCs w:val="18"/>
+        </w:rPr>
+        <w:t xml:space="preserve">  | ssh root@192.168.1.150 "dd of=/dev/sda bs=4M"</w:t>
+      </w:r>
+    </w:p>
+    <w:p>
+      <w:pPr>
+        <w:spacing w:after="80"/>
+      </w:pPr>
+      <w:r>
+        <w:rPr>
+          <w:rFonts w:ascii="Arial" w:cs="Arial" w:eastAsia="Arial" w:hAnsi="Arial"/>
+          <w:b/>
+          <w:bCs/>
+          <w:color w:val="CC0000"/>
+          <w:sz w:val="20"/>
+          <w:szCs w:val="20"/>
+        </w:rPr>
+        <w:t xml:space="preserve">Hinweis: </w:t>
+      </w:r>
+      <w:r>
+        <w:rPr>
+          <w:rFonts w:ascii="Arial" w:cs="Arial" w:eastAsia="Arial" w:hAnsi="Arial"/>
+          <w:color w:val="404040"/>
+          <w:sz w:val="20"/>
+          <w:szCs w:val="20"/>
+        </w:rPr>
+        <w:t xml:space="preserve">Quelle und Ziel nicht verwechseln — der Befehl überschreibt die Zielplatte vollständig und ohne Rückfrage. &lt;QUELL-DISK&gt; ist immer die Platte des bestehenden Servers, &lt;ZIEL-DISK&gt; immer die leere Platte des neuen PCs.</w:t>
+      </w:r>
+    </w:p>
+    <w:p>
+      <w:pPr>
+        <w:spacing w:after="80"/>
+      </w:pPr>
+      <w:r>
+        <w:rPr>
+          <w:rFonts w:ascii="Arial" w:cs="Arial" w:eastAsia="Arial" w:hAnsi="Arial"/>
+          <w:color w:val="404040"/>
+          <w:sz w:val="20"/>
+          <w:szCs w:val="20"/>
+        </w:rPr>
+        <w:t xml:space="preserve">Dauer je nach Netzwerktempo und Plattengrösse: bei Gigabit-LAN und einer SSD im hohen zweistelligen GB-Bereich meist 20–60 Minuten.</w:t>
+      </w:r>
+    </w:p>
+    <w:p>
+      <w:pPr>
+        <w:pStyle w:val="Heading3"/>
+        <w:spacing w:after="60" w:before="160"/>
+      </w:pPr>
+      <w:r>
+        <w:rPr>
+          <w:rFonts w:ascii="Arial" w:cs="Arial" w:eastAsia="Arial" w:hAnsi="Arial"/>
+          <w:b/>
+          <w:bCs/>
+          <w:color w:val="404040"/>
+          <w:sz w:val="20"/>
+          <w:szCs w:val="20"/>
+        </w:rPr>
+        <w:t xml:space="preserve">14.5.6 Alternative: Als komprimierte Image-Datei sichern (statt Direkt-Klon)</w:t>
+      </w:r>
+    </w:p>
+    <w:p>
+      <w:pPr>
+        <w:spacing w:after="80"/>
+      </w:pPr>
+      <w:r>
+        <w:rPr>
+          <w:rFonts w:ascii="Arial" w:cs="Arial" w:eastAsia="Arial" w:hAnsi="Arial"/>
+          <w:color w:val="404040"/>
+          <w:sz w:val="20"/>
+          <w:szCs w:val="20"/>
+        </w:rPr>
+        <w:t xml:space="preserve">Soll statt eines direkten Klons zunächst nur ein Abbild der Platte auf einen dritten Rechner (z. B. das NAS) gesichert werden, lässt sich derselbe Mechanismus generalisiert auch dafür nutzen — Quelle bleibt der Server, Ziel ist diesmal ein beliebiger Rechner mit genug Speicherplatz und laufendem SSH-Server:</w:t>
+      </w:r>
+    </w:p>
+    <w:p>
+      <w:pPr>
+        <w:shd w:fill="F0F0F0" w:val="clear"/>
+        <w:spacing w:after="80"/>
+        <w:ind w:left="360"/>
+      </w:pPr>
+      <w:r>
+        <w:rPr>
+          <w:rFonts w:ascii="Courier New" w:cs="Courier New" w:eastAsia="Courier New" w:hAnsi="Courier New"/>
+          <w:color w:val="1A1A1A"/>
+          <w:sz w:val="18"/>
+          <w:szCs w:val="18"/>
+        </w:rPr>
+        <w:t xml:space="preserve">ssh root@&lt;QUELL-IP&gt; "dd if=&lt;QUELL-DISK&gt; bs=4M status=progress | gzip -1" \</w:t>
+      </w:r>
+    </w:p>
+    <w:p>
+      <w:pPr>
+        <w:shd w:fill="F0F0F0" w:val="clear"/>
+        <w:spacing w:after="80"/>
+        <w:ind w:left="360"/>
+      </w:pPr>
+      <w:r>
+        <w:rPr>
+          <w:rFonts w:ascii="Courier New" w:cs="Courier New" w:eastAsia="Courier New" w:hAnsi="Courier New"/>
+          <w:color w:val="1A1A1A"/>
+          <w:sz w:val="18"/>
+          <w:szCs w:val="18"/>
+        </w:rPr>
+        <w:t xml:space="preserve">  &gt; &lt;ZIEL-DATEINAME&gt;_$(date +%Y%m%d).img.gz</w:t>
+      </w:r>
+    </w:p>
+    <w:p>
+      <w:pPr>
+        <w:spacing w:after="80"/>
+      </w:pPr>
+      <w:r>
+        <w:rPr>
+          <w:rFonts w:ascii="Arial" w:cs="Arial" w:eastAsia="Arial" w:hAnsi="Arial"/>
+          <w:color w:val="404040"/>
+          <w:sz w:val="20"/>
+          <w:szCs w:val="20"/>
+        </w:rPr>
+        <w:t xml:space="preserve">Dieser Befehl läuft auf dem Rechner, der die Datei empfangen und speichern soll (z. B. dem Mac oder der DS1517+), und zieht die Daten aktiv vom Server (&lt;QUELL-IP&gt;). &lt;ZIEL-DATEINAME&gt; frei wählbar, z. B. der Hostname des Quell-Servers. Rückspielen später auf eine (leere) Zielplatte:</w:t>
+      </w:r>
+    </w:p>
+    <w:p>
+      <w:pPr>
+        <w:shd w:fill="F0F0F0" w:val="clear"/>
+        <w:spacing w:after="80"/>
+        <w:ind w:left="360"/>
+      </w:pPr>
+      <w:r>
+        <w:rPr>
+          <w:rFonts w:ascii="Courier New" w:cs="Courier New" w:eastAsia="Courier New" w:hAnsi="Courier New"/>
+          <w:color w:val="1A1A1A"/>
+          <w:sz w:val="18"/>
+          <w:szCs w:val="18"/>
+        </w:rPr>
+        <w:t xml:space="preserve">gunzip -c &lt;ZIEL-DATEINAME&gt;_&lt;DATUM&gt;.img.gz \</w:t>
+      </w:r>
+    </w:p>
+    <w:p>
+      <w:pPr>
+        <w:shd w:fill="F0F0F0" w:val="clear"/>
+        <w:spacing w:after="80"/>
+        <w:ind w:left="360"/>
+      </w:pPr>
+      <w:r>
+        <w:rPr>
+          <w:rFonts w:ascii="Courier New" w:cs="Courier New" w:eastAsia="Courier New" w:hAnsi="Courier New"/>
+          <w:color w:val="1A1A1A"/>
+          <w:sz w:val="18"/>
+          <w:szCs w:val="18"/>
+        </w:rPr>
+        <w:t xml:space="preserve">  | ssh root@&lt;ZIEL-IP&gt; "dd of=&lt;ZIEL-DISK&gt; bs=4M"</w:t>
+      </w:r>
+    </w:p>
+    <w:p>
+      <w:pPr>
+        <w:pStyle w:val="Heading2"/>
+        <w:spacing w:after="80" w:before="240"/>
+      </w:pPr>
+      <w:r>
+        <w:rPr>
+          <w:rFonts w:ascii="Arial" w:cs="Arial" w:eastAsia="Arial" w:hAnsi="Arial"/>
+          <w:b/>
+          <w:bCs/>
+          <w:color w:val="1F5C99"/>
+          <w:sz w:val="22"/>
+          <w:szCs w:val="22"/>
+        </w:rPr>
+        <w:t xml:space="preserve">14.6 Nach dem Klonen: Ziel-PC anpassen</w:t>
+      </w:r>
+    </w:p>
+    <w:p>
+      <w:pPr>
+        <w:spacing w:after="80"/>
+      </w:pPr>
+      <w:r>
+        <w:rPr>
+          <w:rFonts w:ascii="Arial" w:cs="Arial" w:eastAsia="Arial" w:hAnsi="Arial"/>
+          <w:color w:val="404040"/>
+          <w:sz w:val="20"/>
+          <w:szCs w:val="20"/>
+        </w:rPr>
+        <w:t xml:space="preserve">Der Ziel-PC hat nun eine exakte Kopie des Quell-Systems — inklusive IP-Adresse, Hostname und SSH-Identität. Damit beide Maschinen gleichzeitig im selben Netz laufen können, vor dem ersten Produktivbetrieb anpassen:</w:t>
+      </w:r>
+    </w:p>
+    <w:p>
+      <w:pPr>
+        <w:pStyle w:val="Heading3"/>
+        <w:spacing w:after="60" w:before="160"/>
+      </w:pPr>
+      <w:r>
+        <w:rPr>
+          <w:rFonts w:ascii="Arial" w:cs="Arial" w:eastAsia="Arial" w:hAnsi="Arial"/>
+          <w:b/>
+          <w:bCs/>
+          <w:color w:val="404040"/>
+          <w:sz w:val="20"/>
+          <w:szCs w:val="20"/>
+        </w:rPr>
+        <w:t xml:space="preserve">14.6.1 IP-Adresse ändern</w:t>
+      </w:r>
+    </w:p>
+    <w:p>
+      <w:pPr>
+        <w:spacing w:after="80"/>
+      </w:pPr>
+      <w:r>
+        <w:rPr>
+          <w:rFonts w:ascii="Arial" w:cs="Arial" w:eastAsia="Arial" w:hAnsi="Arial"/>
+          <w:color w:val="404040"/>
+          <w:sz w:val="20"/>
+          <w:szCs w:val="20"/>
+        </w:rPr>
+        <w:t xml:space="preserve">Netzwerk-Konfiguration prüfen und dem Klon eine neue, noch nicht vergebene feste IP zuweisen:</w:t>
+      </w:r>
+    </w:p>
+    <w:p>
+      <w:pPr>
+        <w:shd w:fill="F0F0F0" w:val="clear"/>
+        <w:spacing w:after="80"/>
+        <w:ind w:left="360"/>
+      </w:pPr>
+      <w:r>
+        <w:rPr>
+          <w:rFonts w:ascii="Courier New" w:cs="Courier New" w:eastAsia="Courier New" w:hAnsi="Courier New"/>
+          <w:color w:val="1A1A1A"/>
+          <w:sz w:val="18"/>
+          <w:szCs w:val="18"/>
+        </w:rPr>
+        <w:t xml:space="preserve">ip a</w:t>
+      </w:r>
+    </w:p>
+    <w:p>
+      <w:pPr>
+        <w:shd w:fill="F0F0F0" w:val="clear"/>
+        <w:spacing w:after="80"/>
+        <w:ind w:left="360"/>
+      </w:pPr>
+      <w:r>
+        <w:rPr>
+          <w:rFonts w:ascii="Courier New" w:cs="Courier New" w:eastAsia="Courier New" w:hAnsi="Courier New"/>
+          <w:color w:val="1A1A1A"/>
+          <w:sz w:val="18"/>
+          <w:szCs w:val="18"/>
+        </w:rPr>
+        <w:t xml:space="preserve">cat /etc/netplan/*.yaml</w:t>
+      </w:r>
+    </w:p>
+    <w:p>
+      <w:pPr>
+        <w:pStyle w:val="Heading3"/>
+        <w:spacing w:after="60" w:before="160"/>
+      </w:pPr>
+      <w:r>
+        <w:rPr>
+          <w:rFonts w:ascii="Arial" w:cs="Arial" w:eastAsia="Arial" w:hAnsi="Arial"/>
+          <w:b/>
+          <w:bCs/>
+          <w:color w:val="404040"/>
+          <w:sz w:val="20"/>
+          <w:szCs w:val="20"/>
+        </w:rPr>
+        <w:t xml:space="preserve">14.6.2 Hostname ändern</w:t>
+      </w:r>
+    </w:p>
+    <w:p>
+      <w:pPr>
+        <w:shd w:fill="F0F0F0" w:val="clear"/>
+        <w:spacing w:after="80"/>
+        <w:ind w:left="360"/>
+      </w:pPr>
+      <w:r>
+        <w:rPr>
+          <w:rFonts w:ascii="Courier New" w:cs="Courier New" w:eastAsia="Courier New" w:hAnsi="Courier New"/>
+          <w:color w:val="1A1A1A"/>
+          <w:sz w:val="18"/>
+          <w:szCs w:val="18"/>
+        </w:rPr>
+        <w:t xml:space="preserve">sudo hostnamectl set-hostname &lt;neuer-name&gt;</w:t>
+      </w:r>
+    </w:p>
+    <w:p>
+      <w:pPr>
+        <w:pStyle w:val="Heading3"/>
+        <w:spacing w:after="60" w:before="160"/>
+      </w:pPr>
+      <w:r>
+        <w:rPr>
+          <w:rFonts w:ascii="Arial" w:cs="Arial" w:eastAsia="Arial" w:hAnsi="Arial"/>
+          <w:b/>
+          <w:bCs/>
+          <w:color w:val="404040"/>
+          <w:sz w:val="20"/>
+          <w:szCs w:val="20"/>
+        </w:rPr>
+        <w:t xml:space="preserve">14.6.3 SSH-Host-Keys neu erzeugen</w:t>
+      </w:r>
+    </w:p>
+    <w:p>
+      <w:pPr>
+        <w:spacing w:after="80"/>
+      </w:pPr>
+      <w:r>
+        <w:rPr>
+          <w:rFonts w:ascii="Arial" w:cs="Arial" w:eastAsia="Arial" w:hAnsi="Arial"/>
+          <w:color w:val="404040"/>
+          <w:sz w:val="20"/>
+          <w:szCs w:val="20"/>
+        </w:rPr>
+        <w:t xml:space="preserve">Der Klon hat identische SSH-Host-Keys wie das Original — das führt bei jedem, der beide Rechner per SSH anspricht, zur Warnung „REMOTE HOST IDENTIFICATION HAS CHANGED“:</w:t>
+      </w:r>
+    </w:p>
+    <w:p>
+      <w:pPr>
+        <w:shd w:fill="F0F0F0" w:val="clear"/>
+        <w:spacing w:after="80"/>
+        <w:ind w:left="360"/>
+      </w:pPr>
+      <w:r>
+        <w:rPr>
+          <w:rFonts w:ascii="Courier New" w:cs="Courier New" w:eastAsia="Courier New" w:hAnsi="Courier New"/>
+          <w:color w:val="1A1A1A"/>
+          <w:sz w:val="18"/>
+          <w:szCs w:val="18"/>
+        </w:rPr>
+        <w:t xml:space="preserve">sudo rm /etc/ssh/ssh_host_*</w:t>
+      </w:r>
+    </w:p>
+    <w:p>
+      <w:pPr>
+        <w:shd w:fill="F0F0F0" w:val="clear"/>
+        <w:spacing w:after="80"/>
+        <w:ind w:left="360"/>
+      </w:pPr>
+      <w:r>
+        <w:rPr>
+          <w:rFonts w:ascii="Courier New" w:cs="Courier New" w:eastAsia="Courier New" w:hAnsi="Courier New"/>
+          <w:color w:val="1A1A1A"/>
+          <w:sz w:val="18"/>
+          <w:szCs w:val="18"/>
+        </w:rPr>
+        <w:t xml:space="preserve">sudo ssh-keygen -A</w:t>
+      </w:r>
+    </w:p>
+    <w:p>
+      <w:pPr>
+        <w:pStyle w:val="Heading3"/>
+        <w:spacing w:after="60" w:before="160"/>
+      </w:pPr>
+      <w:r>
+        <w:rPr>
+          <w:rFonts w:ascii="Arial" w:cs="Arial" w:eastAsia="Arial" w:hAnsi="Arial"/>
+          <w:b/>
+          <w:bCs/>
+          <w:color w:val="404040"/>
+          <w:sz w:val="20"/>
+          <w:szCs w:val="20"/>
+        </w:rPr>
+        <w:t xml:space="preserve">14.6.4 machine-id neu setzen</w:t>
+      </w:r>
+    </w:p>
+    <w:p>
+      <w:pPr>
+        <w:spacing w:after="80"/>
+      </w:pPr>
+      <w:r>
+        <w:rPr>
+          <w:rFonts w:ascii="Arial" w:cs="Arial" w:eastAsia="Arial" w:hAnsi="Arial"/>
+          <w:color w:val="404040"/>
+          <w:sz w:val="20"/>
+          <w:szCs w:val="20"/>
+        </w:rPr>
+        <w:t xml:space="preserve">Vermeidet u. a. Verwechslungen bei DHCP-Leases und in systemd-Journalen:</w:t>
+      </w:r>
+    </w:p>
+    <w:p>
+      <w:pPr>
+        <w:shd w:fill="F0F0F0" w:val="clear"/>
+        <w:spacing w:after="80"/>
+        <w:ind w:left="360"/>
+      </w:pPr>
+      <w:r>
+        <w:rPr>
+          <w:rFonts w:ascii="Courier New" w:cs="Courier New" w:eastAsia="Courier New" w:hAnsi="Courier New"/>
+          <w:color w:val="1A1A1A"/>
+          <w:sz w:val="18"/>
+          <w:szCs w:val="18"/>
+        </w:rPr>
+        <w:t xml:space="preserve">sudo rm /etc/machine-id</w:t>
+      </w:r>
+    </w:p>
+    <w:p>
+      <w:pPr>
+        <w:shd w:fill="F0F0F0" w:val="clear"/>
+        <w:spacing w:after="80"/>
+        <w:ind w:left="360"/>
+      </w:pPr>
+      <w:r>
+        <w:rPr>
+          <w:rFonts w:ascii="Courier New" w:cs="Courier New" w:eastAsia="Courier New" w:hAnsi="Courier New"/>
+          <w:color w:val="1A1A1A"/>
+          <w:sz w:val="18"/>
+          <w:szCs w:val="18"/>
+        </w:rPr>
+        <w:t xml:space="preserve">sudo systemd-machine-id-setup</w:t>
+      </w:r>
+    </w:p>
+    <w:p>
+      <w:pPr>
+        <w:pStyle w:val="Heading3"/>
+        <w:spacing w:after="60" w:before="160"/>
+      </w:pPr>
+      <w:r>
+        <w:rPr>
+          <w:rFonts w:ascii="Arial" w:cs="Arial" w:eastAsia="Arial" w:hAnsi="Arial"/>
+          <w:b/>
+          <w:bCs/>
+          <w:color w:val="404040"/>
+          <w:sz w:val="20"/>
+          <w:szCs w:val="20"/>
+        </w:rPr>
+        <w:t xml:space="preserve">14.6.5 Partition und Dateisystem vergrössern (bei grösserer Zielplatte)</w:t>
+      </w:r>
+    </w:p>
+    <w:p>
+      <w:pPr>
+        <w:spacing w:after="80"/>
+      </w:pPr>
+      <w:r>
+        <w:rPr>
+          <w:rFonts w:ascii="Arial" w:cs="Arial" w:eastAsia="Arial" w:hAnsi="Arial"/>
+          <w:color w:val="404040"/>
+          <w:sz w:val="20"/>
+          <w:szCs w:val="20"/>
+        </w:rPr>
+        <w:t xml:space="preserve">Da dd nur die Partitionstabelle der Quellplatte 1:1 kopiert, bleibt zusätzlicher Speicherplatz auf einer grösseren Zielplatte zunächst ungenutzt. Partitionsnummer vorher mit lsblk bzw. sudo fdisk -l prüfen (bei GPT/UEFI meist Nummer 2 oder 3, nach EFI-Partition und ggf. Swap):</w:t>
+      </w:r>
+    </w:p>
+    <w:p>
+      <w:pPr>
+        <w:shd w:fill="F0F0F0" w:val="clear"/>
+        <w:spacing w:after="80"/>
+        <w:ind w:left="360"/>
+      </w:pPr>
+      <w:r>
+        <w:rPr>
+          <w:rFonts w:ascii="Courier New" w:cs="Courier New" w:eastAsia="Courier New" w:hAnsi="Courier New"/>
+          <w:color w:val="1A1A1A"/>
+          <w:sz w:val="18"/>
+          <w:szCs w:val="18"/>
+        </w:rPr>
+        <w:t xml:space="preserve">sudo growpart /dev/sda 2          # Root-Partition auf neuen Platz erweitern</w:t>
+      </w:r>
+    </w:p>
+    <w:p>
+      <w:pPr>
+        <w:shd w:fill="F0F0F0" w:val="clear"/>
+        <w:spacing w:after="80"/>
+        <w:ind w:left="360"/>
+      </w:pPr>
+      <w:r>
+        <w:rPr>
+          <w:rFonts w:ascii="Courier New" w:cs="Courier New" w:eastAsia="Courier New" w:hAnsi="Courier New"/>
+          <w:color w:val="1A1A1A"/>
+          <w:sz w:val="18"/>
+          <w:szCs w:val="18"/>
+        </w:rPr>
+        <w:t xml:space="preserve">sudo resize2fs /dev/sda2          # ext4-Dateisystem entsprechend mitwachsen lassen</w:t>
+      </w:r>
+    </w:p>
+    <w:p>
+      <w:pPr>
+        <w:pStyle w:val="Heading2"/>
+        <w:spacing w:after="80" w:before="240"/>
+      </w:pPr>
+      <w:r>
+        <w:rPr>
+          <w:rFonts w:ascii="Arial" w:cs="Arial" w:eastAsia="Arial" w:hAnsi="Arial"/>
+          <w:b/>
+          <w:bCs/>
+          <w:color w:val="1F5C99"/>
+          <w:sz w:val="22"/>
+          <w:szCs w:val="22"/>
+        </w:rPr>
+        <w:t xml:space="preserve">14.7 Kurzreferenz</w:t>
+      </w:r>
+    </w:p>
+    <w:p>
+      <w:pPr>
+        <w:spacing w:after="80"/>
+      </w:pPr>
+      <w:r>
+        <w:rPr>
+          <w:rFonts w:ascii="Arial" w:cs="Arial" w:eastAsia="Arial" w:hAnsi="Arial"/>
+          <w:color w:val="404040"/>
+          <w:sz w:val="20"/>
+          <w:szCs w:val="20"/>
+        </w:rPr>
+        <w:t xml:space="preserve">Alle Kernbefehle des direkten Netzwerk-Klons auf einen Blick:</w:t>
+      </w:r>
+    </w:p>
+    <w:p>
+      <w:pPr>
+        <w:shd w:fill="F0F0F0" w:val="clear"/>
+        <w:spacing w:after="80"/>
+        <w:ind w:left="360"/>
+      </w:pPr>
+      <w:r>
+        <w:rPr>
+          <w:rFonts w:ascii="Courier New" w:cs="Courier New" w:eastAsia="Courier New" w:hAnsi="Courier New"/>
+          <w:color w:val="1A1A1A"/>
+          <w:sz w:val="18"/>
+          <w:szCs w:val="18"/>
+        </w:rPr>
+        <w:t xml:space="preserve"># Auf dem Ziel-PC (Enter_shell):</w:t>
+      </w:r>
+    </w:p>
+    <w:p>
+      <w:pPr>
+        <w:shd w:fill="F0F0F0" w:val="clear"/>
+        <w:spacing w:after="80"/>
+        <w:ind w:left="360"/>
+      </w:pPr>
+      <w:r>
+        <w:rPr>
+          <w:rFonts w:ascii="Courier New" w:cs="Courier New" w:eastAsia="Courier New" w:hAnsi="Courier New"/>
+          <w:color w:val="1A1A1A"/>
+          <w:sz w:val="18"/>
+          <w:szCs w:val="18"/>
+        </w:rPr>
+        <w:t xml:space="preserve">sudo passwd</w:t>
+      </w:r>
+    </w:p>
+    <w:p>
+      <w:pPr>
+        <w:shd w:fill="F0F0F0" w:val="clear"/>
+        <w:spacing w:after="80"/>
+        <w:ind w:left="360"/>
+      </w:pPr>
+      <w:r>
+        <w:rPr>
+          <w:rFonts w:ascii="Courier New" w:cs="Courier New" w:eastAsia="Courier New" w:hAnsi="Courier New"/>
+          <w:color w:val="1A1A1A"/>
+          <w:sz w:val="18"/>
+          <w:szCs w:val="18"/>
+        </w:rPr>
+        <w:t xml:space="preserve">sudo service ssh start</w:t>
+      </w:r>
+    </w:p>
+    <w:p>
+      <w:pPr>
+        <w:shd w:fill="F0F0F0" w:val="clear"/>
+        <w:spacing w:after="80"/>
+        <w:ind w:left="360"/>
+      </w:pPr>
+      <w:r>
+        <w:rPr>
+          <w:rFonts w:ascii="Courier New" w:cs="Courier New" w:eastAsia="Courier New" w:hAnsi="Courier New"/>
+          <w:color w:val="1A1A1A"/>
+          <w:sz w:val="18"/>
+          <w:szCs w:val="18"/>
+        </w:rPr>
+        <w:t xml:space="preserve">ip a                                             # IP-Adresse notieren</w:t>
+      </w:r>
+    </w:p>
+    <w:p>
+      <w:pPr>
+        <w:shd w:fill="F0F0F0" w:val="clear"/>
+        <w:spacing w:after="80"/>
+        <w:ind w:left="360"/>
+      </w:pPr>
+      <w:r>
+        <w:rPr>
+          <w:rFonts w:ascii="Courier New" w:cs="Courier New" w:eastAsia="Courier New" w:hAnsi="Courier New"/>
+          <w:color w:val="1A1A1A"/>
+          <w:sz w:val="18"/>
+          <w:szCs w:val="18"/>
+        </w:rPr>
+        <w:t xml:space="preserve">lsblk                                            # Zieldisk notieren</w:t>
+      </w:r>
+    </w:p>
+    <w:p>
+      <w:pPr>
+        <w:shd w:fill="F0F0F0" w:val="clear"/>
+        <w:spacing w:after="80"/>
+        <w:ind w:left="360"/>
+      </w:pPr>
+      <w:r>
+        <w:rPr>
+          <w:rFonts w:ascii="Courier New" w:cs="Courier New" w:eastAsia="Courier New" w:hAnsi="Courier New"/>
+          <w:color w:val="1A1A1A"/>
+          <w:sz w:val="18"/>
+          <w:szCs w:val="18"/>
+        </w:rPr>
+        <w:t xml:space="preserve"/>
+      </w:r>
+    </w:p>
+    <w:p>
+      <w:pPr>
+        <w:shd w:fill="F0F0F0" w:val="clear"/>
+        <w:spacing w:after="80"/>
+        <w:ind w:left="360"/>
+      </w:pPr>
+      <w:r>
+        <w:rPr>
+          <w:rFonts w:ascii="Courier New" w:cs="Courier New" w:eastAsia="Courier New" w:hAnsi="Courier New"/>
+          <w:color w:val="1A1A1A"/>
+          <w:sz w:val="18"/>
+          <w:szCs w:val="18"/>
+        </w:rPr>
+        <w:t xml:space="preserve"># Auf dem Quell-PC (Enter_shell):</w:t>
+      </w:r>
+    </w:p>
+    <w:p>
+      <w:pPr>
+        <w:shd w:fill="F0F0F0" w:val="clear"/>
+        <w:spacing w:after="80"/>
+        <w:ind w:left="360"/>
+      </w:pPr>
+      <w:r>
+        <w:rPr>
+          <w:rFonts w:ascii="Courier New" w:cs="Courier New" w:eastAsia="Courier New" w:hAnsi="Courier New"/>
+          <w:color w:val="1A1A1A"/>
+          <w:sz w:val="18"/>
+          <w:szCs w:val="18"/>
+        </w:rPr>
+        <w:t xml:space="preserve">lsblk                                            # Quelldisk notieren</w:t>
+      </w:r>
+    </w:p>
+    <w:p>
+      <w:pPr>
+        <w:shd w:fill="F0F0F0" w:val="clear"/>
+        <w:spacing w:after="80"/>
+        <w:ind w:left="360"/>
+      </w:pPr>
+      <w:r>
+        <w:rPr>
+          <w:rFonts w:ascii="Courier New" w:cs="Courier New" w:eastAsia="Courier New" w:hAnsi="Courier New"/>
+          <w:color w:val="1A1A1A"/>
+          <w:sz w:val="18"/>
+          <w:szCs w:val="18"/>
+        </w:rPr>
+        <w:t xml:space="preserve">sudo dd if=&lt;QUELL-DISK&gt; bs=4M status=progress \</w:t>
+      </w:r>
+    </w:p>
+    <w:p>
+      <w:pPr>
+        <w:shd w:fill="F0F0F0" w:val="clear"/>
+        <w:spacing w:after="80"/>
+        <w:ind w:left="360"/>
+      </w:pPr>
+      <w:r>
+        <w:rPr>
+          <w:rFonts w:ascii="Courier New" w:cs="Courier New" w:eastAsia="Courier New" w:hAnsi="Courier New"/>
+          <w:color w:val="1A1A1A"/>
+          <w:sz w:val="18"/>
+          <w:szCs w:val="18"/>
+        </w:rPr>
+        <w:t xml:space="preserve">  | ssh root@&lt;ZIEL-IP&gt; "dd of=&lt;ZIEL-DISK&gt; bs=4M"</w:t>
+      </w:r>
+    </w:p>
+    <w:p>
+      <w:pPr>
+        <w:shd w:fill="F0F0F0" w:val="clear"/>
+        <w:spacing w:after="80"/>
+        <w:ind w:left="360"/>
+      </w:pPr>
+      <w:r>
+        <w:rPr>
+          <w:rFonts w:ascii="Courier New" w:cs="Courier New" w:eastAsia="Courier New" w:hAnsi="Courier New"/>
+          <w:color w:val="1A1A1A"/>
+          <w:sz w:val="18"/>
+          <w:szCs w:val="18"/>
+        </w:rPr>
+        <w:t xml:space="preserve"/>
+      </w:r>
+    </w:p>
+    <w:p>
+      <w:pPr>
+        <w:shd w:fill="F0F0F0" w:val="clear"/>
+        <w:spacing w:after="80"/>
+        <w:ind w:left="360"/>
+      </w:pPr>
+      <w:r>
+        <w:rPr>
+          <w:rFonts w:ascii="Courier New" w:cs="Courier New" w:eastAsia="Courier New" w:hAnsi="Courier New"/>
+          <w:color w:val="1A1A1A"/>
+          <w:sz w:val="18"/>
+          <w:szCs w:val="18"/>
+        </w:rPr>
+        <w:t xml:space="preserve"># Danach auf dem Ziel-PC:</w:t>
+      </w:r>
+    </w:p>
+    <w:p>
+      <w:pPr>
+        <w:shd w:fill="F0F0F0" w:val="clear"/>
+        <w:spacing w:after="80"/>
+        <w:ind w:left="360"/>
+      </w:pPr>
+      <w:r>
+        <w:rPr>
+          <w:rFonts w:ascii="Courier New" w:cs="Courier New" w:eastAsia="Courier New" w:hAnsi="Courier New"/>
+          <w:color w:val="1A1A1A"/>
+          <w:sz w:val="18"/>
+          <w:szCs w:val="18"/>
+        </w:rPr>
+        <w:t xml:space="preserve">sudo growpart /dev/sda 2 &amp;&amp; sudo resize2fs /dev/sda2</w:t>
+      </w:r>
+    </w:p>
+    <w:p>
+      <w:pPr>
+        <w:shd w:fill="F0F0F0" w:val="clear"/>
+        <w:spacing w:after="80"/>
+        <w:ind w:left="360"/>
+      </w:pPr>
+      <w:r>
+        <w:rPr>
+          <w:rFonts w:ascii="Courier New" w:cs="Courier New" w:eastAsia="Courier New" w:hAnsi="Courier New"/>
+          <w:color w:val="1A1A1A"/>
+          <w:sz w:val="18"/>
+          <w:szCs w:val="18"/>
+        </w:rPr>
+        <w:t xml:space="preserve">sudo hostnamectl set-hostname &lt;neuer-name&gt;</w:t>
+      </w:r>
+    </w:p>
+    <w:p>
+      <w:pPr>
+        <w:shd w:fill="F0F0F0" w:val="clear"/>
+        <w:spacing w:after="80"/>
+        <w:ind w:left="360"/>
+      </w:pPr>
+      <w:r>
+        <w:rPr>
+          <w:rFonts w:ascii="Courier New" w:cs="Courier New" w:eastAsia="Courier New" w:hAnsi="Courier New"/>
+          <w:color w:val="1A1A1A"/>
+          <w:sz w:val="18"/>
+          <w:szCs w:val="18"/>
+        </w:rPr>
+        <w:t xml:space="preserve">sudo rm /etc/ssh/ssh_host_* &amp;&amp; sudo ssh-keygen -A</w:t>
+      </w:r>
+    </w:p>
+    <w:p>
+      <w:pPr>
+        <w:shd w:fill="F0F0F0" w:val="clear"/>
+        <w:spacing w:after="80"/>
+        <w:ind w:left="360"/>
+      </w:pPr>
+      <w:r>
+        <w:rPr>
+          <w:rFonts w:ascii="Courier New" w:cs="Courier New" w:eastAsia="Courier New" w:hAnsi="Courier New"/>
+          <w:color w:val="1A1A1A"/>
+          <w:sz w:val="18"/>
+          <w:szCs w:val="18"/>
+        </w:rPr>
+        <w:t xml:space="preserve">sudo rm /etc/machine-id &amp;&amp; sudo systemd-machine-id-setup</w:t>
+      </w:r>
     </w:p>
     <w:sectPr>
       <w:headerReference w:type="default" r:id="rId7"/>

</xml_diff>

<commit_message>
Move Umlaute/NFD-NFC section from Bekannte Probleme into its own Anhang
Promote it to a standalone appendix (alongside UFW and Clonezilla)
instead of a subsection of "Bekannte Probleme und Lösungen" — it fits
the same diagnose+fix+optional-systemd-automation pattern as the other
two appendices, not the shorter operational-awareness items there.

Applied consistently in README.md, both CLAUDE.md files, and the
in-script comments across all eight install scripts. In the Word
guide, this also fixed a page-break omission from the previous pass:
the UFW/Clonezilla appendices (13./14.) never got their own page
break, so a first attempt at relocating 10.4 anchored on the wrong
page-break paragraph and swept sections 11+12 into the appendix block.
Rebuilt as 13. Anhang: Umlaute / 14. Anhang: UFW / 15. Anhang:
Clonezilla, each starting on its own page, schema-validated.

Co-Authored-By: Claude Sonnet 5 <noreply@anthropic.com>
</commit_message>
<xml_diff>
--- a/Lizmap_QGIS_Server_Installation_Guide.docx
+++ b/Lizmap_QGIS_Server_Installation_Guide.docx
@@ -11741,232 +11741,6 @@
       </w:r>
     </w:p>
     <w:p>
-      <w:pPr>
-        <w:pStyle w:val="Heading2"/>
-        <w:spacing w:after="80" w:before="240"/>
-      </w:pPr>
-      <w:r>
-        <w:rPr>
-          <w:rFonts w:ascii="Arial" w:cs="Arial" w:eastAsia="Arial" w:hAnsi="Arial"/>
-          <w:b/>
-          <w:bCs/>
-          <w:color w:val="1F5C99"/>
-          <w:sz w:val="22"/>
-          <w:szCs w:val="22"/>
-        </w:rPr>
-        <w:t xml:space="preserve">10.4 Umlaute im Dateinamen (NFD/NFC) nach Mac-Synchronisation</w:t>
-      </w:r>
-    </w:p>
-    <w:p>
-      <w:pPr>
-        <w:spacing w:after="80"/>
-      </w:pPr>
-      <w:r>
-        <w:rPr>
-          <w:rFonts w:ascii="Arial" w:cs="Arial" w:eastAsia="Arial" w:hAnsi="Arial"/>
-          <w:color w:val="404040"/>
-          <w:sz w:val="20"/>
-          <w:szCs w:val="20"/>
-        </w:rPr>
-        <w:t xml:space="preserve">Symptom: Nach dem Synchronisieren von Medien-/Upload-Verzeichnissen zwischen zwei Ubuntu-Systemen über einen Mac als Zwischenstation (z.B. via ForkLift: Ubuntu → Mac → Ubuntu) liefert der Lizmap getMedia-Endpunkt für Dateien, deren Name Umlaute oder andere Sonderzeichen enthält, einen 404 — obwohl die Datei nachweislich am erwarteten Pfad liegt.</w:t>
-      </w:r>
-    </w:p>
-    <w:p>
-      <w:pPr>
-        <w:spacing w:after="80"/>
-      </w:pPr>
-      <w:r>
-        <w:rPr>
-          <w:rFonts w:ascii="Arial" w:cs="Arial" w:eastAsia="Arial" w:hAnsi="Arial"/>
-          <w:color w:val="404040"/>
-          <w:sz w:val="20"/>
-          <w:szCs w:val="20"/>
-        </w:rPr>
-        <w:t xml:space="preserve">Ursache: macOS normalisiert Dateinamen mit Sonderzeichen beim Anlegen/Kopieren standardmässig nach Unicode NFD (zerlegte Form), Linux/PHP erwartet dagegen NFC (vorkomponierte Form). Der Dateiname aus der URL ist dadurch byte-technisch nicht identisch mit dem Namen auf der Platte, obwohl beide optisch gleich aussehen.</w:t>
-      </w:r>
-    </w:p>
-    <w:p>
-      <w:pPr>
-        <w:spacing w:after="80"/>
-      </w:pPr>
-      <w:r>
-        <w:rPr>
-          <w:rFonts w:ascii="Arial" w:cs="Arial" w:eastAsia="Arial" w:hAnsi="Arial"/>
-          <w:color w:val="404040"/>
-          <w:sz w:val="20"/>
-          <w:szCs w:val="20"/>
-        </w:rPr>
-        <w:t xml:space="preserve">Diagnose (im betroffenen Verzeichnis prüfen, welche Dateien NFD statt NFC sind):</w:t>
-      </w:r>
-    </w:p>
-    <w:p>
-      <w:pPr>
-        <w:shd w:fill="F0F0F0" w:val="clear"/>
-        <w:spacing w:after="80"/>
-        <w:ind w:left="360"/>
-      </w:pPr>
-      <w:r>
-        <w:rPr>
-          <w:rFonts w:ascii="Courier New" w:cs="Courier New" w:eastAsia="Courier New" w:hAnsi="Courier New"/>
-          <w:color w:val="1A1A1A"/>
-          <w:sz w:val="18"/>
-          <w:szCs w:val="18"/>
-        </w:rPr>
-        <w:t xml:space="preserve">cd /pfad/zum/media/upload/verzeichnis/</w:t>
-      </w:r>
-    </w:p>
-    <w:p>
-      <w:pPr>
-        <w:shd w:fill="F0F0F0" w:val="clear"/>
-        <w:spacing w:after="80"/>
-        <w:ind w:left="360"/>
-      </w:pPr>
-      <w:r>
-        <w:rPr>
-          <w:rFonts w:ascii="Courier New" w:cs="Courier New" w:eastAsia="Courier New" w:hAnsi="Courier New"/>
-          <w:color w:val="1A1A1A"/>
-          <w:sz w:val="18"/>
-          <w:szCs w:val="18"/>
-        </w:rPr>
-        <w:t xml:space="preserve">python3 -c "</w:t>
-      </w:r>
-    </w:p>
-    <w:p>
-      <w:pPr>
-        <w:shd w:fill="F0F0F0" w:val="clear"/>
-        <w:spacing w:after="80"/>
-        <w:ind w:left="360"/>
-      </w:pPr>
-      <w:r>
-        <w:rPr>
-          <w:rFonts w:ascii="Courier New" w:cs="Courier New" w:eastAsia="Courier New" w:hAnsi="Courier New"/>
-          <w:color w:val="1A1A1A"/>
-          <w:sz w:val="18"/>
-          <w:szCs w:val="18"/>
-        </w:rPr>
-        <w:t xml:space="preserve">import unicodedata, os</w:t>
-      </w:r>
-    </w:p>
-    <w:p>
-      <w:pPr>
-        <w:shd w:fill="F0F0F0" w:val="clear"/>
-        <w:spacing w:after="80"/>
-        <w:ind w:left="360"/>
-      </w:pPr>
-      <w:r>
-        <w:rPr>
-          <w:rFonts w:ascii="Courier New" w:cs="Courier New" w:eastAsia="Courier New" w:hAnsi="Courier New"/>
-          <w:color w:val="1A1A1A"/>
-          <w:sz w:val="18"/>
-          <w:szCs w:val="18"/>
-        </w:rPr>
-        <w:t xml:space="preserve">for f in os.listdir('.'):</w:t>
-      </w:r>
-    </w:p>
-    <w:p>
-      <w:pPr>
-        <w:shd w:fill="F0F0F0" w:val="clear"/>
-        <w:spacing w:after="80"/>
-        <w:ind w:left="360"/>
-      </w:pPr>
-      <w:r>
-        <w:rPr>
-          <w:rFonts w:ascii="Courier New" w:cs="Courier New" w:eastAsia="Courier New" w:hAnsi="Courier New"/>
-          <w:color w:val="1A1A1A"/>
-          <w:sz w:val="18"/>
-          <w:szCs w:val="18"/>
-        </w:rPr>
-        <w:t xml:space="preserve">    print(f, '-&gt; NFC' if unicodedata.is_normalized('NFC', f) else '-&gt; NFD/andere Form')</w:t>
-      </w:r>
-    </w:p>
-    <w:p>
-      <w:pPr>
-        <w:shd w:fill="F0F0F0" w:val="clear"/>
-        <w:spacing w:after="80"/>
-        <w:ind w:left="360"/>
-      </w:pPr>
-      <w:r>
-        <w:rPr>
-          <w:rFonts w:ascii="Courier New" w:cs="Courier New" w:eastAsia="Courier New" w:hAnsi="Courier New"/>
-          <w:color w:val="1A1A1A"/>
-          <w:sz w:val="18"/>
-          <w:szCs w:val="18"/>
-        </w:rPr>
-        <w:t xml:space="preserve">"</w:t>
-      </w:r>
-    </w:p>
-    <w:p>
-      <w:pPr>
-        <w:spacing w:after="80"/>
-      </w:pPr>
-      <w:r>
-        <w:rPr>
-          <w:rFonts w:ascii="Arial" w:cs="Arial" w:eastAsia="Arial" w:hAnsi="Arial"/>
-          <w:color w:val="404040"/>
-          <w:sz w:val="20"/>
-          <w:szCs w:val="20"/>
-        </w:rPr>
-        <w:t xml:space="preserve">Fix (einmalig, für bereits betroffene Dateien):</w:t>
-      </w:r>
-    </w:p>
-    <w:p>
-      <w:pPr>
-        <w:shd w:fill="F0F0F0" w:val="clear"/>
-        <w:spacing w:after="80"/>
-        <w:ind w:left="360"/>
-      </w:pPr>
-      <w:r>
-        <w:rPr>
-          <w:rFonts w:ascii="Courier New" w:cs="Courier New" w:eastAsia="Courier New" w:hAnsi="Courier New"/>
-          <w:color w:val="1A1A1A"/>
-          <w:sz w:val="18"/>
-          <w:szCs w:val="18"/>
-        </w:rPr>
-        <w:t xml:space="preserve">sudo apt install -y convmv</w:t>
-      </w:r>
-    </w:p>
-    <w:p>
-      <w:pPr>
-        <w:shd w:fill="F0F0F0" w:val="clear"/>
-        <w:spacing w:after="80"/>
-        <w:ind w:left="360"/>
-      </w:pPr>
-      <w:r>
-        <w:rPr>
-          <w:rFonts w:ascii="Courier New" w:cs="Courier New" w:eastAsia="Courier New" w:hAnsi="Courier New"/>
-          <w:color w:val="1A1A1A"/>
-          <w:sz w:val="18"/>
-          <w:szCs w:val="18"/>
-        </w:rPr>
-        <w:t xml:space="preserve">convmv -f utf8 -t utf8 --nfc -r --notest /srv/data/</w:t>
-      </w:r>
-    </w:p>
-    <w:p>
-      <w:pPr>
-        <w:spacing w:after="80"/>
-      </w:pPr>
-      <w:r>
-        <w:rPr>
-          <w:rFonts w:ascii="Arial" w:cs="Arial" w:eastAsia="Arial" w:hAnsi="Arial"/>
-          <w:b/>
-          <w:bCs/>
-          <w:color w:val="CC6600"/>
-          <w:sz w:val="20"/>
-          <w:szCs w:val="20"/>
-        </w:rPr>
-        <w:t xml:space="preserve">Automatisch: </w:t>
-      </w:r>
-      <w:r>
-        <w:rPr>
-          <w:rFonts w:ascii="Arial" w:cs="Arial" w:eastAsia="Arial" w:hAnsi="Arial"/>
-          <w:color w:val="404040"/>
-          <w:sz w:val="20"/>
-          <w:szCs w:val="20"/>
-        </w:rPr>
-        <w:t xml:space="preserve">Das Installationsskript kann optional einen systemd-Timer einrichten, der neu ankommende Dateien alle 15 Minuten automatisch auf NFC normalisiert — INSTALL_CONVMV_TIMER=true im Skript-Header setzen. Standard: false.</w:t>
-      </w:r>
-    </w:p>
-    <w:p>
       <w:r>
         <w:br w:type="page"/>
       </w:r>
@@ -12321,6 +12095,11 @@
       </w:hyperlink>
     </w:p>
     <w:p>
+      <w:r>
+        <w:br w:type="page"/>
+      </w:r>
+    </w:p>
+    <w:p>
       <w:pPr>
         <w:pStyle w:val="Heading1"/>
         <w:pBdr>
@@ -12337,7 +12116,241 @@
           <w:sz w:val="28"/>
           <w:szCs w:val="28"/>
         </w:rPr>
-        <w:t xml:space="preserve">13. Anhang: UFW Firewall verwalten</w:t>
+        <w:t xml:space="preserve">13. Anhang: Umlaute im Dateinamen (NFD/NFC) nach Mac-Synchronisation</w:t>
+      </w:r>
+    </w:p>
+    <w:p>
+      <w:pPr>
+        <w:spacing w:after="80"/>
+      </w:pPr>
+      <w:r>
+        <w:rPr>
+          <w:rFonts w:ascii="Arial" w:cs="Arial" w:eastAsia="Arial" w:hAnsi="Arial"/>
+          <w:color w:val="404040"/>
+          <w:sz w:val="20"/>
+          <w:szCs w:val="20"/>
+        </w:rPr>
+        <w:t xml:space="preserve">Symptom: Nach dem Synchronisieren von Medien-/Upload-Verzeichnissen zwischen zwei Ubuntu-Systemen über einen Mac als Zwischenstation (z.B. via ForkLift: Ubuntu → Mac → Ubuntu) liefert der Lizmap getMedia-Endpunkt für Dateien, deren Name Umlaute oder andere Sonderzeichen enthält, einen 404 — obwohl die Datei nachweislich am erwarteten Pfad liegt.</w:t>
+      </w:r>
+    </w:p>
+    <w:p>
+      <w:pPr>
+        <w:spacing w:after="80"/>
+      </w:pPr>
+      <w:r>
+        <w:rPr>
+          <w:rFonts w:ascii="Arial" w:cs="Arial" w:eastAsia="Arial" w:hAnsi="Arial"/>
+          <w:color w:val="404040"/>
+          <w:sz w:val="20"/>
+          <w:szCs w:val="20"/>
+        </w:rPr>
+        <w:t xml:space="preserve">Ursache: macOS normalisiert Dateinamen mit Sonderzeichen beim Anlegen/Kopieren standardmässig nach Unicode NFD (zerlegte Form), Linux/PHP erwartet dagegen NFC (vorkomponierte Form). Der Dateiname aus der URL ist dadurch byte-technisch nicht identisch mit dem Namen auf der Platte, obwohl beide optisch gleich aussehen.</w:t>
+      </w:r>
+    </w:p>
+    <w:p>
+      <w:pPr>
+        <w:spacing w:after="80"/>
+      </w:pPr>
+      <w:r>
+        <w:rPr>
+          <w:rFonts w:ascii="Arial" w:cs="Arial" w:eastAsia="Arial" w:hAnsi="Arial"/>
+          <w:color w:val="404040"/>
+          <w:sz w:val="20"/>
+          <w:szCs w:val="20"/>
+        </w:rPr>
+        <w:t xml:space="preserve">Diagnose (im betroffenen Verzeichnis prüfen, welche Dateien NFD statt NFC sind):</w:t>
+      </w:r>
+    </w:p>
+    <w:p>
+      <w:pPr>
+        <w:shd w:fill="F0F0F0" w:val="clear"/>
+        <w:spacing w:after="80"/>
+        <w:ind w:left="360"/>
+      </w:pPr>
+      <w:r>
+        <w:rPr>
+          <w:rFonts w:ascii="Courier New" w:cs="Courier New" w:eastAsia="Courier New" w:hAnsi="Courier New"/>
+          <w:color w:val="1A1A1A"/>
+          <w:sz w:val="18"/>
+          <w:szCs w:val="18"/>
+        </w:rPr>
+        <w:t xml:space="preserve">cd /pfad/zum/media/upload/verzeichnis/</w:t>
+      </w:r>
+    </w:p>
+    <w:p>
+      <w:pPr>
+        <w:shd w:fill="F0F0F0" w:val="clear"/>
+        <w:spacing w:after="80"/>
+        <w:ind w:left="360"/>
+      </w:pPr>
+      <w:r>
+        <w:rPr>
+          <w:rFonts w:ascii="Courier New" w:cs="Courier New" w:eastAsia="Courier New" w:hAnsi="Courier New"/>
+          <w:color w:val="1A1A1A"/>
+          <w:sz w:val="18"/>
+          <w:szCs w:val="18"/>
+        </w:rPr>
+        <w:t xml:space="preserve">python3 -c "</w:t>
+      </w:r>
+    </w:p>
+    <w:p>
+      <w:pPr>
+        <w:shd w:fill="F0F0F0" w:val="clear"/>
+        <w:spacing w:after="80"/>
+        <w:ind w:left="360"/>
+      </w:pPr>
+      <w:r>
+        <w:rPr>
+          <w:rFonts w:ascii="Courier New" w:cs="Courier New" w:eastAsia="Courier New" w:hAnsi="Courier New"/>
+          <w:color w:val="1A1A1A"/>
+          <w:sz w:val="18"/>
+          <w:szCs w:val="18"/>
+        </w:rPr>
+        <w:t xml:space="preserve">import unicodedata, os</w:t>
+      </w:r>
+    </w:p>
+    <w:p>
+      <w:pPr>
+        <w:shd w:fill="F0F0F0" w:val="clear"/>
+        <w:spacing w:after="80"/>
+        <w:ind w:left="360"/>
+      </w:pPr>
+      <w:r>
+        <w:rPr>
+          <w:rFonts w:ascii="Courier New" w:cs="Courier New" w:eastAsia="Courier New" w:hAnsi="Courier New"/>
+          <w:color w:val="1A1A1A"/>
+          <w:sz w:val="18"/>
+          <w:szCs w:val="18"/>
+        </w:rPr>
+        <w:t xml:space="preserve">for f in os.listdir('.'):</w:t>
+      </w:r>
+    </w:p>
+    <w:p>
+      <w:pPr>
+        <w:shd w:fill="F0F0F0" w:val="clear"/>
+        <w:spacing w:after="80"/>
+        <w:ind w:left="360"/>
+      </w:pPr>
+      <w:r>
+        <w:rPr>
+          <w:rFonts w:ascii="Courier New" w:cs="Courier New" w:eastAsia="Courier New" w:hAnsi="Courier New"/>
+          <w:color w:val="1A1A1A"/>
+          <w:sz w:val="18"/>
+          <w:szCs w:val="18"/>
+        </w:rPr>
+        <w:t xml:space="preserve">    print(f, '-&gt; NFC' if unicodedata.is_normalized('NFC', f) else '-&gt; NFD/andere Form')</w:t>
+      </w:r>
+    </w:p>
+    <w:p>
+      <w:pPr>
+        <w:shd w:fill="F0F0F0" w:val="clear"/>
+        <w:spacing w:after="80"/>
+        <w:ind w:left="360"/>
+      </w:pPr>
+      <w:r>
+        <w:rPr>
+          <w:rFonts w:ascii="Courier New" w:cs="Courier New" w:eastAsia="Courier New" w:hAnsi="Courier New"/>
+          <w:color w:val="1A1A1A"/>
+          <w:sz w:val="18"/>
+          <w:szCs w:val="18"/>
+        </w:rPr>
+        <w:t xml:space="preserve">"</w:t>
+      </w:r>
+    </w:p>
+    <w:p>
+      <w:pPr>
+        <w:spacing w:after="80"/>
+      </w:pPr>
+      <w:r>
+        <w:rPr>
+          <w:rFonts w:ascii="Arial" w:cs="Arial" w:eastAsia="Arial" w:hAnsi="Arial"/>
+          <w:color w:val="404040"/>
+          <w:sz w:val="20"/>
+          <w:szCs w:val="20"/>
+        </w:rPr>
+        <w:t xml:space="preserve">Fix (einmalig, für bereits betroffene Dateien):</w:t>
+      </w:r>
+    </w:p>
+    <w:p>
+      <w:pPr>
+        <w:shd w:fill="F0F0F0" w:val="clear"/>
+        <w:spacing w:after="80"/>
+        <w:ind w:left="360"/>
+      </w:pPr>
+      <w:r>
+        <w:rPr>
+          <w:rFonts w:ascii="Courier New" w:cs="Courier New" w:eastAsia="Courier New" w:hAnsi="Courier New"/>
+          <w:color w:val="1A1A1A"/>
+          <w:sz w:val="18"/>
+          <w:szCs w:val="18"/>
+        </w:rPr>
+        <w:t xml:space="preserve">sudo apt install -y convmv</w:t>
+      </w:r>
+    </w:p>
+    <w:p>
+      <w:pPr>
+        <w:shd w:fill="F0F0F0" w:val="clear"/>
+        <w:spacing w:after="80"/>
+        <w:ind w:left="360"/>
+      </w:pPr>
+      <w:r>
+        <w:rPr>
+          <w:rFonts w:ascii="Courier New" w:cs="Courier New" w:eastAsia="Courier New" w:hAnsi="Courier New"/>
+          <w:color w:val="1A1A1A"/>
+          <w:sz w:val="18"/>
+          <w:szCs w:val="18"/>
+        </w:rPr>
+        <w:t xml:space="preserve">convmv -f utf8 -t utf8 --nfc -r --notest /srv/data/</w:t>
+      </w:r>
+    </w:p>
+    <w:p>
+      <w:pPr>
+        <w:spacing w:after="80"/>
+      </w:pPr>
+      <w:r>
+        <w:rPr>
+          <w:rFonts w:ascii="Arial" w:cs="Arial" w:eastAsia="Arial" w:hAnsi="Arial"/>
+          <w:b/>
+          <w:bCs/>
+          <w:color w:val="CC6600"/>
+          <w:sz w:val="20"/>
+          <w:szCs w:val="20"/>
+        </w:rPr>
+        <w:t xml:space="preserve">Automatisch: </w:t>
+      </w:r>
+      <w:r>
+        <w:rPr>
+          <w:rFonts w:ascii="Arial" w:cs="Arial" w:eastAsia="Arial" w:hAnsi="Arial"/>
+          <w:color w:val="404040"/>
+          <w:sz w:val="20"/>
+          <w:szCs w:val="20"/>
+        </w:rPr>
+        <w:t xml:space="preserve">Das Installationsskript kann optional einen systemd-Timer einrichten, der neu ankommende Dateien alle 15 Minuten automatisch auf NFC normalisiert — INSTALL_CONVMV_TIMER=true im Skript-Header setzen. Standard: false.</w:t>
+      </w:r>
+    </w:p>
+    <w:p>
+      <w:r>
+        <w:br w:type="page"/>
+      </w:r>
+    </w:p>
+    <w:p>
+      <w:pPr>
+        <w:pStyle w:val="Heading1"/>
+        <w:pBdr>
+          <w:bottom w:val="single" w:color="1F5C99" w:sz="6" w:space="4"/>
+        </w:pBdr>
+        <w:spacing w:after="120" w:before="360"/>
+      </w:pPr>
+      <w:r>
+        <w:rPr>
+          <w:rFonts w:ascii="Arial" w:cs="Arial" w:eastAsia="Arial" w:hAnsi="Arial"/>
+          <w:b/>
+          <w:bCs/>
+          <w:color w:val="1F5C99"/>
+          <w:sz w:val="28"/>
+          <w:szCs w:val="28"/>
+        </w:rPr>
+        <w:t xml:space="preserve">14. Anhang: UFW Firewall verwalten</w:t>
       </w:r>
     </w:p>
     <w:p>
@@ -12438,7 +12451,7 @@
           <w:sz w:val="22"/>
           <w:szCs w:val="22"/>
         </w:rPr>
-        <w:t xml:space="preserve">13.1 Installation</w:t>
+        <w:t xml:space="preserve">14.1 Installation</w:t>
       </w:r>
     </w:p>
     <w:p>
@@ -12549,7 +12562,7 @@
           <w:sz w:val="22"/>
           <w:szCs w:val="22"/>
         </w:rPr>
-        <w:t xml:space="preserve">13.2 Grundregeln festlegen</w:t>
+        <w:t xml:space="preserve">14.2 Grundregeln festlegen</w:t>
       </w:r>
     </w:p>
     <w:p>
@@ -12609,7 +12622,7 @@
           <w:sz w:val="20"/>
           <w:szCs w:val="20"/>
         </w:rPr>
-        <w:t xml:space="preserve">Diese Befehle ändern nur die Konfiguration, nicht den laufenden Zustand — UFW ist an dieser Stelle noch nicht aktiv (siehe 13.5 Aktivieren).</w:t>
+        <w:t xml:space="preserve">Diese Befehle ändern nur die Konfiguration, nicht den laufenden Zustand — UFW ist an dieser Stelle noch nicht aktiv (siehe 14.5 Aktivieren).</w:t>
       </w:r>
     </w:p>
     <w:p>
@@ -12626,7 +12639,7 @@
           <w:sz w:val="22"/>
           <w:szCs w:val="22"/>
         </w:rPr>
-        <w:t xml:space="preserve">13.3 Regeln setzen</w:t>
+        <w:t xml:space="preserve">14.3 Regeln setzen</w:t>
       </w:r>
     </w:p>
     <w:p>
@@ -13468,7 +13481,7 @@
           <w:sz w:val="22"/>
           <w:szCs w:val="22"/>
         </w:rPr>
-        <w:t xml:space="preserve">13.4 IPv6</w:t>
+        <w:t xml:space="preserve">14.4 IPv6</w:t>
       </w:r>
     </w:p>
     <w:p>
@@ -13499,7 +13512,7 @@
           <w:sz w:val="22"/>
           <w:szCs w:val="22"/>
         </w:rPr>
-        <w:t xml:space="preserve">13.5 Aktivieren</w:t>
+        <w:t xml:space="preserve">14.5 Aktivieren</w:t>
       </w:r>
     </w:p>
     <w:p>
@@ -13601,7 +13614,7 @@
           <w:sz w:val="22"/>
           <w:szCs w:val="22"/>
         </w:rPr>
-        <w:t xml:space="preserve">13.6 Verwaltung im laufenden Betrieb</w:t>
+        <w:t xml:space="preserve">14.6 Verwaltung im laufenden Betrieb</w:t>
       </w:r>
     </w:p>
     <w:p>
@@ -13792,7 +13805,7 @@
           <w:sz w:val="22"/>
           <w:szCs w:val="22"/>
         </w:rPr>
-        <w:t xml:space="preserve">13.7 Ergänzung: fail2ban gegen Brute-Force</w:t>
+        <w:t xml:space="preserve">14.7 Ergänzung: fail2ban gegen Brute-Force</w:t>
       </w:r>
     </w:p>
     <w:p>
@@ -14574,6 +14587,11 @@
       </w:r>
     </w:p>
     <w:p>
+      <w:r>
+        <w:br w:type="page"/>
+      </w:r>
+    </w:p>
+    <w:p>
       <w:pPr>
         <w:pStyle w:val="Heading1"/>
         <w:pBdr>
@@ -14590,7 +14608,7 @@
           <w:sz w:val="28"/>
           <w:szCs w:val="28"/>
         </w:rPr>
-        <w:t xml:space="preserve">14. Anhang: Ubuntu-Server 1:1 klonen mit Clonezilla</w:t>
+        <w:t xml:space="preserve">15. Anhang: Ubuntu-Server 1:1 klonen mit Clonezilla</w:t>
       </w:r>
     </w:p>
     <w:p>
@@ -14621,7 +14639,7 @@
           <w:sz w:val="22"/>
           <w:szCs w:val="22"/>
         </w:rPr>
-        <w:t xml:space="preserve">14.1 Zweck und Voraussetzungen</w:t>
+        <w:t xml:space="preserve">15.1 Zweck und Voraussetzungen</w:t>
       </w:r>
     </w:p>
     <w:p>
@@ -14689,7 +14707,7 @@
           <w:sz w:val="20"/>
           <w:szCs w:val="20"/>
         </w:rPr>
-        <w:t xml:space="preserve">Quell- und Ziel-PC im selben LAN (für den Netzwerk-Klon in 14.5).</w:t>
+        <w:t xml:space="preserve">Quell- und Ziel-PC im selben LAN (für den Netzwerk-Klon in 15.5).</w:t>
       </w:r>
     </w:p>
     <w:p>
@@ -14727,7 +14745,7 @@
           <w:sz w:val="20"/>
           <w:szCs w:val="20"/>
         </w:rPr>
-        <w:t xml:space="preserve">Zielplatte gleich gross oder grösser als die Quellplatte. Ist sie grösser, wird der zusätzliche Platz erst nach dem Klonen nutzbar gemacht (14.6).</w:t>
+        <w:t xml:space="preserve">Zielplatte gleich gross oder grösser als die Quellplatte. Ist sie grösser, wird der zusätzliche Platz erst nach dem Klonen nutzbar gemacht (15.6).</w:t>
       </w:r>
     </w:p>
     <w:p>
@@ -14744,7 +14762,7 @@
           <w:sz w:val="22"/>
           <w:szCs w:val="22"/>
         </w:rPr>
-        <w:t xml:space="preserve">14.2 Clonezilla-Live-USB-Stick erstellen</w:t>
+        <w:t xml:space="preserve">15.2 Clonezilla-Live-USB-Stick erstellen</w:t>
       </w:r>
     </w:p>
     <w:p>
@@ -14761,7 +14779,7 @@
           <w:sz w:val="20"/>
           <w:szCs w:val="20"/>
         </w:rPr>
-        <w:t xml:space="preserve">14.2.1 ISO herunterladen</w:t>
+        <w:t xml:space="preserve">15.2.1 ISO herunterladen</w:t>
       </w:r>
     </w:p>
     <w:p>
@@ -14792,7 +14810,7 @@
           <w:sz w:val="20"/>
           <w:szCs w:val="20"/>
         </w:rPr>
-        <w:t xml:space="preserve">14.2.2 Stick schreiben unter macOS</w:t>
+        <w:t xml:space="preserve">15.2.2 Stick schreiben unter macOS</w:t>
       </w:r>
     </w:p>
     <w:p>
@@ -14912,7 +14930,7 @@
           <w:sz w:val="20"/>
           <w:szCs w:val="20"/>
         </w:rPr>
-        <w:t xml:space="preserve">14.2.3 Stick schreiben unter Windows</w:t>
+        <w:t xml:space="preserve">15.2.3 Stick schreiben unter Windows</w:t>
       </w:r>
     </w:p>
     <w:p>
@@ -14943,7 +14961,7 @@
           <w:sz w:val="22"/>
           <w:szCs w:val="22"/>
         </w:rPr>
-        <w:t xml:space="preserve">14.3 PC vom Stick booten</w:t>
+        <w:t xml:space="preserve">15.3 PC vom Stick booten</w:t>
       </w:r>
     </w:p>
     <w:p>
@@ -15056,7 +15074,7 @@
           <w:sz w:val="22"/>
           <w:szCs w:val="22"/>
         </w:rPr>
-        <w:t xml:space="preserve">14.4 Klon-Methoden im Überblick</w:t>
+        <w:t xml:space="preserve">15.4 Klon-Methoden im Überblick</w:t>
       </w:r>
     </w:p>
     <w:p>
@@ -15127,7 +15145,7 @@
           <w:sz w:val="20"/>
           <w:szCs w:val="20"/>
         </w:rPr>
-        <w:t xml:space="preserve">Beide PCs gleichzeitig übers Netzwerk: direkter Klon zwischen den beiden laufenden Live-Systemen, kein Kabel/Adapter nötig. Siehe 14.5 — dieser Weg wird hier im Detail beschrieben.</w:t>
+        <w:t xml:space="preserve">Beide PCs gleichzeitig übers Netzwerk: direkter Klon zwischen den beiden laufenden Live-Systemen, kein Kabel/Adapter nötig. Siehe 15.5 — dieser Weg wird hier im Detail beschrieben.</w:t>
       </w:r>
     </w:p>
     <w:p>
@@ -15144,7 +15162,7 @@
           <w:sz w:val="22"/>
           <w:szCs w:val="22"/>
         </w:rPr>
-        <w:t xml:space="preserve">14.5 Direkter Netzwerk-Klon (PC-zu-PC, ohne Zwischenspeicher)</w:t>
+        <w:t xml:space="preserve">15.5 Direkter Netzwerk-Klon (PC-zu-PC, ohne Zwischenspeicher)</w:t>
       </w:r>
     </w:p>
     <w:p>
@@ -15175,7 +15193,7 @@
           <w:sz w:val="20"/>
           <w:szCs w:val="20"/>
         </w:rPr>
-        <w:t xml:space="preserve">14.5.1 In die Shell wechseln</w:t>
+        <w:t xml:space="preserve">15.5.1 In die Shell wechseln</w:t>
       </w:r>
     </w:p>
     <w:p>
@@ -15206,7 +15224,7 @@
           <w:sz w:val="20"/>
           <w:szCs w:val="20"/>
         </w:rPr>
-        <w:t xml:space="preserve">14.5.2 Netzwerk auf dem Ziel-PC einrichten</w:t>
+        <w:t xml:space="preserve">15.5.2 Netzwerk auf dem Ziel-PC einrichten</w:t>
       </w:r>
     </w:p>
     <w:p>
@@ -15375,7 +15393,7 @@
           <w:sz w:val="20"/>
           <w:szCs w:val="20"/>
         </w:rPr>
-        <w:t xml:space="preserve">14.5.3 SSH-Zugriff auf dem Ziel-PC vorbereiten</w:t>
+        <w:t xml:space="preserve">15.5.3 SSH-Zugriff auf dem Ziel-PC vorbereiten</w:t>
       </w:r>
     </w:p>
     <w:p>
@@ -15440,7 +15458,7 @@
           <w:sz w:val="20"/>
           <w:szCs w:val="20"/>
         </w:rPr>
-        <w:t xml:space="preserve">14.5.4 Platten identifizieren</w:t>
+        <w:t xml:space="preserve">15.5.4 Platten identifizieren</w:t>
       </w:r>
     </w:p>
     <w:p>
@@ -15487,21 +15505,21 @@
           <w:sz w:val="20"/>
           <w:szCs w:val="20"/>
         </w:rPr>
-        <w:t xml:space="preserve">14.5.5 Klonen: direkter Disk-zu-Disk-Klon über SSH</w:t>
-      </w:r>
-    </w:p>
-    <w:p>
-      <w:pPr>
-        <w:spacing w:after="80"/>
-      </w:pPr>
-      <w:r>
-        <w:rPr>
-          <w:rFonts w:ascii="Arial" w:cs="Arial" w:eastAsia="Arial" w:hAnsi="Arial"/>
-          <w:color w:val="404040"/>
-          <w:sz w:val="20"/>
-          <w:szCs w:val="20"/>
-        </w:rPr>
-        <w:t xml:space="preserve">Auf dem Quell-PC ausführen (Platzhalter durch die tatsächlichen Werte aus 14.5.3/14.5.4 ersetzen):</w:t>
+        <w:t xml:space="preserve">15.5.5 Klonen: direkter Disk-zu-Disk-Klon über SSH</w:t>
+      </w:r>
+    </w:p>
+    <w:p>
+      <w:pPr>
+        <w:spacing w:after="80"/>
+      </w:pPr>
+      <w:r>
+        <w:rPr>
+          <w:rFonts w:ascii="Arial" w:cs="Arial" w:eastAsia="Arial" w:hAnsi="Arial"/>
+          <w:color w:val="404040"/>
+          <w:sz w:val="20"/>
+          <w:szCs w:val="20"/>
+        </w:rPr>
+        <w:t xml:space="preserve">Auf dem Quell-PC ausführen (Platzhalter durch die tatsächlichen Werte aus 15.5.3/15.5.4 ersetzen):</w:t>
       </w:r>
     </w:p>
     <w:p>
@@ -15635,7 +15653,7 @@
           <w:sz w:val="20"/>
           <w:szCs w:val="20"/>
         </w:rPr>
-        <w:t xml:space="preserve">14.5.6 Alternative: Als komprimierte Image-Datei sichern (statt Direkt-Klon)</w:t>
+        <w:t xml:space="preserve">15.5.6 Alternative: Als komprimierte Image-Datei sichern (statt Direkt-Klon)</w:t>
       </w:r>
     </w:p>
     <w:p>
@@ -15744,7 +15762,7 @@
           <w:sz w:val="22"/>
           <w:szCs w:val="22"/>
         </w:rPr>
-        <w:t xml:space="preserve">14.6 Nach dem Klonen: Ziel-PC anpassen</w:t>
+        <w:t xml:space="preserve">15.6 Nach dem Klonen: Ziel-PC anpassen</w:t>
       </w:r>
     </w:p>
     <w:p>
@@ -15775,7 +15793,7 @@
           <w:sz w:val="20"/>
           <w:szCs w:val="20"/>
         </w:rPr>
-        <w:t xml:space="preserve">14.6.1 IP-Adresse ändern</w:t>
+        <w:t xml:space="preserve">15.6.1 IP-Adresse ändern</w:t>
       </w:r>
     </w:p>
     <w:p>
@@ -15838,7 +15856,7 @@
           <w:sz w:val="20"/>
           <w:szCs w:val="20"/>
         </w:rPr>
-        <w:t xml:space="preserve">14.6.2 Hostname ändern</w:t>
+        <w:t xml:space="preserve">15.6.2 Hostname ändern</w:t>
       </w:r>
     </w:p>
     <w:p>
@@ -15871,7 +15889,7 @@
           <w:sz w:val="20"/>
           <w:szCs w:val="20"/>
         </w:rPr>
-        <w:t xml:space="preserve">14.6.3 SSH-Host-Keys neu erzeugen</w:t>
+        <w:t xml:space="preserve">15.6.3 SSH-Host-Keys neu erzeugen</w:t>
       </w:r>
     </w:p>
     <w:p>
@@ -15934,7 +15952,7 @@
           <w:sz w:val="20"/>
           <w:szCs w:val="20"/>
         </w:rPr>
-        <w:t xml:space="preserve">14.6.4 machine-id neu setzen</w:t>
+        <w:t xml:space="preserve">15.6.4 machine-id neu setzen</w:t>
       </w:r>
     </w:p>
     <w:p>
@@ -15997,7 +16015,7 @@
           <w:sz w:val="20"/>
           <w:szCs w:val="20"/>
         </w:rPr>
-        <w:t xml:space="preserve">14.6.5 Partition und Dateisystem vergrössern (bei grösserer Zielplatte)</w:t>
+        <w:t xml:space="preserve">15.6.5 Partition und Dateisystem vergrössern (bei grösserer Zielplatte)</w:t>
       </w:r>
     </w:p>
     <w:p>
@@ -16060,7 +16078,7 @@
           <w:sz w:val="22"/>
           <w:szCs w:val="22"/>
         </w:rPr>
-        <w:t xml:space="preserve">14.7 Kurzreferenz</w:t>
+        <w:t xml:space="preserve">15.7 Kurzreferenz</w:t>
       </w:r>
     </w:p>
     <w:p>

</xml_diff>

<commit_message>
Add appendix: Benutzer, Gruppen und Berechtigungen (/srv/data)
Documents the qgis/www-data/RDP_USER/root user model, how the qgis
secondary-group membership grants RDP_USER (and, manually, any other
admin account) write access without owning the files, the SetGID
mechanics on /srv/data (group-inherited but not recursively applied to
pre-existing subdirs, and not applied to /srv/qgis at all), the
correct target permissions (664 files / 2775 dirs — not 600, which
would break group access), and diagnose/repair one-liners.

Added to README.md and, as a new "16. Anhang" chapter, to the Word
guide (schema-validated, encoding checked).

Co-Authored-By: Claude Sonnet 5 <noreply@anthropic.com>
</commit_message>
<xml_diff>
--- a/Lizmap_QGIS_Server_Installation_Guide.docx
+++ b/Lizmap_QGIS_Server_Installation_Guide.docx
@@ -16349,6 +16349,1386 @@
           <w:szCs w:val="18"/>
         </w:rPr>
         <w:t xml:space="preserve">sudo rm /etc/machine-id &amp;&amp; sudo systemd-machine-id-setup</w:t>
+      </w:r>
+    </w:p>
+    <w:p>
+      <w:r>
+        <w:br w:type="page"/>
+      </w:r>
+    </w:p>
+    <w:p>
+      <w:pPr>
+        <w:pStyle w:val="Heading1"/>
+        <w:pBdr>
+          <w:bottom w:val="single" w:color="1F5C99" w:sz="6" w:space="4"/>
+        </w:pBdr>
+        <w:spacing w:after="120" w:before="360"/>
+      </w:pPr>
+      <w:r>
+        <w:rPr>
+          <w:rFonts w:ascii="Arial" w:cs="Arial" w:eastAsia="Arial" w:hAnsi="Arial"/>
+          <w:b/>
+          <w:bCs/>
+          <w:color w:val="1F5C99"/>
+          <w:sz w:val="28"/>
+          <w:szCs w:val="28"/>
+        </w:rPr>
+        <w:t xml:space="preserve">16. Anhang: Benutzer, Gruppen und Berechtigungen (/srv/data)</w:t>
+      </w:r>
+    </w:p>
+    <w:p>
+      <w:pPr>
+        <w:spacing w:after="80"/>
+      </w:pPr>
+      <w:r>
+        <w:rPr>
+          <w:rFonts w:ascii="Arial" w:cs="Arial" w:eastAsia="Arial" w:hAnsi="Arial"/>
+          <w:color w:val="404040"/>
+          <w:sz w:val="20"/>
+          <w:szCs w:val="20"/>
+        </w:rPr>
+        <w:t xml:space="preserve">Wer darf woran schreiben, und wie stellt man das nach einer Abweichung wieder her — insbesondere für einen zusätzlichen persönlichen Admin-Account neben dem automatisch angelegten RDP-Benutzer.</w:t>
+      </w:r>
+    </w:p>
+    <w:p>
+      <w:pPr>
+        <w:pStyle w:val="Heading2"/>
+        <w:spacing w:after="80" w:before="240"/>
+      </w:pPr>
+      <w:r>
+        <w:rPr>
+          <w:rFonts w:ascii="Arial" w:cs="Arial" w:eastAsia="Arial" w:hAnsi="Arial"/>
+          <w:b/>
+          <w:bCs/>
+          <w:color w:val="1F5C99"/>
+          <w:sz w:val="22"/>
+          <w:szCs w:val="22"/>
+        </w:rPr>
+        <w:t xml:space="preserve">16.1 Beteiligte Benutzer und Gruppen</w:t>
+      </w:r>
+    </w:p>
+    <w:tbl>
+      <w:tblPr>
+        <w:tblW w:type="dxa" w:w="9546"/>
+        <w:tblBorders>
+          <w:top w:val="single" w:color="auto" w:sz="4"/>
+          <w:left w:val="single" w:color="auto" w:sz="4"/>
+          <w:bottom w:val="single" w:color="auto" w:sz="4"/>
+          <w:right w:val="single" w:color="auto" w:sz="4"/>
+          <w:insideH w:val="single" w:color="auto" w:sz="4"/>
+          <w:insideV w:val="single" w:color="auto" w:sz="4"/>
+        </w:tblBorders>
+      </w:tblPr>
+      <w:tblGrid>
+        <w:gridCol w:w="2600"/>
+        <w:gridCol w:w="2800"/>
+        <w:gridCol w:w="4146"/>
+      </w:tblGrid>
+      <w:tr>
+        <w:trPr>
+          <w:tblHeader/>
+        </w:trPr>
+        <w:tc>
+          <w:tcPr>
+            <w:tcW w:type="dxa" w:w="2600"/>
+            <w:shd w:fill="1F5C99" w:val="clear"/>
+            <w:tcMar>
+              <w:top w:type="dxa" w:w="80"/>
+              <w:left w:type="dxa" w:w="120"/>
+              <w:bottom w:type="dxa" w:w="80"/>
+              <w:right w:type="dxa" w:w="120"/>
+            </w:tcMar>
+          </w:tcPr>
+          <w:p>
+            <w:r>
+              <w:rPr>
+                <w:rFonts w:ascii="Arial" w:cs="Arial" w:eastAsia="Arial" w:hAnsi="Arial"/>
+                <w:b/>
+                <w:bCs/>
+                <w:color w:val="FFFFFF"/>
+                <w:sz w:val="18"/>
+                <w:szCs w:val="18"/>
+              </w:rPr>
+              <w:t xml:space="preserve">Wer</w:t>
+            </w:r>
+          </w:p>
+        </w:tc>
+        <w:tc>
+          <w:tcPr>
+            <w:tcW w:type="dxa" w:w="2800"/>
+            <w:shd w:fill="1F5C99" w:val="clear"/>
+            <w:tcMar>
+              <w:top w:type="dxa" w:w="80"/>
+              <w:left w:type="dxa" w:w="120"/>
+              <w:bottom w:type="dxa" w:w="80"/>
+              <w:right w:type="dxa" w:w="120"/>
+            </w:tcMar>
+          </w:tcPr>
+          <w:p>
+            <w:r>
+              <w:rPr>
+                <w:rFonts w:ascii="Arial" w:cs="Arial" w:eastAsia="Arial" w:hAnsi="Arial"/>
+                <w:b/>
+                <w:bCs/>
+                <w:color w:val="FFFFFF"/>
+                <w:sz w:val="18"/>
+                <w:szCs w:val="18"/>
+              </w:rPr>
+              <w:t xml:space="preserve">Typ</w:t>
+            </w:r>
+          </w:p>
+        </w:tc>
+        <w:tc>
+          <w:tcPr>
+            <w:tcW w:type="dxa" w:w="4146"/>
+            <w:shd w:fill="1F5C99" w:val="clear"/>
+            <w:tcMar>
+              <w:top w:type="dxa" w:w="80"/>
+              <w:left w:type="dxa" w:w="120"/>
+              <w:bottom w:type="dxa" w:w="80"/>
+              <w:right w:type="dxa" w:w="120"/>
+            </w:tcMar>
+          </w:tcPr>
+          <w:p>
+            <w:r>
+              <w:rPr>
+                <w:rFonts w:ascii="Arial" w:cs="Arial" w:eastAsia="Arial" w:hAnsi="Arial"/>
+                <w:b/>
+                <w:bCs/>
+                <w:color w:val="FFFFFF"/>
+                <w:sz w:val="18"/>
+                <w:szCs w:val="18"/>
+              </w:rPr>
+              <w:t xml:space="preserve">Rolle</w:t>
+            </w:r>
+          </w:p>
+        </w:tc>
+      </w:tr>
+      <w:tr>
+        <w:tc>
+          <w:tcPr>
+            <w:tcW w:type="dxa" w:w="2600"/>
+            <w:shd w:fill="EBF3FB" w:val="clear"/>
+            <w:tcMar>
+              <w:top w:type="dxa" w:w="80"/>
+              <w:left w:type="dxa" w:w="120"/>
+              <w:bottom w:type="dxa" w:w="80"/>
+              <w:right w:type="dxa" w:w="120"/>
+            </w:tcMar>
+          </w:tcPr>
+          <w:p>
+            <w:r>
+              <w:rPr>
+                <w:rFonts w:ascii="Arial" w:cs="Arial" w:eastAsia="Arial" w:hAnsi="Arial"/>
+                <w:color w:val="404040"/>
+                <w:sz w:val="18"/>
+                <w:szCs w:val="18"/>
+              </w:rPr>
+              <w:t xml:space="preserve">root</w:t>
+            </w:r>
+          </w:p>
+        </w:tc>
+        <w:tc>
+          <w:tcPr>
+            <w:tcW w:type="dxa" w:w="2800"/>
+            <w:shd w:fill="EBF3FB" w:val="clear"/>
+            <w:tcMar>
+              <w:top w:type="dxa" w:w="80"/>
+              <w:left w:type="dxa" w:w="120"/>
+              <w:bottom w:type="dxa" w:w="80"/>
+              <w:right w:type="dxa" w:w="120"/>
+            </w:tcMar>
+          </w:tcPr>
+          <w:p>
+            <w:r>
+              <w:rPr>
+                <w:rFonts w:ascii="Arial" w:cs="Arial" w:eastAsia="Arial" w:hAnsi="Arial"/>
+                <w:color w:val="404040"/>
+                <w:sz w:val="18"/>
+                <w:szCs w:val="18"/>
+              </w:rPr>
+              <w:t xml:space="preserve">Systembenutzer</w:t>
+            </w:r>
+          </w:p>
+        </w:tc>
+        <w:tc>
+          <w:tcPr>
+            <w:tcW w:type="dxa" w:w="4146"/>
+            <w:shd w:fill="EBF3FB" w:val="clear"/>
+            <w:tcMar>
+              <w:top w:type="dxa" w:w="80"/>
+              <w:left w:type="dxa" w:w="120"/>
+              <w:bottom w:type="dxa" w:w="80"/>
+              <w:right w:type="dxa" w:w="120"/>
+            </w:tcMar>
+          </w:tcPr>
+          <w:p>
+            <w:r>
+              <w:rPr>
+                <w:rFonts w:ascii="Arial" w:cs="Arial" w:eastAsia="Arial" w:hAnsi="Arial"/>
+                <w:color w:val="404040"/>
+                <w:sz w:val="18"/>
+                <w:szCs w:val="18"/>
+              </w:rPr>
+              <w:t xml:space="preserve">Führt das Installationsskript aus; die systemd-Units (qgis.service, Worker) laufen als root</w:t>
+            </w:r>
+          </w:p>
+        </w:tc>
+      </w:tr>
+      <w:tr>
+        <w:tc>
+          <w:tcPr>
+            <w:tcW w:type="dxa" w:w="2600"/>
+            <w:tcMar>
+              <w:top w:type="dxa" w:w="80"/>
+              <w:left w:type="dxa" w:w="120"/>
+              <w:bottom w:type="dxa" w:w="80"/>
+              <w:right w:type="dxa" w:w="120"/>
+            </w:tcMar>
+          </w:tcPr>
+          <w:p>
+            <w:r>
+              <w:rPr>
+                <w:rFonts w:ascii="Arial" w:cs="Arial" w:eastAsia="Arial" w:hAnsi="Arial"/>
+                <w:color w:val="404040"/>
+                <w:sz w:val="18"/>
+                <w:szCs w:val="18"/>
+              </w:rPr>
+              <w:t xml:space="preserve">qgis</w:t>
+            </w:r>
+          </w:p>
+        </w:tc>
+        <w:tc>
+          <w:tcPr>
+            <w:tcW w:type="dxa" w:w="2800"/>
+            <w:tcMar>
+              <w:top w:type="dxa" w:w="80"/>
+              <w:left w:type="dxa" w:w="120"/>
+              <w:bottom w:type="dxa" w:w="80"/>
+              <w:right w:type="dxa" w:w="120"/>
+            </w:tcMar>
+          </w:tcPr>
+          <w:p>
+            <w:r>
+              <w:rPr>
+                <w:rFonts w:ascii="Arial" w:cs="Arial" w:eastAsia="Arial" w:hAnsi="Arial"/>
+                <w:color w:val="404040"/>
+                <w:sz w:val="18"/>
+                <w:szCs w:val="18"/>
+              </w:rPr>
+              <w:t xml:space="preserve">Systemdienst-Benutzer</w:t>
+            </w:r>
+          </w:p>
+        </w:tc>
+        <w:tc>
+          <w:tcPr>
+            <w:tcW w:type="dxa" w:w="4146"/>
+            <w:tcMar>
+              <w:top w:type="dxa" w:w="80"/>
+              <w:left w:type="dxa" w:w="120"/>
+              <w:bottom w:type="dxa" w:w="80"/>
+              <w:right w:type="dxa" w:w="120"/>
+            </w:tcMar>
+          </w:tcPr>
+          <w:p>
+            <w:r>
+              <w:rPr>
+                <w:rFonts w:ascii="Arial" w:cs="Arial" w:eastAsia="Arial" w:hAnsi="Arial"/>
+                <w:color w:val="404040"/>
+                <w:sz w:val="18"/>
+                <w:szCs w:val="18"/>
+              </w:rPr>
+              <w:t xml:space="preserve">Besitzt /srv/qgis und /srv/data (chown -R qgis:qgis) — kein Login möglich</w:t>
+            </w:r>
+          </w:p>
+        </w:tc>
+      </w:tr>
+      <w:tr>
+        <w:tc>
+          <w:tcPr>
+            <w:tcW w:type="dxa" w:w="2600"/>
+            <w:shd w:fill="EBF3FB" w:val="clear"/>
+            <w:tcMar>
+              <w:top w:type="dxa" w:w="80"/>
+              <w:left w:type="dxa" w:w="120"/>
+              <w:bottom w:type="dxa" w:w="80"/>
+              <w:right w:type="dxa" w:w="120"/>
+            </w:tcMar>
+          </w:tcPr>
+          <w:p>
+            <w:r>
+              <w:rPr>
+                <w:rFonts w:ascii="Arial" w:cs="Arial" w:eastAsia="Arial" w:hAnsi="Arial"/>
+                <w:color w:val="404040"/>
+                <w:sz w:val="18"/>
+                <w:szCs w:val="18"/>
+              </w:rPr>
+              <w:t xml:space="preserve">www-data</w:t>
+            </w:r>
+          </w:p>
+        </w:tc>
+        <w:tc>
+          <w:tcPr>
+            <w:tcW w:type="dxa" w:w="2800"/>
+            <w:shd w:fill="EBF3FB" w:val="clear"/>
+            <w:tcMar>
+              <w:top w:type="dxa" w:w="80"/>
+              <w:left w:type="dxa" w:w="120"/>
+              <w:bottom w:type="dxa" w:w="80"/>
+              <w:right w:type="dxa" w:w="120"/>
+            </w:tcMar>
+          </w:tcPr>
+          <w:p>
+            <w:r>
+              <w:rPr>
+                <w:rFonts w:ascii="Arial" w:cs="Arial" w:eastAsia="Arial" w:hAnsi="Arial"/>
+                <w:color w:val="404040"/>
+                <w:sz w:val="18"/>
+                <w:szCs w:val="18"/>
+              </w:rPr>
+              <w:t xml:space="preserve">Systembenutzer (Nginx/PHP-FPM)</w:t>
+            </w:r>
+          </w:p>
+        </w:tc>
+        <w:tc>
+          <w:tcPr>
+            <w:tcW w:type="dxa" w:w="4146"/>
+            <w:shd w:fill="EBF3FB" w:val="clear"/>
+            <w:tcMar>
+              <w:top w:type="dxa" w:w="80"/>
+              <w:left w:type="dxa" w:w="120"/>
+              <w:bottom w:type="dxa" w:w="80"/>
+              <w:right w:type="dxa" w:w="120"/>
+            </w:tcMar>
+          </w:tcPr>
+          <w:p>
+            <w:r>
+              <w:rPr>
+                <w:rFonts w:ascii="Arial" w:cs="Arial" w:eastAsia="Arial" w:hAnsi="Arial"/>
+                <w:color w:val="404040"/>
+                <w:sz w:val="18"/>
+                <w:szCs w:val="18"/>
+              </w:rPr>
+              <w:t xml:space="preserve">Besitzt die Lizmap-Webanwendung selbst (/var/www/lizmap/...), über LIZMAP_USER/LIZMAP_GROUP</w:t>
+            </w:r>
+          </w:p>
+        </w:tc>
+      </w:tr>
+      <w:tr>
+        <w:tc>
+          <w:tcPr>
+            <w:tcW w:type="dxa" w:w="2600"/>
+            <w:tcMar>
+              <w:top w:type="dxa" w:w="80"/>
+              <w:left w:type="dxa" w:w="120"/>
+              <w:bottom w:type="dxa" w:w="80"/>
+              <w:right w:type="dxa" w:w="120"/>
+            </w:tcMar>
+          </w:tcPr>
+          <w:p>
+            <w:r>
+              <w:rPr>
+                <w:rFonts w:ascii="Arial" w:cs="Arial" w:eastAsia="Arial" w:hAnsi="Arial"/>
+                <w:color w:val="404040"/>
+                <w:sz w:val="18"/>
+                <w:szCs w:val="18"/>
+              </w:rPr>
+              <w:t xml:space="preserve">RDP_USER/XRDP_USER (Standard: gisadmin)</w:t>
+            </w:r>
+          </w:p>
+        </w:tc>
+        <w:tc>
+          <w:tcPr>
+            <w:tcW w:type="dxa" w:w="2800"/>
+            <w:tcMar>
+              <w:top w:type="dxa" w:w="80"/>
+              <w:left w:type="dxa" w:w="120"/>
+              <w:bottom w:type="dxa" w:w="80"/>
+              <w:right w:type="dxa" w:w="120"/>
+            </w:tcMar>
+          </w:tcPr>
+          <w:p>
+            <w:r>
+              <w:rPr>
+                <w:rFonts w:ascii="Arial" w:cs="Arial" w:eastAsia="Arial" w:hAnsi="Arial"/>
+                <w:color w:val="404040"/>
+                <w:sz w:val="18"/>
+                <w:szCs w:val="18"/>
+              </w:rPr>
+              <w:t xml:space="preserve">Normaler Login-Benutzer</w:t>
+            </w:r>
+          </w:p>
+        </w:tc>
+        <w:tc>
+          <w:tcPr>
+            <w:tcW w:type="dxa" w:w="4146"/>
+            <w:tcMar>
+              <w:top w:type="dxa" w:w="80"/>
+              <w:left w:type="dxa" w:w="120"/>
+              <w:bottom w:type="dxa" w:w="80"/>
+              <w:right w:type="dxa" w:w="120"/>
+            </w:tcMar>
+          </w:tcPr>
+          <w:p>
+            <w:r>
+              <w:rPr>
+                <w:rFonts w:ascii="Arial" w:cs="Arial" w:eastAsia="Arial" w:hAnsi="Arial"/>
+                <w:color w:val="404040"/>
+                <w:sz w:val="18"/>
+                <w:szCs w:val="18"/>
+              </w:rPr>
+              <w:t xml:space="preserve">Für RDP/QGIS-Desktop-Sitzungen, Mitglied der Gruppen sudo UND qgis</w:t>
+            </w:r>
+          </w:p>
+        </w:tc>
+      </w:tr>
+      <w:tr>
+        <w:tc>
+          <w:tcPr>
+            <w:tcW w:type="dxa" w:w="2600"/>
+            <w:shd w:fill="EBF3FB" w:val="clear"/>
+            <w:tcMar>
+              <w:top w:type="dxa" w:w="80"/>
+              <w:left w:type="dxa" w:w="120"/>
+              <w:bottom w:type="dxa" w:w="80"/>
+              <w:right w:type="dxa" w:w="120"/>
+            </w:tcMar>
+          </w:tcPr>
+          <w:p>
+            <w:r>
+              <w:rPr>
+                <w:rFonts w:ascii="Arial" w:cs="Arial" w:eastAsia="Arial" w:hAnsi="Arial"/>
+                <w:color w:val="404040"/>
+                <w:sz w:val="18"/>
+                <w:szCs w:val="18"/>
+              </w:rPr>
+              <w:t xml:space="preserve">Weitere persönliche Accounts</w:t>
+            </w:r>
+          </w:p>
+        </w:tc>
+        <w:tc>
+          <w:tcPr>
+            <w:tcW w:type="dxa" w:w="2800"/>
+            <w:shd w:fill="EBF3FB" w:val="clear"/>
+            <w:tcMar>
+              <w:top w:type="dxa" w:w="80"/>
+              <w:left w:type="dxa" w:w="120"/>
+              <w:bottom w:type="dxa" w:w="80"/>
+              <w:right w:type="dxa" w:w="120"/>
+            </w:tcMar>
+          </w:tcPr>
+          <w:p>
+            <w:r>
+              <w:rPr>
+                <w:rFonts w:ascii="Arial" w:cs="Arial" w:eastAsia="Arial" w:hAnsi="Arial"/>
+                <w:color w:val="404040"/>
+                <w:sz w:val="18"/>
+                <w:szCs w:val="18"/>
+              </w:rPr>
+              <w:t xml:space="preserve">Normaler Login-Benutzer</w:t>
+            </w:r>
+          </w:p>
+        </w:tc>
+        <w:tc>
+          <w:tcPr>
+            <w:tcW w:type="dxa" w:w="4146"/>
+            <w:shd w:fill="EBF3FB" w:val="clear"/>
+            <w:tcMar>
+              <w:top w:type="dxa" w:w="80"/>
+              <w:left w:type="dxa" w:w="120"/>
+              <w:bottom w:type="dxa" w:w="80"/>
+              <w:right w:type="dxa" w:w="120"/>
+            </w:tcMar>
+          </w:tcPr>
+          <w:p>
+            <w:r>
+              <w:rPr>
+                <w:rFonts w:ascii="Arial" w:cs="Arial" w:eastAsia="Arial" w:hAnsi="Arial"/>
+                <w:color w:val="404040"/>
+                <w:sz w:val="18"/>
+                <w:szCs w:val="18"/>
+              </w:rPr>
+              <w:t xml:space="preserve">Wird vom Skript NICHT automatisch zur Gruppe qgis hinzugefügt</w:t>
+            </w:r>
+          </w:p>
+        </w:tc>
+      </w:tr>
+    </w:tbl>
+    <w:p>
+      <w:pPr>
+        <w:pStyle w:val="Heading2"/>
+        <w:spacing w:after="80" w:before="240"/>
+      </w:pPr>
+      <w:r>
+        <w:rPr>
+          <w:rFonts w:ascii="Arial" w:cs="Arial" w:eastAsia="Arial" w:hAnsi="Arial"/>
+          <w:b/>
+          <w:bCs/>
+          <w:color w:val="1F5C99"/>
+          <w:sz w:val="22"/>
+          <w:szCs w:val="22"/>
+        </w:rPr>
+        <w:t xml:space="preserve">16.2 Die Gruppe qgis als Zugriffsmechanismus</w:t>
+      </w:r>
+    </w:p>
+    <w:p>
+      <w:pPr>
+        <w:spacing w:after="80"/>
+      </w:pPr>
+      <w:r>
+        <w:rPr>
+          <w:rFonts w:ascii="Arial" w:cs="Arial" w:eastAsia="Arial" w:hAnsi="Arial"/>
+          <w:color w:val="404040"/>
+          <w:sz w:val="20"/>
+          <w:szCs w:val="20"/>
+        </w:rPr>
+        <w:t xml:space="preserve">Das Installationsskript macht für RDP_USER genau eines:</w:t>
+      </w:r>
+    </w:p>
+    <w:p>
+      <w:pPr>
+        <w:shd w:fill="F0F0F0" w:val="clear"/>
+        <w:spacing w:after="80"/>
+        <w:ind w:left="360"/>
+      </w:pPr>
+      <w:r>
+        <w:rPr>
+          <w:rFonts w:ascii="Courier New" w:cs="Courier New" w:eastAsia="Courier New" w:hAnsi="Courier New"/>
+          <w:color w:val="1A1A1A"/>
+          <w:sz w:val="18"/>
+          <w:szCs w:val="18"/>
+        </w:rPr>
+        <w:t xml:space="preserve">usermod -aG qgis "${RDP_USER}"</w:t>
+      </w:r>
+    </w:p>
+    <w:p>
+      <w:pPr>
+        <w:spacing w:after="80"/>
+      </w:pPr>
+      <w:r>
+        <w:rPr>
+          <w:rFonts w:ascii="Arial" w:cs="Arial" w:eastAsia="Arial" w:hAnsi="Arial"/>
+          <w:color w:val="404040"/>
+          <w:sz w:val="20"/>
+          <w:szCs w:val="20"/>
+        </w:rPr>
+        <w:t xml:space="preserve">RDP_USER bleibt Eigentümer seines eigenen Home-Verzeichnisses, wird aber zusätzlich Mitglied der Gruppe qgis (sekundäre Gruppe, nicht primäre). Dadurch kann er in /srv/data lesen/schreiben, ohne dass die Dateien ihm persönlich gehören müssen — sie bleiben qgis:qgis, die Gruppenmitgliedschaft reicht für den Zugriff.</w:t>
+      </w:r>
+    </w:p>
+    <w:p>
+      <w:pPr>
+        <w:spacing w:after="80"/>
+      </w:pPr>
+      <w:r>
+        <w:rPr>
+          <w:rFonts w:ascii="Arial" w:cs="Arial" w:eastAsia="Arial" w:hAnsi="Arial"/>
+          <w:b/>
+          <w:bCs/>
+          <w:color w:val="404040"/>
+          <w:sz w:val="20"/>
+          <w:szCs w:val="20"/>
+        </w:rPr>
+        <w:t xml:space="preserve">Für weitere persönliche Accounts gilt das nicht automatisch. </w:t>
+      </w:r>
+      <w:r>
+        <w:rPr>
+          <w:rFonts w:ascii="Arial" w:cs="Arial" w:eastAsia="Arial" w:hAnsi="Arial"/>
+          <w:color w:val="404040"/>
+          <w:sz w:val="20"/>
+          <w:szCs w:val="20"/>
+        </w:rPr>
+        <w:t xml:space="preserve">Soll z.B. ein eigener SSH-Admin-User direkt (ohne RDP-Umweg, etwa per SFTP/rsync) Dateien in /srv/data bearbeiten können, muss er manuell hinzugefügt werden:</w:t>
+      </w:r>
+    </w:p>
+    <w:p>
+      <w:pPr>
+        <w:shd w:fill="F0F0F0" w:val="clear"/>
+        <w:spacing w:after="80"/>
+        <w:ind w:left="360"/>
+      </w:pPr>
+      <w:r>
+        <w:rPr>
+          <w:rFonts w:ascii="Courier New" w:cs="Courier New" w:eastAsia="Courier New" w:hAnsi="Courier New"/>
+          <w:color w:val="1A1A1A"/>
+          <w:sz w:val="18"/>
+          <w:szCs w:val="18"/>
+        </w:rPr>
+        <w:t xml:space="preserve">sudo usermod -aG qgis &lt;dein-benutzername&gt;</w:t>
+      </w:r>
+    </w:p>
+    <w:p>
+      <w:pPr>
+        <w:spacing w:after="80"/>
+      </w:pPr>
+      <w:r>
+        <w:rPr>
+          <w:rFonts w:ascii="Arial" w:cs="Arial" w:eastAsia="Arial" w:hAnsi="Arial"/>
+          <w:color w:val="404040"/>
+          <w:sz w:val="20"/>
+          <w:szCs w:val="20"/>
+        </w:rPr>
+        <w:t xml:space="preserve">Danach neu einloggen (oder newgrp qgis in der aktuellen Session), damit die neue Gruppenmitgliedschaft wirksam wird.</w:t>
+      </w:r>
+    </w:p>
+    <w:p>
+      <w:pPr>
+        <w:pStyle w:val="Heading2"/>
+        <w:spacing w:after="80" w:before="240"/>
+      </w:pPr>
+      <w:r>
+        <w:rPr>
+          <w:rFonts w:ascii="Arial" w:cs="Arial" w:eastAsia="Arial" w:hAnsi="Arial"/>
+          <w:b/>
+          <w:bCs/>
+          <w:color w:val="1F5C99"/>
+          <w:sz w:val="22"/>
+          <w:szCs w:val="22"/>
+        </w:rPr>
+        <w:t xml:space="preserve">16.3 /srv/data als Vererbungsordner (SetGID)</w:t>
+      </w:r>
+    </w:p>
+    <w:p>
+      <w:pPr>
+        <w:spacing w:after="80"/>
+      </w:pPr>
+      <w:r>
+        <w:rPr>
+          <w:rFonts w:ascii="Arial" w:cs="Arial" w:eastAsia="Arial" w:hAnsi="Arial"/>
+          <w:color w:val="404040"/>
+          <w:sz w:val="20"/>
+          <w:szCs w:val="20"/>
+        </w:rPr>
+        <w:t xml:space="preserve">Das Skript setzt für QGIS_PROJECTS_DIR (/srv/data) genau drei Dinge:</w:t>
+      </w:r>
+    </w:p>
+    <w:p>
+      <w:pPr>
+        <w:shd w:fill="F0F0F0" w:val="clear"/>
+        <w:spacing w:after="80"/>
+        <w:ind w:left="360"/>
+      </w:pPr>
+      <w:r>
+        <w:rPr>
+          <w:rFonts w:ascii="Courier New" w:cs="Courier New" w:eastAsia="Courier New" w:hAnsi="Courier New"/>
+          <w:color w:val="1A1A1A"/>
+          <w:sz w:val="18"/>
+          <w:szCs w:val="18"/>
+        </w:rPr>
+        <w:t xml:space="preserve">chown -R qgis:qgis "${QGIS_PROJECTS_DIR}"   # Eigentümer: User+Gruppe qgis</w:t>
+      </w:r>
+    </w:p>
+    <w:p>
+      <w:pPr>
+        <w:shd w:fill="F0F0F0" w:val="clear"/>
+        <w:spacing w:after="80"/>
+        <w:ind w:left="360"/>
+      </w:pPr>
+      <w:r>
+        <w:rPr>
+          <w:rFonts w:ascii="Courier New" w:cs="Courier New" w:eastAsia="Courier New" w:hAnsi="Courier New"/>
+          <w:color w:val="1A1A1A"/>
+          <w:sz w:val="18"/>
+          <w:szCs w:val="18"/>
+        </w:rPr>
+        <w:t xml:space="preserve">chmod -R g+rw "${QGIS_PROJECTS_DIR}"        # Gruppe darf lesen+schreiben</w:t>
+      </w:r>
+    </w:p>
+    <w:p>
+      <w:pPr>
+        <w:shd w:fill="F0F0F0" w:val="clear"/>
+        <w:spacing w:after="80"/>
+        <w:ind w:left="360"/>
+      </w:pPr>
+      <w:r>
+        <w:rPr>
+          <w:rFonts w:ascii="Courier New" w:cs="Courier New" w:eastAsia="Courier New" w:hAnsi="Courier New"/>
+          <w:color w:val="1A1A1A"/>
+          <w:sz w:val="18"/>
+          <w:szCs w:val="18"/>
+        </w:rPr>
+        <w:t xml:space="preserve">chmod g+s "${QGIS_PROJECTS_DIR}"            # SetGID-Bit</w:t>
+      </w:r>
+    </w:p>
+    <w:p>
+      <w:pPr>
+        <w:spacing w:after="80"/>
+      </w:pPr>
+      <w:r>
+        <w:rPr>
+          <w:rFonts w:ascii="Arial" w:cs="Arial" w:eastAsia="Arial" w:hAnsi="Arial"/>
+          <w:color w:val="404040"/>
+          <w:sz w:val="20"/>
+          <w:szCs w:val="20"/>
+        </w:rPr>
+        <w:t xml:space="preserve">Das SetGID-Bit (g+s) auf einem Verzeichnis bedeutet: Jede neue Datei oder jeder neue Unterordner, der darin angelegt wird, erbt automatisch die Gruppe qgis — unabhängig davon, welcher Benutzer sie erstellt hat (solange dieser Mitglied der Gruppe qgis ist). Ohne SetGID würde eine neu hochgeladene Datei die primäre Gruppe des hochladenden Benutzers bekommen statt qgis — und wäre dann für den qgis-Systemdienst u.U. nicht mehr lesbar.</w:t>
+      </w:r>
+    </w:p>
+    <w:p>
+      <w:pPr>
+        <w:spacing w:after="80"/>
+      </w:pPr>
+      <w:r>
+        <w:rPr>
+          <w:rFonts w:ascii="Arial" w:cs="Arial" w:eastAsia="Arial" w:hAnsi="Arial"/>
+          <w:color w:val="404040"/>
+          <w:sz w:val="20"/>
+          <w:szCs w:val="20"/>
+        </w:rPr>
+        <w:t xml:space="preserve">SetGID vererbt dabei nur die Gruppen-Zugehörigkeit, nicht automatisch die Schreibrechte (g+rw) selbst — die hängen vom umask des erstellenden Prozesses ab.</w:t>
+      </w:r>
+    </w:p>
+    <w:p>
+      <w:pPr>
+        <w:spacing w:after="80"/>
+      </w:pPr>
+      <w:r>
+        <w:rPr>
+          <w:rFonts w:ascii="Arial" w:cs="Arial" w:eastAsia="Arial" w:hAnsi="Arial"/>
+          <w:b/>
+          <w:bCs/>
+          <w:color w:val="1F5C99"/>
+          <w:sz w:val="20"/>
+          <w:szCs w:val="20"/>
+        </w:rPr>
+        <w:t xml:space="preserve">Wichtig: </w:t>
+      </w:r>
+      <w:r>
+        <w:rPr>
+          <w:rFonts w:ascii="Arial" w:cs="Arial" w:eastAsia="Arial" w:hAnsi="Arial"/>
+          <w:color w:val="404040"/>
+          <w:sz w:val="20"/>
+          <w:szCs w:val="20"/>
+        </w:rPr>
+        <w:t xml:space="preserve">Diese Behandlung (SetGID + g+rw) gilt nur für /srv/data, nicht für /srv/qgis insgesamt (dort steht nur chown -R qgis:qgis, ohne SetGID) — /srv/qgis enthält die Server-Konfiguration/den Cache, primär verwaltet vom qgis-Dienst selbst, nicht kollaborativ von mehreren Menschen bearbeitet.</w:t>
+      </w:r>
+    </w:p>
+    <w:p>
+      <w:pPr>
+        <w:spacing w:after="80"/>
+      </w:pPr>
+      <w:r>
+        <w:rPr>
+          <w:rFonts w:ascii="Arial" w:cs="Arial" w:eastAsia="Arial" w:hAnsi="Arial"/>
+          <w:color w:val="404040"/>
+          <w:sz w:val="20"/>
+          <w:szCs w:val="20"/>
+        </w:rPr>
+        <w:t xml:space="preserve">Ausserdem setzt das Skript chmod g+s nur einmalig auf /srv/data selbst, nicht rekursiv auf jeden bereits vorhandenen Unterordner. Neue Unterordner, die danach per mkdir innerhalb von /srv/data entstehen, erben das SetGID-Bit automatisch (POSIX-Standardverhalten) — aber Ordner/Dateien, die per scp/rsync/cp von aussen hineinkopiert werden, bringen meist keine SetGID-Vererbung mit und landen oft mit dem Umask des kopierenden Prozesses.</w:t>
+      </w:r>
+    </w:p>
+    <w:p>
+      <w:pPr>
+        <w:pStyle w:val="Heading2"/>
+        <w:spacing w:after="80" w:before="240"/>
+      </w:pPr>
+      <w:r>
+        <w:rPr>
+          <w:rFonts w:ascii="Arial" w:cs="Arial" w:eastAsia="Arial" w:hAnsi="Arial"/>
+          <w:b/>
+          <w:bCs/>
+          <w:color w:val="1F5C99"/>
+          <w:sz w:val="22"/>
+          <w:szCs w:val="22"/>
+        </w:rPr>
+        <w:t xml:space="preserve">16.4 Korrekte Ziel-Rechte</w:t>
+      </w:r>
+    </w:p>
+    <w:tbl>
+      <w:tblPr>
+        <w:tblW w:type="dxa" w:w="9546"/>
+        <w:tblBorders>
+          <w:top w:val="single" w:color="auto" w:sz="4"/>
+          <w:left w:val="single" w:color="auto" w:sz="4"/>
+          <w:bottom w:val="single" w:color="auto" w:sz="4"/>
+          <w:right w:val="single" w:color="auto" w:sz="4"/>
+          <w:insideH w:val="single" w:color="auto" w:sz="4"/>
+          <w:insideV w:val="single" w:color="auto" w:sz="4"/>
+        </w:tblBorders>
+      </w:tblPr>
+      <w:tblGrid>
+        <w:gridCol w:w="3346"/>
+        <w:gridCol w:w="1500"/>
+        <w:gridCol w:w="1500"/>
+        <w:gridCol w:w="1500"/>
+        <w:gridCol w:w="1700"/>
+      </w:tblGrid>
+      <w:tr>
+        <w:trPr>
+          <w:tblHeader/>
+        </w:trPr>
+        <w:tc>
+          <w:tcPr>
+            <w:tcW w:type="dxa" w:w="3346"/>
+            <w:shd w:fill="1F5C99" w:val="clear"/>
+            <w:tcMar>
+              <w:top w:type="dxa" w:w="80"/>
+              <w:left w:type="dxa" w:w="120"/>
+              <w:bottom w:type="dxa" w:w="80"/>
+              <w:right w:type="dxa" w:w="120"/>
+            </w:tcMar>
+          </w:tcPr>
+          <w:p>
+            <w:r>
+              <w:rPr>
+                <w:rFonts w:ascii="Arial" w:cs="Arial" w:eastAsia="Arial" w:hAnsi="Arial"/>
+                <w:b/>
+                <w:bCs/>
+                <w:color w:val="FFFFFF"/>
+                <w:sz w:val="18"/>
+                <w:szCs w:val="18"/>
+              </w:rPr>
+              <w:t xml:space="preserve"/>
+            </w:r>
+          </w:p>
+        </w:tc>
+        <w:tc>
+          <w:tcPr>
+            <w:tcW w:type="dxa" w:w="1500"/>
+            <w:shd w:fill="1F5C99" w:val="clear"/>
+            <w:tcMar>
+              <w:top w:type="dxa" w:w="80"/>
+              <w:left w:type="dxa" w:w="120"/>
+              <w:bottom w:type="dxa" w:w="80"/>
+              <w:right w:type="dxa" w:w="120"/>
+            </w:tcMar>
+          </w:tcPr>
+          <w:p>
+            <w:r>
+              <w:rPr>
+                <w:rFonts w:ascii="Arial" w:cs="Arial" w:eastAsia="Arial" w:hAnsi="Arial"/>
+                <w:b/>
+                <w:bCs/>
+                <w:color w:val="FFFFFF"/>
+                <w:sz w:val="18"/>
+                <w:szCs w:val="18"/>
+              </w:rPr>
+              <w:t xml:space="preserve">Owner</w:t>
+            </w:r>
+          </w:p>
+        </w:tc>
+        <w:tc>
+          <w:tcPr>
+            <w:tcW w:type="dxa" w:w="1500"/>
+            <w:shd w:fill="1F5C99" w:val="clear"/>
+            <w:tcMar>
+              <w:top w:type="dxa" w:w="80"/>
+              <w:left w:type="dxa" w:w="120"/>
+              <w:bottom w:type="dxa" w:w="80"/>
+              <w:right w:type="dxa" w:w="120"/>
+            </w:tcMar>
+          </w:tcPr>
+          <w:p>
+            <w:r>
+              <w:rPr>
+                <w:rFonts w:ascii="Arial" w:cs="Arial" w:eastAsia="Arial" w:hAnsi="Arial"/>
+                <w:b/>
+                <w:bCs/>
+                <w:color w:val="FFFFFF"/>
+                <w:sz w:val="18"/>
+                <w:szCs w:val="18"/>
+              </w:rPr>
+              <w:t xml:space="preserve">Gruppe</w:t>
+            </w:r>
+          </w:p>
+        </w:tc>
+        <w:tc>
+          <w:tcPr>
+            <w:tcW w:type="dxa" w:w="1500"/>
+            <w:shd w:fill="1F5C99" w:val="clear"/>
+            <w:tcMar>
+              <w:top w:type="dxa" w:w="80"/>
+              <w:left w:type="dxa" w:w="120"/>
+              <w:bottom w:type="dxa" w:w="80"/>
+              <w:right w:type="dxa" w:w="120"/>
+            </w:tcMar>
+          </w:tcPr>
+          <w:p>
+            <w:r>
+              <w:rPr>
+                <w:rFonts w:ascii="Arial" w:cs="Arial" w:eastAsia="Arial" w:hAnsi="Arial"/>
+                <w:b/>
+                <w:bCs/>
+                <w:color w:val="FFFFFF"/>
+                <w:sz w:val="18"/>
+                <w:szCs w:val="18"/>
+              </w:rPr>
+              <w:t xml:space="preserve">Andere</w:t>
+            </w:r>
+          </w:p>
+        </w:tc>
+        <w:tc>
+          <w:tcPr>
+            <w:tcW w:type="dxa" w:w="1700"/>
+            <w:shd w:fill="1F5C99" w:val="clear"/>
+            <w:tcMar>
+              <w:top w:type="dxa" w:w="80"/>
+              <w:left w:type="dxa" w:w="120"/>
+              <w:bottom w:type="dxa" w:w="80"/>
+              <w:right w:type="dxa" w:w="120"/>
+            </w:tcMar>
+          </w:tcPr>
+          <w:p>
+            <w:r>
+              <w:rPr>
+                <w:rFonts w:ascii="Arial" w:cs="Arial" w:eastAsia="Arial" w:hAnsi="Arial"/>
+                <w:b/>
+                <w:bCs/>
+                <w:color w:val="FFFFFF"/>
+                <w:sz w:val="18"/>
+                <w:szCs w:val="18"/>
+              </w:rPr>
+              <w:t xml:space="preserve">Oktal</w:t>
+            </w:r>
+          </w:p>
+        </w:tc>
+      </w:tr>
+      <w:tr>
+        <w:tc>
+          <w:tcPr>
+            <w:tcW w:type="dxa" w:w="3346"/>
+            <w:shd w:fill="EBF3FB" w:val="clear"/>
+            <w:tcMar>
+              <w:top w:type="dxa" w:w="80"/>
+              <w:left w:type="dxa" w:w="120"/>
+              <w:bottom w:type="dxa" w:w="80"/>
+              <w:right w:type="dxa" w:w="120"/>
+            </w:tcMar>
+          </w:tcPr>
+          <w:p>
+            <w:r>
+              <w:rPr>
+                <w:rFonts w:ascii="Arial" w:cs="Arial" w:eastAsia="Arial" w:hAnsi="Arial"/>
+                <w:color w:val="404040"/>
+                <w:sz w:val="18"/>
+                <w:szCs w:val="18"/>
+              </w:rPr>
+              <w:t xml:space="preserve">Dateien (.qgs, .qgz, etc.)</w:t>
+            </w:r>
+          </w:p>
+        </w:tc>
+        <w:tc>
+          <w:tcPr>
+            <w:tcW w:type="dxa" w:w="1500"/>
+            <w:shd w:fill="EBF3FB" w:val="clear"/>
+            <w:tcMar>
+              <w:top w:type="dxa" w:w="80"/>
+              <w:left w:type="dxa" w:w="120"/>
+              <w:bottom w:type="dxa" w:w="80"/>
+              <w:right w:type="dxa" w:w="120"/>
+            </w:tcMar>
+          </w:tcPr>
+          <w:p>
+            <w:r>
+              <w:rPr>
+                <w:rFonts w:ascii="Arial" w:cs="Arial" w:eastAsia="Arial" w:hAnsi="Arial"/>
+                <w:color w:val="404040"/>
+                <w:sz w:val="18"/>
+                <w:szCs w:val="18"/>
+              </w:rPr>
+              <w:t xml:space="preserve">rw</w:t>
+            </w:r>
+          </w:p>
+        </w:tc>
+        <w:tc>
+          <w:tcPr>
+            <w:tcW w:type="dxa" w:w="1500"/>
+            <w:shd w:fill="EBF3FB" w:val="clear"/>
+            <w:tcMar>
+              <w:top w:type="dxa" w:w="80"/>
+              <w:left w:type="dxa" w:w="120"/>
+              <w:bottom w:type="dxa" w:w="80"/>
+              <w:right w:type="dxa" w:w="120"/>
+            </w:tcMar>
+          </w:tcPr>
+          <w:p>
+            <w:r>
+              <w:rPr>
+                <w:rFonts w:ascii="Arial" w:cs="Arial" w:eastAsia="Arial" w:hAnsi="Arial"/>
+                <w:color w:val="404040"/>
+                <w:sz w:val="18"/>
+                <w:szCs w:val="18"/>
+              </w:rPr>
+              <w:t xml:space="preserve">rw</w:t>
+            </w:r>
+          </w:p>
+        </w:tc>
+        <w:tc>
+          <w:tcPr>
+            <w:tcW w:type="dxa" w:w="1500"/>
+            <w:shd w:fill="EBF3FB" w:val="clear"/>
+            <w:tcMar>
+              <w:top w:type="dxa" w:w="80"/>
+              <w:left w:type="dxa" w:w="120"/>
+              <w:bottom w:type="dxa" w:w="80"/>
+              <w:right w:type="dxa" w:w="120"/>
+            </w:tcMar>
+          </w:tcPr>
+          <w:p>
+            <w:r>
+              <w:rPr>
+                <w:rFonts w:ascii="Arial" w:cs="Arial" w:eastAsia="Arial" w:hAnsi="Arial"/>
+                <w:color w:val="404040"/>
+                <w:sz w:val="18"/>
+                <w:szCs w:val="18"/>
+              </w:rPr>
+              <w:t xml:space="preserve">r</w:t>
+            </w:r>
+          </w:p>
+        </w:tc>
+        <w:tc>
+          <w:tcPr>
+            <w:tcW w:type="dxa" w:w="1700"/>
+            <w:shd w:fill="EBF3FB" w:val="clear"/>
+            <w:tcMar>
+              <w:top w:type="dxa" w:w="80"/>
+              <w:left w:type="dxa" w:w="120"/>
+              <w:bottom w:type="dxa" w:w="80"/>
+              <w:right w:type="dxa" w:w="120"/>
+            </w:tcMar>
+          </w:tcPr>
+          <w:p>
+            <w:r>
+              <w:rPr>
+                <w:rFonts w:ascii="Arial" w:cs="Arial" w:eastAsia="Arial" w:hAnsi="Arial"/>
+                <w:color w:val="404040"/>
+                <w:sz w:val="18"/>
+                <w:szCs w:val="18"/>
+              </w:rPr>
+              <w:t xml:space="preserve">664</w:t>
+            </w:r>
+          </w:p>
+        </w:tc>
+      </w:tr>
+      <w:tr>
+        <w:tc>
+          <w:tcPr>
+            <w:tcW w:type="dxa" w:w="3346"/>
+            <w:tcMar>
+              <w:top w:type="dxa" w:w="80"/>
+              <w:left w:type="dxa" w:w="120"/>
+              <w:bottom w:type="dxa" w:w="80"/>
+              <w:right w:type="dxa" w:w="120"/>
+            </w:tcMar>
+          </w:tcPr>
+          <w:p>
+            <w:r>
+              <w:rPr>
+                <w:rFonts w:ascii="Arial" w:cs="Arial" w:eastAsia="Arial" w:hAnsi="Arial"/>
+                <w:color w:val="404040"/>
+                <w:sz w:val="18"/>
+                <w:szCs w:val="18"/>
+              </w:rPr>
+              <w:t xml:space="preserve">Ordner (inkl. SetGID)</w:t>
+            </w:r>
+          </w:p>
+        </w:tc>
+        <w:tc>
+          <w:tcPr>
+            <w:tcW w:type="dxa" w:w="1500"/>
+            <w:tcMar>
+              <w:top w:type="dxa" w:w="80"/>
+              <w:left w:type="dxa" w:w="120"/>
+              <w:bottom w:type="dxa" w:w="80"/>
+              <w:right w:type="dxa" w:w="120"/>
+            </w:tcMar>
+          </w:tcPr>
+          <w:p>
+            <w:r>
+              <w:rPr>
+                <w:rFonts w:ascii="Arial" w:cs="Arial" w:eastAsia="Arial" w:hAnsi="Arial"/>
+                <w:color w:val="404040"/>
+                <w:sz w:val="18"/>
+                <w:szCs w:val="18"/>
+              </w:rPr>
+              <w:t xml:space="preserve">rwx</w:t>
+            </w:r>
+          </w:p>
+        </w:tc>
+        <w:tc>
+          <w:tcPr>
+            <w:tcW w:type="dxa" w:w="1500"/>
+            <w:tcMar>
+              <w:top w:type="dxa" w:w="80"/>
+              <w:left w:type="dxa" w:w="120"/>
+              <w:bottom w:type="dxa" w:w="80"/>
+              <w:right w:type="dxa" w:w="120"/>
+            </w:tcMar>
+          </w:tcPr>
+          <w:p>
+            <w:r>
+              <w:rPr>
+                <w:rFonts w:ascii="Arial" w:cs="Arial" w:eastAsia="Arial" w:hAnsi="Arial"/>
+                <w:color w:val="404040"/>
+                <w:sz w:val="18"/>
+                <w:szCs w:val="18"/>
+              </w:rPr>
+              <w:t xml:space="preserve">rwxs</w:t>
+            </w:r>
+          </w:p>
+        </w:tc>
+        <w:tc>
+          <w:tcPr>
+            <w:tcW w:type="dxa" w:w="1500"/>
+            <w:tcMar>
+              <w:top w:type="dxa" w:w="80"/>
+              <w:left w:type="dxa" w:w="120"/>
+              <w:bottom w:type="dxa" w:w="80"/>
+              <w:right w:type="dxa" w:w="120"/>
+            </w:tcMar>
+          </w:tcPr>
+          <w:p>
+            <w:r>
+              <w:rPr>
+                <w:rFonts w:ascii="Arial" w:cs="Arial" w:eastAsia="Arial" w:hAnsi="Arial"/>
+                <w:color w:val="404040"/>
+                <w:sz w:val="18"/>
+                <w:szCs w:val="18"/>
+              </w:rPr>
+              <w:t xml:space="preserve">r-x</w:t>
+            </w:r>
+          </w:p>
+        </w:tc>
+        <w:tc>
+          <w:tcPr>
+            <w:tcW w:type="dxa" w:w="1700"/>
+            <w:tcMar>
+              <w:top w:type="dxa" w:w="80"/>
+              <w:left w:type="dxa" w:w="120"/>
+              <w:bottom w:type="dxa" w:w="80"/>
+              <w:right w:type="dxa" w:w="120"/>
+            </w:tcMar>
+          </w:tcPr>
+          <w:p>
+            <w:r>
+              <w:rPr>
+                <w:rFonts w:ascii="Arial" w:cs="Arial" w:eastAsia="Arial" w:hAnsi="Arial"/>
+                <w:color w:val="404040"/>
+                <w:sz w:val="18"/>
+                <w:szCs w:val="18"/>
+              </w:rPr>
+              <w:t xml:space="preserve">2775</w:t>
+            </w:r>
+          </w:p>
+        </w:tc>
+      </w:tr>
+    </w:tbl>
+    <w:p>
+      <w:pPr>
+        <w:spacing w:after="80"/>
+      </w:pPr>
+      <w:r>
+        <w:rPr>
+          <w:rFonts w:ascii="Arial" w:cs="Arial" w:eastAsia="Arial" w:hAnsi="Arial"/>
+          <w:b/>
+          <w:bCs/>
+          <w:color w:val="CC0000"/>
+          <w:sz w:val="20"/>
+          <w:szCs w:val="20"/>
+        </w:rPr>
+        <w:t xml:space="preserve">Achtung: </w:t>
+      </w:r>
+      <w:r>
+        <w:rPr>
+          <w:rFonts w:ascii="Arial" w:cs="Arial" w:eastAsia="Arial" w:hAnsi="Arial"/>
+          <w:color w:val="404040"/>
+          <w:sz w:val="20"/>
+          <w:szCs w:val="20"/>
+        </w:rPr>
+        <w:t xml:space="preserve">600 (nur Owner, kein Gruppenzugriff) wäre falsch — das würde die Gruppen-Berechtigung komplett blockieren und die Zusammenarbeit über die Gruppe qgis zunichtemachen. check_installation.sh prüft aktuell nur den Eigentümer von /srv/data (nicht den numerischen Modus) — es gibt also keine im Skript verankerte Kontrolle dafür, dass Dateien tatsächlich 664/2775 haben.</w:t>
+      </w:r>
+    </w:p>
+    <w:p>
+      <w:pPr>
+        <w:pStyle w:val="Heading2"/>
+        <w:spacing w:after="80" w:before="240"/>
+      </w:pPr>
+      <w:r>
+        <w:rPr>
+          <w:rFonts w:ascii="Arial" w:cs="Arial" w:eastAsia="Arial" w:hAnsi="Arial"/>
+          <w:b/>
+          <w:bCs/>
+          <w:color w:val="1F5C99"/>
+          <w:sz w:val="22"/>
+          <w:szCs w:val="22"/>
+        </w:rPr>
+        <w:t xml:space="preserve">16.5 Diagnose</w:t>
+      </w:r>
+    </w:p>
+    <w:p>
+      <w:pPr>
+        <w:shd w:fill="F0F0F0" w:val="clear"/>
+        <w:spacing w:after="80"/>
+        <w:ind w:left="360"/>
+      </w:pPr>
+      <w:r>
+        <w:rPr>
+          <w:rFonts w:ascii="Courier New" w:cs="Courier New" w:eastAsia="Courier New" w:hAnsi="Courier New"/>
+          <w:color w:val="1A1A1A"/>
+          <w:sz w:val="18"/>
+          <w:szCs w:val="18"/>
+        </w:rPr>
+        <w:t xml:space="preserve"># Owner/Gruppe der obersten Ebene</w:t>
+      </w:r>
+    </w:p>
+    <w:p>
+      <w:pPr>
+        <w:shd w:fill="F0F0F0" w:val="clear"/>
+        <w:spacing w:after="80"/>
+        <w:ind w:left="360"/>
+      </w:pPr>
+      <w:r>
+        <w:rPr>
+          <w:rFonts w:ascii="Courier New" w:cs="Courier New" w:eastAsia="Courier New" w:hAnsi="Courier New"/>
+          <w:color w:val="1A1A1A"/>
+          <w:sz w:val="18"/>
+          <w:szCs w:val="18"/>
+        </w:rPr>
+        <w:t xml:space="preserve">ls -la /srv/data</w:t>
+      </w:r>
+    </w:p>
+    <w:p>
+      <w:pPr>
+        <w:shd w:fill="F0F0F0" w:val="clear"/>
+        <w:spacing w:after="80"/>
+        <w:ind w:left="360"/>
+      </w:pPr>
+      <w:r>
+        <w:rPr>
+          <w:rFonts w:ascii="Courier New" w:cs="Courier New" w:eastAsia="Courier New" w:hAnsi="Courier New"/>
+          <w:color w:val="1A1A1A"/>
+          <w:sz w:val="18"/>
+          <w:szCs w:val="18"/>
+        </w:rPr>
+        <w:t xml:space="preserve"/>
+      </w:r>
+    </w:p>
+    <w:p>
+      <w:pPr>
+        <w:shd w:fill="F0F0F0" w:val="clear"/>
+        <w:spacing w:after="80"/>
+        <w:ind w:left="360"/>
+      </w:pPr>
+      <w:r>
+        <w:rPr>
+          <w:rFonts w:ascii="Courier New" w:cs="Courier New" w:eastAsia="Courier New" w:hAnsi="Courier New"/>
+          <w:color w:val="1A1A1A"/>
+          <w:sz w:val="18"/>
+          <w:szCs w:val="18"/>
+        </w:rPr>
+        <w:t xml:space="preserve"># Alle abweichenden Dateien/Ordner rekursiv finden</w:t>
+      </w:r>
+    </w:p>
+    <w:p>
+      <w:pPr>
+        <w:shd w:fill="F0F0F0" w:val="clear"/>
+        <w:spacing w:after="80"/>
+        <w:ind w:left="360"/>
+      </w:pPr>
+      <w:r>
+        <w:rPr>
+          <w:rFonts w:ascii="Courier New" w:cs="Courier New" w:eastAsia="Courier New" w:hAnsi="Courier New"/>
+          <w:color w:val="1A1A1A"/>
+          <w:sz w:val="18"/>
+          <w:szCs w:val="18"/>
+        </w:rPr>
+        <w:t xml:space="preserve">find /srv/data -not -group qgis                    # falsche Gruppe</w:t>
+      </w:r>
+    </w:p>
+    <w:p>
+      <w:pPr>
+        <w:shd w:fill="F0F0F0" w:val="clear"/>
+        <w:spacing w:after="80"/>
+        <w:ind w:left="360"/>
+      </w:pPr>
+      <w:r>
+        <w:rPr>
+          <w:rFonts w:ascii="Courier New" w:cs="Courier New" w:eastAsia="Courier New" w:hAnsi="Courier New"/>
+          <w:color w:val="1A1A1A"/>
+          <w:sz w:val="18"/>
+          <w:szCs w:val="18"/>
+        </w:rPr>
+        <w:t xml:space="preserve">find /srv/data -type f -not -perm -660              # Dateien ohne Gruppen-rw</w:t>
+      </w:r>
+    </w:p>
+    <w:p>
+      <w:pPr>
+        <w:shd w:fill="F0F0F0" w:val="clear"/>
+        <w:spacing w:after="80"/>
+        <w:ind w:left="360"/>
+      </w:pPr>
+      <w:r>
+        <w:rPr>
+          <w:rFonts w:ascii="Courier New" w:cs="Courier New" w:eastAsia="Courier New" w:hAnsi="Courier New"/>
+          <w:color w:val="1A1A1A"/>
+          <w:sz w:val="18"/>
+          <w:szCs w:val="18"/>
+        </w:rPr>
+        <w:t xml:space="preserve">find /srv/data -type d -not -perm -2770             # Ordner ohne SetGID/Gruppen-rwx</w:t>
+      </w:r>
+    </w:p>
+    <w:p>
+      <w:pPr>
+        <w:pStyle w:val="Heading2"/>
+        <w:spacing w:after="80" w:before="240"/>
+      </w:pPr>
+      <w:r>
+        <w:rPr>
+          <w:rFonts w:ascii="Arial" w:cs="Arial" w:eastAsia="Arial" w:hAnsi="Arial"/>
+          <w:b/>
+          <w:bCs/>
+          <w:color w:val="1F5C99"/>
+          <w:sz w:val="22"/>
+          <w:szCs w:val="22"/>
+        </w:rPr>
+        <w:t xml:space="preserve">16.6 Reparatur</w:t>
+      </w:r>
+    </w:p>
+    <w:p>
+      <w:pPr>
+        <w:shd w:fill="F0F0F0" w:val="clear"/>
+        <w:spacing w:after="80"/>
+        <w:ind w:left="360"/>
+      </w:pPr>
+      <w:r>
+        <w:rPr>
+          <w:rFonts w:ascii="Courier New" w:cs="Courier New" w:eastAsia="Courier New" w:hAnsi="Courier New"/>
+          <w:color w:val="1A1A1A"/>
+          <w:sz w:val="18"/>
+          <w:szCs w:val="18"/>
+        </w:rPr>
+        <w:t xml:space="preserve">sudo chown -R qgis:qgis /srv/data</w:t>
+      </w:r>
+    </w:p>
+    <w:p>
+      <w:pPr>
+        <w:shd w:fill="F0F0F0" w:val="clear"/>
+        <w:spacing w:after="80"/>
+        <w:ind w:left="360"/>
+      </w:pPr>
+      <w:r>
+        <w:rPr>
+          <w:rFonts w:ascii="Courier New" w:cs="Courier New" w:eastAsia="Courier New" w:hAnsi="Courier New"/>
+          <w:color w:val="1A1A1A"/>
+          <w:sz w:val="18"/>
+          <w:szCs w:val="18"/>
+        </w:rPr>
+        <w:t xml:space="preserve">sudo find /srv/data -type d -exec chmod 2775 {} \;</w:t>
+      </w:r>
+    </w:p>
+    <w:p>
+      <w:pPr>
+        <w:shd w:fill="F0F0F0" w:val="clear"/>
+        <w:spacing w:after="80"/>
+        <w:ind w:left="360"/>
+      </w:pPr>
+      <w:r>
+        <w:rPr>
+          <w:rFonts w:ascii="Courier New" w:cs="Courier New" w:eastAsia="Courier New" w:hAnsi="Courier New"/>
+          <w:color w:val="1A1A1A"/>
+          <w:sz w:val="18"/>
+          <w:szCs w:val="18"/>
+        </w:rPr>
+        <w:t xml:space="preserve">sudo find /srv/data -type f -exec chmod 664 {} \;</w:t>
       </w:r>
     </w:p>
     <w:sectPr>

</xml_diff>